<commit_message>
docs: append v7+v8 reports to benchmark_methods, evaluation_methodology, phase_v4 + handoff_v9
- benchmark_methods.{docx,md}: Method 7 (cost-aware hybrid) + Method 8
  (router fix, f_bias, layout) appended
- evaluation_methodology.{docx,md}: section 10 addendum (GT versioning,
  tingkat scale-evidence check, router precision, token accounting,
  layout evaluation, final ship gate)
- phase_v4_methodology.md: sections 11-12 appended (docx updated locally,
  gitignored)
- phase_v4_results_summary.{md,xlsx}: v7/v8 results + v8 Variants &
  Per-File sheets (xlsx updated locally, gitignored)
- handoff_v9.md: v8 executed summary + commits table + next steps
- all docx re-validated (reopen + PDF render); md mirrors regenerated
  from docx to stay in sync
</commit_message>
<xml_diff>
--- a/docs/report/benchmark_methods.docx
+++ b/docs/report/benchmark_methods.docx
@@ -16393,6 +16393,1726 @@
         </w:tc>
       </w:tr>
     </w:tbl>
+    <w:p>
+      <w:pPr>
+        <w:spacing w:before="280" w:after="120"/>
+      </w:pPr>
+      <w:r>
+        <w:rPr>
+          <w:b/>
+          <w:color w:val="2F5496"/>
+          <w:sz w:val="32"/>
+        </w:rPr>
+        <w:t>Method 7: Cost-Aware Hybrid Extraction (Handoff v7)</w:t>
+      </w:r>
+    </w:p>
+    <w:p>
+      <w:pPr>
+        <w:spacing w:before="160" w:after="120"/>
+      </w:pPr>
+      <w:r>
+        <w:rPr>
+          <w:b/>
+          <w:color w:val="2F5496"/>
+          <w:sz w:val="26"/>
+        </w:rPr>
+        <w:t>Overview</w:t>
+      </w:r>
+    </w:p>
+    <w:p>
+      <w:pPr>
+        <w:spacing w:after="120"/>
+      </w:pPr>
+      <w:r>
+        <w:rPr>
+          <w:sz w:val="22"/>
+        </w:rPr>
+        <w:t>Handoff v7 moves from full-text LLM extraction to a cost-aware hybrid that extracts only the tingkat field with an LLM while every other field stays on the deterministic hybrid (NER + regex + post-processing). The goal is the best accuracy/cost Pareto point, not minimum tokens at any cost.</w:t>
+      </w:r>
+    </w:p>
+    <w:p>
+      <w:pPr>
+        <w:spacing w:before="160" w:after="120"/>
+      </w:pPr>
+      <w:r>
+        <w:rPr>
+          <w:b/>
+          <w:color w:val="2F5496"/>
+          <w:sz w:val="26"/>
+        </w:rPr>
+        <w:t>Input</w:t>
+      </w:r>
+    </w:p>
+    <w:p>
+      <w:pPr>
+        <w:spacing w:after="120"/>
+      </w:pPr>
+      <w:r>
+        <w:rPr>
+          <w:sz w:val="22"/>
+        </w:rPr>
+        <w:t>Same 74 certificates. Ground truth: Ground_Truth_Sertifikat.csv.</w:t>
+      </w:r>
+    </w:p>
+    <w:p>
+      <w:pPr>
+        <w:spacing w:before="160" w:after="120"/>
+      </w:pPr>
+      <w:r>
+        <w:rPr>
+          <w:b/>
+          <w:color w:val="2F5496"/>
+          <w:sz w:val="26"/>
+        </w:rPr>
+        <w:t>Process</w:t>
+      </w:r>
+    </w:p>
+    <w:p>
+      <w:pPr>
+        <w:spacing w:after="60"/>
+        <w:ind w:left="360" w:hanging="240"/>
+      </w:pPr>
+      <w:r>
+        <w:rPr>
+          <w:sz w:val="22"/>
+        </w:rPr>
+        <w:t>•  Run hybrid + post-processing once per certificate (regex + NER + phrase-v2 organizer).</w:t>
+      </w:r>
+    </w:p>
+    <w:p>
+      <w:pPr>
+        <w:spacing w:after="60"/>
+        <w:ind w:left="360" w:hanging="240"/>
+      </w:pPr>
+      <w:r>
+        <w:rPr>
+          <w:sz w:val="22"/>
+        </w:rPr>
+        <w:t>•  Run the rule-based tingkat router: high-precision rules decide tingkat at 0 tokens.</w:t>
+      </w:r>
+    </w:p>
+    <w:p>
+      <w:pPr>
+        <w:spacing w:after="60"/>
+        <w:ind w:left="360" w:hanging="240"/>
+      </w:pPr>
+      <w:r>
+        <w:rPr>
+          <w:sz w:val="22"/>
+        </w:rPr>
+        <w:t>•  For certificates the router does not decide, call the local LLM with a compact tingkat prompt.</w:t>
+      </w:r>
+    </w:p>
+    <w:p>
+      <w:pPr>
+        <w:spacing w:after="60"/>
+        <w:ind w:left="360" w:hanging="240"/>
+      </w:pPr>
+      <w:r>
+        <w:rPr>
+          <w:sz w:val="22"/>
+        </w:rPr>
+        <w:t>•  Validate the LLM answer against the 6 form options; keep the value empty when invalid.</w:t>
+      </w:r>
+    </w:p>
+    <w:p>
+      <w:pPr>
+        <w:spacing w:before="160" w:after="120"/>
+      </w:pPr>
+      <w:r>
+        <w:rPr>
+          <w:b/>
+          <w:color w:val="2F5496"/>
+          <w:sz w:val="26"/>
+        </w:rPr>
+        <w:t>Config</w:t>
+      </w:r>
+    </w:p>
+    <w:tbl>
+      <w:tblPr>
+        <w:tblW w:type="auto" w:w="0"/>
+        <w:tblLook w:firstColumn="1" w:firstRow="1" w:lastColumn="0" w:lastRow="0" w:noHBand="0" w:noVBand="1" w:val="04A0"/>
+        <w:tblBorders>
+          <w:top w:val="single" w:sz="4" w:space="0" w:color="BBBBBB"/>
+          <w:left w:val="single" w:sz="4" w:space="0" w:color="BBBBBB"/>
+          <w:bottom w:val="single" w:sz="4" w:space="0" w:color="BBBBBB"/>
+          <w:right w:val="single" w:sz="4" w:space="0" w:color="BBBBBB"/>
+          <w:insideH w:val="single" w:sz="4" w:space="0" w:color="BBBBBB"/>
+          <w:insideV w:val="single" w:sz="4" w:space="0" w:color="BBBBBB"/>
+        </w:tblBorders>
+      </w:tblPr>
+      <w:tblGrid>
+        <w:gridCol w:w="4680"/>
+        <w:gridCol w:w="4680"/>
+      </w:tblGrid>
+      <w:tr>
+        <w:tc>
+          <w:tcPr>
+            <w:tcW w:type="dxa" w:w="4680"/>
+          </w:tcPr>
+          <w:p>
+            <w:pPr>
+              <w:spacing w:after="0"/>
+            </w:pPr>
+            <w:r/>
+            <w:r>
+              <w:rPr>
+                <w:b/>
+                <w:sz w:val="18"/>
+              </w:rPr>
+              <w:t>Key</w:t>
+            </w:r>
+          </w:p>
+        </w:tc>
+        <w:tc>
+          <w:tcPr>
+            <w:tcW w:type="dxa" w:w="4680"/>
+          </w:tcPr>
+          <w:p>
+            <w:pPr>
+              <w:spacing w:after="0"/>
+            </w:pPr>
+            <w:r/>
+            <w:r>
+              <w:rPr>
+                <w:b/>
+                <w:sz w:val="18"/>
+              </w:rPr>
+              <w:t>Value</w:t>
+            </w:r>
+          </w:p>
+        </w:tc>
+      </w:tr>
+      <w:tr>
+        <w:tc>
+          <w:tcPr>
+            <w:tcW w:type="dxa" w:w="4680"/>
+          </w:tcPr>
+          <w:p>
+            <w:pPr>
+              <w:spacing w:after="0"/>
+            </w:pPr>
+            <w:r/>
+            <w:r>
+              <w:rPr>
+                <w:sz w:val="18"/>
+              </w:rPr>
+              <w:t>Prompt</w:t>
+            </w:r>
+          </w:p>
+        </w:tc>
+        <w:tc>
+          <w:tcPr>
+            <w:tcW w:type="dxa" w:w="4680"/>
+          </w:tcPr>
+          <w:p>
+            <w:pPr>
+              <w:spacing w:after="0"/>
+            </w:pPr>
+            <w:r/>
+            <w:r>
+              <w:rPr>
+                <w:sz w:val="18"/>
+              </w:rPr>
+              <w:t>v3 minimized / v4 adaptive (variants a-e)</w:t>
+            </w:r>
+          </w:p>
+        </w:tc>
+      </w:tr>
+      <w:tr>
+        <w:tc>
+          <w:tcPr>
+            <w:tcW w:type="dxa" w:w="4680"/>
+          </w:tcPr>
+          <w:p>
+            <w:pPr>
+              <w:spacing w:after="0"/>
+            </w:pPr>
+            <w:r/>
+            <w:r>
+              <w:rPr>
+                <w:sz w:val="18"/>
+              </w:rPr>
+              <w:t>Router</w:t>
+            </w:r>
+          </w:p>
+        </w:tc>
+        <w:tc>
+          <w:tcPr>
+            <w:tcW w:type="dxa" w:w="4680"/>
+          </w:tcPr>
+          <w:p>
+            <w:pPr>
+              <w:spacing w:after="0"/>
+            </w:pPr>
+            <w:r/>
+            <w:r>
+              <w:rPr>
+                <w:sz w:val="18"/>
+              </w:rPr>
+              <w:t>rule-based, 35/74 decisions at 100% precision</w:t>
+            </w:r>
+          </w:p>
+        </w:tc>
+      </w:tr>
+      <w:tr>
+        <w:tc>
+          <w:tcPr>
+            <w:tcW w:type="dxa" w:w="4680"/>
+          </w:tcPr>
+          <w:p>
+            <w:pPr>
+              <w:spacing w:after="0"/>
+            </w:pPr>
+            <w:r/>
+            <w:r>
+              <w:rPr>
+                <w:sz w:val="18"/>
+              </w:rPr>
+              <w:t>Model</w:t>
+            </w:r>
+          </w:p>
+        </w:tc>
+        <w:tc>
+          <w:tcPr>
+            <w:tcW w:type="dxa" w:w="4680"/>
+          </w:tcPr>
+          <w:p>
+            <w:pPr>
+              <w:spacing w:after="0"/>
+            </w:pPr>
+            <w:r/>
+            <w:r>
+              <w:rPr>
+                <w:sz w:val="18"/>
+              </w:rPr>
+              <w:t>llama3.1:8b (Ollama)</w:t>
+            </w:r>
+          </w:p>
+        </w:tc>
+      </w:tr>
+      <w:tr>
+        <w:tc>
+          <w:tcPr>
+            <w:tcW w:type="dxa" w:w="4680"/>
+          </w:tcPr>
+          <w:p>
+            <w:pPr>
+              <w:spacing w:after="0"/>
+            </w:pPr>
+            <w:r/>
+            <w:r>
+              <w:rPr>
+                <w:sz w:val="18"/>
+              </w:rPr>
+              <w:t>Token budget</w:t>
+            </w:r>
+          </w:p>
+        </w:tc>
+        <w:tc>
+          <w:tcPr>
+            <w:tcW w:type="dxa" w:w="4680"/>
+          </w:tcPr>
+          <w:p>
+            <w:pPr>
+              <w:spacing w:after="0"/>
+            </w:pPr>
+            <w:r/>
+            <w:r>
+              <w:rPr>
+                <w:sz w:val="18"/>
+              </w:rPr>
+              <w:t>minimize_text(), ~202 eff tokens/cert</w:t>
+            </w:r>
+          </w:p>
+        </w:tc>
+      </w:tr>
+    </w:tbl>
+    <w:p/>
+    <w:p>
+      <w:pPr>
+        <w:spacing w:before="160" w:after="120"/>
+      </w:pPr>
+      <w:r>
+        <w:rPr>
+          <w:b/>
+          <w:color w:val="2F5496"/>
+          <w:sz w:val="26"/>
+        </w:rPr>
+        <w:t>Results (v7 P4 e_hybrid)</w:t>
+      </w:r>
+    </w:p>
+    <w:tbl>
+      <w:tblPr>
+        <w:tblW w:type="auto" w:w="0"/>
+        <w:tblLook w:firstColumn="1" w:firstRow="1" w:lastColumn="0" w:lastRow="0" w:noHBand="0" w:noVBand="1" w:val="04A0"/>
+        <w:tblBorders>
+          <w:top w:val="single" w:sz="4" w:space="0" w:color="BBBBBB"/>
+          <w:left w:val="single" w:sz="4" w:space="0" w:color="BBBBBB"/>
+          <w:bottom w:val="single" w:sz="4" w:space="0" w:color="BBBBBB"/>
+          <w:right w:val="single" w:sz="4" w:space="0" w:color="BBBBBB"/>
+          <w:insideH w:val="single" w:sz="4" w:space="0" w:color="BBBBBB"/>
+          <w:insideV w:val="single" w:sz="4" w:space="0" w:color="BBBBBB"/>
+        </w:tblBorders>
+      </w:tblPr>
+      <w:tblGrid>
+        <w:gridCol w:w="4680"/>
+        <w:gridCol w:w="4680"/>
+      </w:tblGrid>
+      <w:tr>
+        <w:tc>
+          <w:tcPr>
+            <w:tcW w:type="dxa" w:w="4680"/>
+          </w:tcPr>
+          <w:p>
+            <w:pPr>
+              <w:spacing w:after="0"/>
+            </w:pPr>
+            <w:r/>
+            <w:r>
+              <w:rPr>
+                <w:b/>
+                <w:sz w:val="18"/>
+              </w:rPr>
+              <w:t>Metric</w:t>
+            </w:r>
+          </w:p>
+        </w:tc>
+        <w:tc>
+          <w:tcPr>
+            <w:tcW w:type="dxa" w:w="4680"/>
+          </w:tcPr>
+          <w:p>
+            <w:pPr>
+              <w:spacing w:after="0"/>
+            </w:pPr>
+            <w:r/>
+            <w:r>
+              <w:rPr>
+                <w:b/>
+                <w:sz w:val="18"/>
+              </w:rPr>
+              <w:t>Value</w:t>
+            </w:r>
+          </w:p>
+        </w:tc>
+      </w:tr>
+      <w:tr>
+        <w:tc>
+          <w:tcPr>
+            <w:tcW w:type="dxa" w:w="4680"/>
+          </w:tcPr>
+          <w:p>
+            <w:pPr>
+              <w:spacing w:after="0"/>
+            </w:pPr>
+            <w:r/>
+            <w:r>
+              <w:rPr>
+                <w:sz w:val="18"/>
+              </w:rPr>
+              <w:t>Tingkat exact</w:t>
+            </w:r>
+          </w:p>
+        </w:tc>
+        <w:tc>
+          <w:tcPr>
+            <w:tcW w:type="dxa" w:w="4680"/>
+          </w:tcPr>
+          <w:p>
+            <w:pPr>
+              <w:spacing w:after="0"/>
+            </w:pPr>
+            <w:r/>
+            <w:r>
+              <w:rPr>
+                <w:sz w:val="18"/>
+              </w:rPr>
+              <w:t>77.0% (57/74)</w:t>
+            </w:r>
+          </w:p>
+        </w:tc>
+      </w:tr>
+      <w:tr>
+        <w:tc>
+          <w:tcPr>
+            <w:tcW w:type="dxa" w:w="4680"/>
+          </w:tcPr>
+          <w:p>
+            <w:pPr>
+              <w:spacing w:after="0"/>
+            </w:pPr>
+            <w:r/>
+            <w:r>
+              <w:rPr>
+                <w:sz w:val="18"/>
+              </w:rPr>
+              <w:t>MACRO exact</w:t>
+            </w:r>
+          </w:p>
+        </w:tc>
+        <w:tc>
+          <w:tcPr>
+            <w:tcW w:type="dxa" w:w="4680"/>
+          </w:tcPr>
+          <w:p>
+            <w:pPr>
+              <w:spacing w:after="0"/>
+            </w:pPr>
+            <w:r/>
+            <w:r>
+              <w:rPr>
+                <w:sz w:val="18"/>
+              </w:rPr>
+              <w:t>54.2%</w:t>
+            </w:r>
+          </w:p>
+        </w:tc>
+      </w:tr>
+      <w:tr>
+        <w:tc>
+          <w:tcPr>
+            <w:tcW w:type="dxa" w:w="4680"/>
+          </w:tcPr>
+          <w:p>
+            <w:pPr>
+              <w:spacing w:after="0"/>
+            </w:pPr>
+            <w:r/>
+            <w:r>
+              <w:rPr>
+                <w:sz w:val="18"/>
+              </w:rPr>
+              <w:t>Eff. tokens/cert</w:t>
+            </w:r>
+          </w:p>
+        </w:tc>
+        <w:tc>
+          <w:tcPr>
+            <w:tcW w:type="dxa" w:w="4680"/>
+          </w:tcPr>
+          <w:p>
+            <w:pPr>
+              <w:spacing w:after="0"/>
+            </w:pPr>
+            <w:r/>
+            <w:r>
+              <w:rPr>
+                <w:sz w:val="18"/>
+              </w:rPr>
+              <w:t>202.2</w:t>
+            </w:r>
+          </w:p>
+        </w:tc>
+      </w:tr>
+      <w:tr>
+        <w:tc>
+          <w:tcPr>
+            <w:tcW w:type="dxa" w:w="4680"/>
+          </w:tcPr>
+          <w:p>
+            <w:pPr>
+              <w:spacing w:after="0"/>
+            </w:pPr>
+            <w:r/>
+            <w:r>
+              <w:rPr>
+                <w:sz w:val="18"/>
+              </w:rPr>
+              <w:t>LLM calls</w:t>
+            </w:r>
+          </w:p>
+        </w:tc>
+        <w:tc>
+          <w:tcPr>
+            <w:tcW w:type="dxa" w:w="4680"/>
+          </w:tcPr>
+          <w:p>
+            <w:pPr>
+              <w:spacing w:after="0"/>
+            </w:pPr>
+            <w:r/>
+            <w:r>
+              <w:rPr>
+                <w:sz w:val="18"/>
+              </w:rPr>
+              <w:t>39 of 74 (router: 35, 100% precision)</w:t>
+            </w:r>
+          </w:p>
+        </w:tc>
+      </w:tr>
+      <w:tr>
+        <w:tc>
+          <w:tcPr>
+            <w:tcW w:type="dxa" w:w="4680"/>
+          </w:tcPr>
+          <w:p>
+            <w:pPr>
+              <w:spacing w:after="0"/>
+            </w:pPr>
+            <w:r/>
+            <w:r>
+              <w:rPr>
+                <w:sz w:val="18"/>
+              </w:rPr>
+              <w:t>Run</w:t>
+            </w:r>
+          </w:p>
+        </w:tc>
+        <w:tc>
+          <w:tcPr>
+            <w:tcW w:type="dxa" w:w="4680"/>
+          </w:tcPr>
+          <w:p>
+            <w:pPr>
+              <w:spacing w:after="0"/>
+            </w:pPr>
+            <w:r/>
+            <w:r>
+              <w:rPr>
+                <w:sz w:val="18"/>
+              </w:rPr>
+              <w:t>tests/benchmark_runs/run_llm_v4_20260803_113310/</w:t>
+            </w:r>
+          </w:p>
+        </w:tc>
+      </w:tr>
+    </w:tbl>
+    <w:p/>
+    <w:p>
+      <w:pPr>
+        <w:spacing w:before="160" w:after="120"/>
+      </w:pPr>
+      <w:r>
+        <w:rPr>
+          <w:b/>
+          <w:color w:val="2F5496"/>
+          <w:sz w:val="26"/>
+        </w:rPr>
+        <w:t>Strengths</w:t>
+      </w:r>
+    </w:p>
+    <w:p>
+      <w:pPr>
+        <w:spacing w:after="60"/>
+        <w:ind w:left="360" w:hanging="240"/>
+      </w:pPr>
+      <w:r>
+        <w:rPr>
+          <w:sz w:val="22"/>
+        </w:rPr>
+        <w:t>•  Router removes ~47% of LLM calls at 0 tokens and 100% precision.</w:t>
+      </w:r>
+    </w:p>
+    <w:p>
+      <w:pPr>
+        <w:spacing w:after="60"/>
+        <w:ind w:left="360" w:hanging="240"/>
+      </w:pPr>
+      <w:r>
+        <w:rPr>
+          <w:sz w:val="22"/>
+        </w:rPr>
+        <w:t>•  Best accuracy-per-token in the v4+v6+v7 family (0.082 acc/token).</w:t>
+      </w:r>
+    </w:p>
+    <w:p>
+      <w:pPr>
+        <w:spacing w:before="160" w:after="120"/>
+      </w:pPr>
+      <w:r>
+        <w:rPr>
+          <w:b/>
+          <w:color w:val="2F5496"/>
+          <w:sz w:val="26"/>
+        </w:rPr>
+        <w:t>Limitations</w:t>
+      </w:r>
+    </w:p>
+    <w:p>
+      <w:pPr>
+        <w:spacing w:after="60"/>
+        <w:ind w:left="360" w:hanging="240"/>
+      </w:pPr>
+      <w:r>
+        <w:rPr>
+          <w:sz w:val="22"/>
+        </w:rPr>
+        <w:t>•  Word-boundary router misses OCR-merged tokens (BEMFKM, BEMFEBUNAIR, HIMATESDA).</w:t>
+      </w:r>
+    </w:p>
+    <w:p>
+      <w:pPr>
+        <w:spacing w:after="60"/>
+        <w:ind w:left="360" w:hanging="240"/>
+      </w:pPr>
+      <w:r>
+        <w:rPr>
+          <w:sz w:val="22"/>
+        </w:rPr>
+        <w:t>•  Ground truth had un-audited tingkat labels.</w:t>
+      </w:r>
+    </w:p>
+    <w:p>
+      <w:pPr>
+        <w:spacing w:after="60"/>
+        <w:ind w:left="360" w:hanging="240"/>
+      </w:pPr>
+      <w:r>
+        <w:rPr>
+          <w:sz w:val="22"/>
+        </w:rPr>
+        <w:t>•  LLM biased English certificate text toward Internasional.</w:t>
+      </w:r>
+    </w:p>
+    <w:p>
+      <w:pPr>
+        <w:spacing w:before="160" w:after="120"/>
+      </w:pPr>
+      <w:r>
+        <w:rPr>
+          <w:b/>
+          <w:color w:val="2F5496"/>
+          <w:sz w:val="26"/>
+        </w:rPr>
+        <w:t>Code Reference</w:t>
+      </w:r>
+    </w:p>
+    <w:p>
+      <w:pPr>
+        <w:spacing w:after="60"/>
+        <w:ind w:left="360" w:hanging="240"/>
+      </w:pPr>
+      <w:r>
+        <w:rPr>
+          <w:sz w:val="22"/>
+        </w:rPr>
+        <w:t>•  tests/benchmark_llm_v4.py, tests/llm_extractor_v3.py, tests/llm_extractor_v4.py</w:t>
+      </w:r>
+    </w:p>
+    <w:p>
+      <w:pPr>
+        <w:spacing w:after="60"/>
+        <w:ind w:left="360" w:hanging="240"/>
+      </w:pPr>
+      <w:r>
+        <w:rPr>
+          <w:sz w:val="22"/>
+        </w:rPr>
+        <w:t>•  tests/llm_router_v4.py, tests/organizer_extractor_v2.py, tests/mismatch_taxonomy.py</w:t>
+      </w:r>
+    </w:p>
+    <w:p>
+      <w:pPr>
+        <w:spacing w:before="280" w:after="120"/>
+      </w:pPr>
+      <w:r>
+        <w:rPr>
+          <w:b/>
+          <w:color w:val="2F5496"/>
+          <w:sz w:val="32"/>
+        </w:rPr>
+        <w:t>Method 8: v8 Router Fix + LLM Bias + Layout (Handoff v8)</w:t>
+      </w:r>
+    </w:p>
+    <w:p>
+      <w:pPr>
+        <w:spacing w:before="160" w:after="120"/>
+      </w:pPr>
+      <w:r>
+        <w:rPr>
+          <w:b/>
+          <w:color w:val="2F5496"/>
+          <w:sz w:val="26"/>
+        </w:rPr>
+        <w:t>Overview</w:t>
+      </w:r>
+    </w:p>
+    <w:p>
+      <w:pPr>
+        <w:spacing w:after="120"/>
+      </w:pPr>
+      <w:r>
+        <w:rPr>
+          <w:sz w:val="22"/>
+        </w:rPr>
+        <w:t>Handoff v8 repairs the v7 router, audits ground truth, and tests two accuracy levers: a bias-corrected LLM prompt and layout-aware input. Winner: contains-match router + f_bias prompt at 82.4% tingkat exact.</w:t>
+      </w:r>
+    </w:p>
+    <w:p>
+      <w:pPr>
+        <w:spacing w:before="160" w:after="120"/>
+      </w:pPr>
+      <w:r>
+        <w:rPr>
+          <w:b/>
+          <w:color w:val="2F5496"/>
+          <w:sz w:val="26"/>
+        </w:rPr>
+        <w:t>Input</w:t>
+      </w:r>
+    </w:p>
+    <w:p>
+      <w:pPr>
+        <w:spacing w:after="120"/>
+      </w:pPr>
+      <w:r>
+        <w:rPr>
+          <w:sz w:val="22"/>
+        </w:rPr>
+        <w:t>Same 74 certificates. Versioned ground truth: Ground_Truth_Sertifikat_v8.csv (3 audited tingkat label corrections).</w:t>
+      </w:r>
+    </w:p>
+    <w:p>
+      <w:pPr>
+        <w:spacing w:before="160" w:after="120"/>
+      </w:pPr>
+      <w:r>
+        <w:rPr>
+          <w:b/>
+          <w:color w:val="2F5496"/>
+          <w:sz w:val="26"/>
+        </w:rPr>
+        <w:t>Process</w:t>
+      </w:r>
+    </w:p>
+    <w:p>
+      <w:pPr>
+        <w:spacing w:after="60"/>
+        <w:ind w:left="360" w:hanging="240"/>
+      </w:pPr>
+      <w:r>
+        <w:rPr>
+          <w:sz w:val="22"/>
+        </w:rPr>
+        <w:t>•  GT audit: 1966887-&gt;Nasional, 1981676-&gt;Nasional, 2954283-&gt;Internasional; 2030372 stays Nasional.</w:t>
+      </w:r>
+    </w:p>
+    <w:p>
+      <w:pPr>
+        <w:spacing w:after="60"/>
+        <w:ind w:left="360" w:hanging="240"/>
+      </w:pPr>
+      <w:r>
+        <w:rPr>
+          <w:sz w:val="22"/>
+        </w:rPr>
+        <w:t>•  Router contains-match: BEM/HIMA detected in uppercase alnum runs (BEMFKM, SERT2128BEM2026) with a guard.</w:t>
+      </w:r>
+    </w:p>
+    <w:p>
+      <w:pPr>
+        <w:spacing w:after="60"/>
+        <w:ind w:left="360" w:hanging="240"/>
+      </w:pPr>
+      <w:r>
+        <w:rPr>
+          <w:sz w:val="22"/>
+        </w:rPr>
+        <w:t>•  New rule: explicit TINGKAT/LOMBA NASIONAL text -&gt; Nasional.</w:t>
+      </w:r>
+    </w:p>
+    <w:p>
+      <w:pPr>
+        <w:spacing w:after="60"/>
+        <w:ind w:left="360" w:hanging="240"/>
+      </w:pPr>
+      <w:r>
+        <w:rPr>
+          <w:sz w:val="22"/>
+        </w:rPr>
+        <w:t>•  f_bias prompt: English text is not automatically Internasional; Indonesian-institution context wins.</w:t>
+      </w:r>
+    </w:p>
+    <w:p>
+      <w:pPr>
+        <w:spacing w:after="60"/>
+        <w:ind w:left="360" w:hanging="240"/>
+      </w:pPr>
+      <w:r>
+        <w:rPr>
+          <w:sz w:val="22"/>
+        </w:rPr>
+        <w:t>•  Layout experiment (markdown / annotated from PyMuPDF dict) measured and rejected.</w:t>
+      </w:r>
+    </w:p>
+    <w:p>
+      <w:pPr>
+        <w:spacing w:before="160" w:after="120"/>
+      </w:pPr>
+      <w:r>
+        <w:rPr>
+          <w:b/>
+          <w:color w:val="2F5496"/>
+          <w:sz w:val="26"/>
+        </w:rPr>
+        <w:t>Config</w:t>
+      </w:r>
+    </w:p>
+    <w:tbl>
+      <w:tblPr>
+        <w:tblW w:type="auto" w:w="0"/>
+        <w:tblLook w:firstColumn="1" w:firstRow="1" w:lastColumn="0" w:lastRow="0" w:noHBand="0" w:noVBand="1" w:val="04A0"/>
+        <w:tblBorders>
+          <w:top w:val="single" w:sz="4" w:space="0" w:color="BBBBBB"/>
+          <w:left w:val="single" w:sz="4" w:space="0" w:color="BBBBBB"/>
+          <w:bottom w:val="single" w:sz="4" w:space="0" w:color="BBBBBB"/>
+          <w:right w:val="single" w:sz="4" w:space="0" w:color="BBBBBB"/>
+          <w:insideH w:val="single" w:sz="4" w:space="0" w:color="BBBBBB"/>
+          <w:insideV w:val="single" w:sz="4" w:space="0" w:color="BBBBBB"/>
+        </w:tblBorders>
+      </w:tblPr>
+      <w:tblGrid>
+        <w:gridCol w:w="4680"/>
+        <w:gridCol w:w="4680"/>
+      </w:tblGrid>
+      <w:tr>
+        <w:tc>
+          <w:tcPr>
+            <w:tcW w:type="dxa" w:w="4680"/>
+          </w:tcPr>
+          <w:p>
+            <w:pPr>
+              <w:spacing w:after="0"/>
+            </w:pPr>
+            <w:r/>
+            <w:r>
+              <w:rPr>
+                <w:b/>
+                <w:sz w:val="18"/>
+              </w:rPr>
+              <w:t>Key</w:t>
+            </w:r>
+          </w:p>
+        </w:tc>
+        <w:tc>
+          <w:tcPr>
+            <w:tcW w:type="dxa" w:w="4680"/>
+          </w:tcPr>
+          <w:p>
+            <w:pPr>
+              <w:spacing w:after="0"/>
+            </w:pPr>
+            <w:r/>
+            <w:r>
+              <w:rPr>
+                <w:b/>
+                <w:sz w:val="18"/>
+              </w:rPr>
+              <w:t>Value</w:t>
+            </w:r>
+          </w:p>
+        </w:tc>
+      </w:tr>
+      <w:tr>
+        <w:tc>
+          <w:tcPr>
+            <w:tcW w:type="dxa" w:w="4680"/>
+          </w:tcPr>
+          <w:p>
+            <w:pPr>
+              <w:spacing w:after="0"/>
+            </w:pPr>
+            <w:r/>
+            <w:r>
+              <w:rPr>
+                <w:sz w:val="18"/>
+              </w:rPr>
+              <w:t>Prompt</w:t>
+            </w:r>
+          </w:p>
+        </w:tc>
+        <w:tc>
+          <w:tcPr>
+            <w:tcW w:type="dxa" w:w="4680"/>
+          </w:tcPr>
+          <w:p>
+            <w:pPr>
+              <w:spacing w:after="0"/>
+            </w:pPr>
+            <w:r/>
+            <w:r>
+              <w:rPr>
+                <w:sz w:val="18"/>
+              </w:rPr>
+              <w:t>f_bias (e_hybrid + bias rules)</w:t>
+            </w:r>
+          </w:p>
+        </w:tc>
+      </w:tr>
+      <w:tr>
+        <w:tc>
+          <w:tcPr>
+            <w:tcW w:type="dxa" w:w="4680"/>
+          </w:tcPr>
+          <w:p>
+            <w:pPr>
+              <w:spacing w:after="0"/>
+            </w:pPr>
+            <w:r/>
+            <w:r>
+              <w:rPr>
+                <w:sz w:val="18"/>
+              </w:rPr>
+              <w:t>Router</w:t>
+            </w:r>
+          </w:p>
+        </w:tc>
+        <w:tc>
+          <w:tcPr>
+            <w:tcW w:type="dxa" w:w="4680"/>
+          </w:tcPr>
+          <w:p>
+            <w:pPr>
+              <w:spacing w:after="0"/>
+            </w:pPr>
+            <w:r/>
+            <w:r>
+              <w:rPr>
+                <w:sz w:val="18"/>
+              </w:rPr>
+              <w:t>contains-match, 39/74 decisions at 100% precision</w:t>
+            </w:r>
+          </w:p>
+        </w:tc>
+      </w:tr>
+      <w:tr>
+        <w:tc>
+          <w:tcPr>
+            <w:tcW w:type="dxa" w:w="4680"/>
+          </w:tcPr>
+          <w:p>
+            <w:pPr>
+              <w:spacing w:after="0"/>
+            </w:pPr>
+            <w:r/>
+            <w:r>
+              <w:rPr>
+                <w:sz w:val="18"/>
+              </w:rPr>
+              <w:t>GT</w:t>
+            </w:r>
+          </w:p>
+        </w:tc>
+        <w:tc>
+          <w:tcPr>
+            <w:tcW w:type="dxa" w:w="4680"/>
+          </w:tcPr>
+          <w:p>
+            <w:pPr>
+              <w:spacing w:after="0"/>
+            </w:pPr>
+            <w:r/>
+            <w:r>
+              <w:rPr>
+                <w:sz w:val="18"/>
+              </w:rPr>
+              <w:t>fixed_v8 (Ground_Truth_Sertifikat_v8.csv)</w:t>
+            </w:r>
+          </w:p>
+        </w:tc>
+      </w:tr>
+      <w:tr>
+        <w:tc>
+          <w:tcPr>
+            <w:tcW w:type="dxa" w:w="4680"/>
+          </w:tcPr>
+          <w:p>
+            <w:pPr>
+              <w:spacing w:after="0"/>
+            </w:pPr>
+            <w:r/>
+            <w:r>
+              <w:rPr>
+                <w:sz w:val="18"/>
+              </w:rPr>
+              <w:t>Model</w:t>
+            </w:r>
+          </w:p>
+        </w:tc>
+        <w:tc>
+          <w:tcPr>
+            <w:tcW w:type="dxa" w:w="4680"/>
+          </w:tcPr>
+          <w:p>
+            <w:pPr>
+              <w:spacing w:after="0"/>
+            </w:pPr>
+            <w:r/>
+            <w:r>
+              <w:rPr>
+                <w:sz w:val="18"/>
+              </w:rPr>
+              <w:t>llama3.1:8b (Ollama)</w:t>
+            </w:r>
+          </w:p>
+        </w:tc>
+      </w:tr>
+    </w:tbl>
+    <w:p/>
+    <w:p>
+      <w:pPr>
+        <w:spacing w:before="160" w:after="120"/>
+      </w:pPr>
+      <w:r>
+        <w:rPr>
+          <w:b/>
+          <w:color w:val="2F5496"/>
+          <w:sz w:val="26"/>
+        </w:rPr>
+        <w:t>Results</w:t>
+      </w:r>
+    </w:p>
+    <w:tbl>
+      <w:tblPr>
+        <w:tblW w:type="auto" w:w="0"/>
+        <w:tblLook w:firstColumn="1" w:firstRow="1" w:lastColumn="0" w:lastRow="0" w:noHBand="0" w:noVBand="1" w:val="04A0"/>
+        <w:tblBorders>
+          <w:top w:val="single" w:sz="4" w:space="0" w:color="BBBBBB"/>
+          <w:left w:val="single" w:sz="4" w:space="0" w:color="BBBBBB"/>
+          <w:bottom w:val="single" w:sz="4" w:space="0" w:color="BBBBBB"/>
+          <w:right w:val="single" w:sz="4" w:space="0" w:color="BBBBBB"/>
+          <w:insideH w:val="single" w:sz="4" w:space="0" w:color="BBBBBB"/>
+          <w:insideV w:val="single" w:sz="4" w:space="0" w:color="BBBBBB"/>
+        </w:tblBorders>
+      </w:tblPr>
+      <w:tblGrid>
+        <w:gridCol w:w="2340"/>
+        <w:gridCol w:w="2340"/>
+        <w:gridCol w:w="2340"/>
+        <w:gridCol w:w="2340"/>
+      </w:tblGrid>
+      <w:tr>
+        <w:tc>
+          <w:tcPr>
+            <w:tcW w:type="dxa" w:w="2340"/>
+          </w:tcPr>
+          <w:p>
+            <w:pPr>
+              <w:spacing w:after="0"/>
+            </w:pPr>
+            <w:r/>
+            <w:r>
+              <w:rPr>
+                <w:b/>
+                <w:sz w:val="18"/>
+              </w:rPr>
+              <w:t>Variant</w:t>
+            </w:r>
+          </w:p>
+        </w:tc>
+        <w:tc>
+          <w:tcPr>
+            <w:tcW w:type="dxa" w:w="2340"/>
+          </w:tcPr>
+          <w:p>
+            <w:pPr>
+              <w:spacing w:after="0"/>
+            </w:pPr>
+            <w:r/>
+            <w:r>
+              <w:rPr>
+                <w:b/>
+                <w:sz w:val="18"/>
+              </w:rPr>
+              <w:t>Tingkat exact</w:t>
+            </w:r>
+          </w:p>
+        </w:tc>
+        <w:tc>
+          <w:tcPr>
+            <w:tcW w:type="dxa" w:w="2340"/>
+          </w:tcPr>
+          <w:p>
+            <w:pPr>
+              <w:spacing w:after="0"/>
+            </w:pPr>
+            <w:r/>
+            <w:r>
+              <w:rPr>
+                <w:b/>
+                <w:sz w:val="18"/>
+              </w:rPr>
+              <w:t>MACRO exact</w:t>
+            </w:r>
+          </w:p>
+        </w:tc>
+        <w:tc>
+          <w:tcPr>
+            <w:tcW w:type="dxa" w:w="2340"/>
+          </w:tcPr>
+          <w:p>
+            <w:pPr>
+              <w:spacing w:after="0"/>
+            </w:pPr>
+            <w:r/>
+            <w:r>
+              <w:rPr>
+                <w:b/>
+                <w:sz w:val="18"/>
+              </w:rPr>
+              <w:t>Eff. tokens/cert</w:t>
+            </w:r>
+          </w:p>
+        </w:tc>
+      </w:tr>
+      <w:tr>
+        <w:tc>
+          <w:tcPr>
+            <w:tcW w:type="dxa" w:w="2340"/>
+          </w:tcPr>
+          <w:p>
+            <w:pPr>
+              <w:spacing w:after="0"/>
+            </w:pPr>
+            <w:r/>
+            <w:r>
+              <w:rPr>
+                <w:sz w:val="18"/>
+              </w:rPr>
+              <w:t>b_minimized</w:t>
+            </w:r>
+          </w:p>
+        </w:tc>
+        <w:tc>
+          <w:tcPr>
+            <w:tcW w:type="dxa" w:w="2340"/>
+          </w:tcPr>
+          <w:p>
+            <w:pPr>
+              <w:spacing w:after="0"/>
+            </w:pPr>
+            <w:r/>
+            <w:r>
+              <w:rPr>
+                <w:sz w:val="18"/>
+              </w:rPr>
+              <w:t>78.4%</w:t>
+            </w:r>
+          </w:p>
+        </w:tc>
+        <w:tc>
+          <w:tcPr>
+            <w:tcW w:type="dxa" w:w="2340"/>
+          </w:tcPr>
+          <w:p>
+            <w:pPr>
+              <w:spacing w:after="0"/>
+            </w:pPr>
+            <w:r/>
+            <w:r>
+              <w:rPr>
+                <w:sz w:val="18"/>
+              </w:rPr>
+              <w:t>54.4%</w:t>
+            </w:r>
+          </w:p>
+        </w:tc>
+        <w:tc>
+          <w:tcPr>
+            <w:tcW w:type="dxa" w:w="2340"/>
+          </w:tcPr>
+          <w:p>
+            <w:pPr>
+              <w:spacing w:after="0"/>
+            </w:pPr>
+            <w:r/>
+            <w:r>
+              <w:rPr>
+                <w:sz w:val="18"/>
+              </w:rPr>
+              <w:t>221</w:t>
+            </w:r>
+          </w:p>
+        </w:tc>
+      </w:tr>
+      <w:tr>
+        <w:tc>
+          <w:tcPr>
+            <w:tcW w:type="dxa" w:w="2340"/>
+          </w:tcPr>
+          <w:p>
+            <w:pPr>
+              <w:spacing w:after="0"/>
+            </w:pPr>
+            <w:r/>
+            <w:r>
+              <w:rPr>
+                <w:sz w:val="18"/>
+              </w:rPr>
+              <w:t>e_hybrid</w:t>
+            </w:r>
+          </w:p>
+        </w:tc>
+        <w:tc>
+          <w:tcPr>
+            <w:tcW w:type="dxa" w:w="2340"/>
+          </w:tcPr>
+          <w:p>
+            <w:pPr>
+              <w:spacing w:after="0"/>
+            </w:pPr>
+            <w:r/>
+            <w:r>
+              <w:rPr>
+                <w:sz w:val="18"/>
+              </w:rPr>
+              <w:t>79.7%</w:t>
+            </w:r>
+          </w:p>
+        </w:tc>
+        <w:tc>
+          <w:tcPr>
+            <w:tcW w:type="dxa" w:w="2340"/>
+          </w:tcPr>
+          <w:p>
+            <w:pPr>
+              <w:spacing w:after="0"/>
+            </w:pPr>
+            <w:r/>
+            <w:r>
+              <w:rPr>
+                <w:sz w:val="18"/>
+              </w:rPr>
+              <w:t>54.7%</w:t>
+            </w:r>
+          </w:p>
+        </w:tc>
+        <w:tc>
+          <w:tcPr>
+            <w:tcW w:type="dxa" w:w="2340"/>
+          </w:tcPr>
+          <w:p>
+            <w:pPr>
+              <w:spacing w:after="0"/>
+            </w:pPr>
+            <w:r/>
+            <w:r>
+              <w:rPr>
+                <w:sz w:val="18"/>
+              </w:rPr>
+              <w:t>182</w:t>
+            </w:r>
+          </w:p>
+        </w:tc>
+      </w:tr>
+      <w:tr>
+        <w:tc>
+          <w:tcPr>
+            <w:tcW w:type="dxa" w:w="2340"/>
+          </w:tcPr>
+          <w:p>
+            <w:pPr>
+              <w:spacing w:after="0"/>
+            </w:pPr>
+            <w:r/>
+            <w:r>
+              <w:rPr>
+                <w:sz w:val="18"/>
+              </w:rPr>
+              <w:t>f_bias (winner)</w:t>
+            </w:r>
+          </w:p>
+        </w:tc>
+        <w:tc>
+          <w:tcPr>
+            <w:tcW w:type="dxa" w:w="2340"/>
+          </w:tcPr>
+          <w:p>
+            <w:pPr>
+              <w:spacing w:after="0"/>
+            </w:pPr>
+            <w:r/>
+            <w:r>
+              <w:rPr>
+                <w:sz w:val="18"/>
+              </w:rPr>
+              <w:t>82.4%</w:t>
+            </w:r>
+          </w:p>
+        </w:tc>
+        <w:tc>
+          <w:tcPr>
+            <w:tcW w:type="dxa" w:w="2340"/>
+          </w:tcPr>
+          <w:p>
+            <w:pPr>
+              <w:spacing w:after="0"/>
+            </w:pPr>
+            <w:r/>
+            <w:r>
+              <w:rPr>
+                <w:sz w:val="18"/>
+              </w:rPr>
+              <w:t>55.2%</w:t>
+            </w:r>
+          </w:p>
+        </w:tc>
+        <w:tc>
+          <w:tcPr>
+            <w:tcW w:type="dxa" w:w="2340"/>
+          </w:tcPr>
+          <w:p>
+            <w:pPr>
+              <w:spacing w:after="0"/>
+            </w:pPr>
+            <w:r/>
+            <w:r>
+              <w:rPr>
+                <w:sz w:val="18"/>
+              </w:rPr>
+              <w:t>214</w:t>
+            </w:r>
+          </w:p>
+        </w:tc>
+      </w:tr>
+      <w:tr>
+        <w:tc>
+          <w:tcPr>
+            <w:tcW w:type="dxa" w:w="2340"/>
+          </w:tcPr>
+          <w:p>
+            <w:pPr>
+              <w:spacing w:after="0"/>
+            </w:pPr>
+            <w:r/>
+            <w:r>
+              <w:rPr>
+                <w:sz w:val="18"/>
+              </w:rPr>
+              <w:t>g_evidence</w:t>
+            </w:r>
+          </w:p>
+        </w:tc>
+        <w:tc>
+          <w:tcPr>
+            <w:tcW w:type="dxa" w:w="2340"/>
+          </w:tcPr>
+          <w:p>
+            <w:pPr>
+              <w:spacing w:after="0"/>
+            </w:pPr>
+            <w:r/>
+            <w:r>
+              <w:rPr>
+                <w:sz w:val="18"/>
+              </w:rPr>
+              <w:t>75.7%</w:t>
+            </w:r>
+          </w:p>
+        </w:tc>
+        <w:tc>
+          <w:tcPr>
+            <w:tcW w:type="dxa" w:w="2340"/>
+          </w:tcPr>
+          <w:p>
+            <w:pPr>
+              <w:spacing w:after="0"/>
+            </w:pPr>
+            <w:r/>
+            <w:r>
+              <w:rPr>
+                <w:sz w:val="18"/>
+              </w:rPr>
+              <w:t>53.9%</w:t>
+            </w:r>
+          </w:p>
+        </w:tc>
+        <w:tc>
+          <w:tcPr>
+            <w:tcW w:type="dxa" w:w="2340"/>
+          </w:tcPr>
+          <w:p>
+            <w:pPr>
+              <w:spacing w:after="0"/>
+            </w:pPr>
+            <w:r/>
+            <w:r>
+              <w:rPr>
+                <w:sz w:val="18"/>
+              </w:rPr>
+              <w:t>194</w:t>
+            </w:r>
+          </w:p>
+        </w:tc>
+      </w:tr>
+      <w:tr>
+        <w:tc>
+          <w:tcPr>
+            <w:tcW w:type="dxa" w:w="2340"/>
+          </w:tcPr>
+          <w:p>
+            <w:pPr>
+              <w:spacing w:after="0"/>
+            </w:pPr>
+            <w:r/>
+            <w:r>
+              <w:rPr>
+                <w:sz w:val="18"/>
+              </w:rPr>
+              <w:t>layout_md (f_bias)</w:t>
+            </w:r>
+          </w:p>
+        </w:tc>
+        <w:tc>
+          <w:tcPr>
+            <w:tcW w:type="dxa" w:w="2340"/>
+          </w:tcPr>
+          <w:p>
+            <w:pPr>
+              <w:spacing w:after="0"/>
+            </w:pPr>
+            <w:r/>
+            <w:r>
+              <w:rPr>
+                <w:sz w:val="18"/>
+              </w:rPr>
+              <w:t>77.0%</w:t>
+            </w:r>
+          </w:p>
+        </w:tc>
+        <w:tc>
+          <w:tcPr>
+            <w:tcW w:type="dxa" w:w="2340"/>
+          </w:tcPr>
+          <w:p>
+            <w:pPr>
+              <w:spacing w:after="0"/>
+            </w:pPr>
+            <w:r/>
+            <w:r>
+              <w:rPr>
+                <w:sz w:val="18"/>
+              </w:rPr>
+              <w:t>50.8%</w:t>
+            </w:r>
+          </w:p>
+        </w:tc>
+        <w:tc>
+          <w:tcPr>
+            <w:tcW w:type="dxa" w:w="2340"/>
+          </w:tcPr>
+          <w:p>
+            <w:pPr>
+              <w:spacing w:after="0"/>
+            </w:pPr>
+            <w:r/>
+            <w:r>
+              <w:rPr>
+                <w:sz w:val="18"/>
+              </w:rPr>
+              <w:t>235</w:t>
+            </w:r>
+          </w:p>
+        </w:tc>
+      </w:tr>
+      <w:tr>
+        <w:tc>
+          <w:tcPr>
+            <w:tcW w:type="dxa" w:w="2340"/>
+          </w:tcPr>
+          <w:p>
+            <w:pPr>
+              <w:spacing w:after="0"/>
+            </w:pPr>
+            <w:r/>
+            <w:r>
+              <w:rPr>
+                <w:sz w:val="18"/>
+              </w:rPr>
+              <w:t>layout_ann (f_bias)</w:t>
+            </w:r>
+          </w:p>
+        </w:tc>
+        <w:tc>
+          <w:tcPr>
+            <w:tcW w:type="dxa" w:w="2340"/>
+          </w:tcPr>
+          <w:p>
+            <w:pPr>
+              <w:spacing w:after="0"/>
+            </w:pPr>
+            <w:r/>
+            <w:r>
+              <w:rPr>
+                <w:sz w:val="18"/>
+              </w:rPr>
+              <w:t>78.4%</w:t>
+            </w:r>
+          </w:p>
+        </w:tc>
+        <w:tc>
+          <w:tcPr>
+            <w:tcW w:type="dxa" w:w="2340"/>
+          </w:tcPr>
+          <w:p>
+            <w:pPr>
+              <w:spacing w:after="0"/>
+            </w:pPr>
+            <w:r/>
+            <w:r>
+              <w:rPr>
+                <w:sz w:val="18"/>
+              </w:rPr>
+              <w:t>51.3%</w:t>
+            </w:r>
+          </w:p>
+        </w:tc>
+        <w:tc>
+          <w:tcPr>
+            <w:tcW w:type="dxa" w:w="2340"/>
+          </w:tcPr>
+          <w:p>
+            <w:pPr>
+              <w:spacing w:after="0"/>
+            </w:pPr>
+            <w:r/>
+            <w:r>
+              <w:rPr>
+                <w:sz w:val="18"/>
+              </w:rPr>
+              <w:t>-</w:t>
+            </w:r>
+          </w:p>
+        </w:tc>
+      </w:tr>
+    </w:tbl>
+    <w:p/>
+    <w:p>
+      <w:pPr>
+        <w:spacing w:before="160" w:after="120"/>
+      </w:pPr>
+      <w:r>
+        <w:rPr>
+          <w:b/>
+          <w:color w:val="2F5496"/>
+          <w:sz w:val="26"/>
+        </w:rPr>
+        <w:t>Strengths</w:t>
+      </w:r>
+    </w:p>
+    <w:p>
+      <w:pPr>
+        <w:spacing w:after="60"/>
+        <w:ind w:left="360" w:hanging="240"/>
+      </w:pPr>
+      <w:r>
+        <w:rPr>
+          <w:sz w:val="22"/>
+        </w:rPr>
+        <w:t>•  Contains-match router routes 39/74 at 100% precision (-53% LLM calls).</w:t>
+      </w:r>
+    </w:p>
+    <w:p>
+      <w:pPr>
+        <w:spacing w:after="60"/>
+        <w:ind w:left="360" w:hanging="240"/>
+      </w:pPr>
+      <w:r>
+        <w:rPr>
+          <w:sz w:val="22"/>
+        </w:rPr>
+        <w:t>•  f_bias fixes English-name scale bias (data slayer, 2955331, IRIS) without breaking BEM-fakultas.</w:t>
+      </w:r>
+    </w:p>
+    <w:p>
+      <w:pPr>
+        <w:spacing w:before="160" w:after="120"/>
+      </w:pPr>
+      <w:r>
+        <w:rPr>
+          <w:b/>
+          <w:color w:val="2F5496"/>
+          <w:sz w:val="26"/>
+        </w:rPr>
+        <w:t>Limitations</w:t>
+      </w:r>
+    </w:p>
+    <w:p>
+      <w:pPr>
+        <w:spacing w:after="60"/>
+        <w:ind w:left="360" w:hanging="240"/>
+      </w:pPr>
+      <w:r>
+        <w:rPr>
+          <w:sz w:val="22"/>
+        </w:rPr>
+        <w:t>•  g_evidence (FaR-style) regresses accuracy and adds completion tokens -&gt; rejected.</w:t>
+      </w:r>
+    </w:p>
+    <w:p>
+      <w:pPr>
+        <w:spacing w:after="60"/>
+        <w:ind w:left="360" w:hanging="240"/>
+      </w:pPr>
+      <w:r>
+        <w:rPr>
+          <w:sz w:val="22"/>
+        </w:rPr>
+        <w:t>•  Layout does not help: only 25/74 PDFs have embedded text, and markers disturb deterministic extractors.</w:t>
+      </w:r>
+    </w:p>
+    <w:p>
+      <w:pPr>
+        <w:spacing w:after="60"/>
+        <w:ind w:left="360" w:hanging="240"/>
+      </w:pPr>
+      <w:r>
+        <w:rPr>
+          <w:sz w:val="22"/>
+        </w:rPr>
+        <w:t>•  f_bias is 214 eff tokens/cert, slightly over the 200 gate.</w:t>
+      </w:r>
+    </w:p>
+    <w:p>
+      <w:pPr>
+        <w:spacing w:before="160" w:after="120"/>
+      </w:pPr>
+      <w:r>
+        <w:rPr>
+          <w:b/>
+          <w:color w:val="2F5496"/>
+          <w:sz w:val="26"/>
+        </w:rPr>
+        <w:t>Code Reference</w:t>
+      </w:r>
+    </w:p>
+    <w:p>
+      <w:pPr>
+        <w:spacing w:after="60"/>
+        <w:ind w:left="360" w:hanging="240"/>
+      </w:pPr>
+      <w:r>
+        <w:rPr>
+          <w:sz w:val="22"/>
+        </w:rPr>
+        <w:t>•  tests/llm_router_v4.py, tests/llm_extractor_v4.py, tests/benchmark_llm_v4.py</w:t>
+      </w:r>
+    </w:p>
+    <w:p>
+      <w:pPr>
+        <w:spacing w:after="60"/>
+        <w:ind w:left="360" w:hanging="240"/>
+      </w:pPr>
+      <w:r>
+        <w:rPr>
+          <w:sz w:val="22"/>
+        </w:rPr>
+        <w:t>•  tests/layout_repr.py, tests/verify_ground_truth.py</w:t>
+      </w:r>
+    </w:p>
+    <w:p>
+      <w:pPr>
+        <w:spacing w:after="60"/>
+        <w:ind w:left="360" w:hanging="240"/>
+      </w:pPr>
+      <w:r>
+        <w:rPr>
+          <w:sz w:val="22"/>
+        </w:rPr>
+        <w:t>•  Production: backend/app/services/{tingkat_router,llm_tingkat,organizer_v2}.py</w:t>
+      </w:r>
+    </w:p>
     <w:sectPr>
       <w:headerReference w:type="default" r:id="rId7"/>
       <w:footerReference w:type="default" r:id="rId8"/>

</xml_diff>

<commit_message>
docs: report pipeline v9 (best current) + addendum v9-v17
- pipeline_data.json: source-of-truth pipeline v9 (7 stage, 13 router rules,
  f_bias LLM, results GT v9 + matcher v2: MACRO 60.2%, 176 tok/cert, 29 calls)
- generate_pipeline_doc.py: regenerate pipeline_best.docx/.md/.xlsx (reuse
  generate_report renderer); swap JSON untuk best berikutnya
- report_data.json + NC-002 (region-OCR murah FAIL), addendum v9-v17 di
  phase_v4_results_summary, fix router v9 42->45/74 @100%
- docs regenerate data-driven (auto tables)
</commit_message>
<xml_diff>
--- a/docs/report/benchmark_methods.docx
+++ b/docs/report/benchmark_methods.docx
@@ -11237,7 +11237,7 @@
               <w:rPr>
                 <w:sz w:val="18"/>
               </w:rPr>
-              <w:t>42/74 @100%</w:t>
+              <w:t>45/74 @100%</w:t>
             </w:r>
           </w:p>
         </w:tc>
@@ -11353,7 +11353,7 @@
               <w:rPr>
                 <w:sz w:val="18"/>
               </w:rPr>
-              <w:t>42/74 @100%</w:t>
+              <w:t>45/74 @100%</w:t>
             </w:r>
           </w:p>
         </w:tc>
@@ -11732,6 +11732,120 @@
           <w:tcPr>
             <w:tcW w:type="dxa" w:w="1080"/>
             <w:shd w:val="clear" w:color="auto" w:fill="F2F6FC"/>
+          </w:tcPr>
+          <w:p>
+            <w:r/>
+            <w:r>
+              <w:rPr>
+                <w:sz w:val="18"/>
+              </w:rPr>
+              <w:t>Aug 6</w:t>
+            </w:r>
+          </w:p>
+        </w:tc>
+      </w:tr>
+      <w:tr>
+        <w:tc>
+          <w:tcPr>
+            <w:tcW w:type="dxa" w:w="1080"/>
+          </w:tcPr>
+          <w:p>
+            <w:r/>
+            <w:r>
+              <w:rPr>
+                <w:sz w:val="18"/>
+              </w:rPr>
+              <w:t>NC-002 region-OCR murah (rapid / tess psm tunggal) utk 2-pass nomor</w:t>
+            </w:r>
+          </w:p>
+        </w:tc>
+        <w:tc>
+          <w:tcPr>
+            <w:tcW w:type="dxa" w:w="1080"/>
+          </w:tcPr>
+          <w:p>
+            <w:r/>
+            <w:r>
+              <w:rPr>
+                <w:sz w:val="18"/>
+              </w:rPr>
+              <w:t>n/a</w:t>
+            </w:r>
+          </w:p>
+        </w:tc>
+        <w:tc>
+          <w:tcPr>
+            <w:tcW w:type="dxa" w:w="1080"/>
+          </w:tcPr>
+          <w:p>
+            <w:r/>
+            <w:r>
+              <w:rPr>
+                <w:sz w:val="18"/>
+              </w:rPr>
+              <w:t>47.3%</w:t>
+            </w:r>
+          </w:p>
+        </w:tc>
+        <w:tc>
+          <w:tcPr>
+            <w:tcW w:type="dxa" w:w="1080"/>
+          </w:tcPr>
+          <w:p>
+            <w:r/>
+            <w:r>
+              <w:rPr>
+                <w:sz w:val="18"/>
+              </w:rPr>
+              <w:t>0</w:t>
+            </w:r>
+          </w:p>
+        </w:tc>
+        <w:tc>
+          <w:tcPr>
+            <w:tcW w:type="dxa" w:w="1080"/>
+          </w:tcPr>
+          <w:p>
+            <w:r/>
+            <w:r>
+              <w:rPr>
+                <w:sz w:val="18"/>
+              </w:rPr>
+              <w:t>0</w:t>
+            </w:r>
+          </w:p>
+        </w:tc>
+        <w:tc>
+          <w:tcPr>
+            <w:tcW w:type="dxa" w:w="1080"/>
+          </w:tcPr>
+          <w:p>
+            <w:r/>
+            <w:r>
+              <w:rPr>
+                <w:sz w:val="18"/>
+              </w:rPr>
+              <w:t>-</w:t>
+            </w:r>
+          </w:p>
+        </w:tc>
+        <w:tc>
+          <w:tcPr>
+            <w:tcW w:type="dxa" w:w="1080"/>
+          </w:tcPr>
+          <w:p>
+            <w:r/>
+            <w:r>
+              <w:rPr>
+                <w:sz w:val="18"/>
+              </w:rPr>
+              <w:t>v9</w:t>
+            </w:r>
+          </w:p>
+        </w:tc>
+        <w:tc>
+          <w:tcPr>
+            <w:tcW w:type="dxa" w:w="1080"/>
           </w:tcPr>
           <w:p>
             <w:r/>
@@ -12676,6 +12790,64 @@
                 <w:sz w:val="18"/>
               </w:rPr>
               <w:t>46.8%</w:t>
+            </w:r>
+          </w:p>
+        </w:tc>
+      </w:tr>
+      <w:tr>
+        <w:tc>
+          <w:tcPr>
+            <w:tcW w:type="dxa" w:w="2160"/>
+          </w:tcPr>
+          <w:p>
+            <w:r/>
+            <w:r>
+              <w:rPr>
+                <w:sz w:val="18"/>
+              </w:rPr>
+              <w:t>ocr</w:t>
+            </w:r>
+          </w:p>
+        </w:tc>
+        <w:tc>
+          <w:tcPr>
+            <w:tcW w:type="dxa" w:w="2160"/>
+          </w:tcPr>
+          <w:p>
+            <w:r/>
+            <w:r>
+              <w:rPr>
+                <w:sz w:val="18"/>
+              </w:rPr>
+              <w:t>NC-002 region-OCR murah (rapid / tess psm tunggal) utk 2-pass nomor</w:t>
+            </w:r>
+          </w:p>
+        </w:tc>
+        <w:tc>
+          <w:tcPr>
+            <w:tcW w:type="dxa" w:w="2160"/>
+          </w:tcPr>
+          <w:p>
+            <w:r/>
+            <w:r>
+              <w:rPr>
+                <w:sz w:val="18"/>
+              </w:rPr>
+              <w:t>n/a</w:t>
+            </w:r>
+          </w:p>
+        </w:tc>
+        <w:tc>
+          <w:tcPr>
+            <w:tcW w:type="dxa" w:w="2160"/>
+          </w:tcPr>
+          <w:p>
+            <w:r/>
+            <w:r>
+              <w:rPr>
+                <w:sz w:val="18"/>
+              </w:rPr>
+              <w:t>47.3%</w:t>
             </w:r>
           </w:p>
         </w:tc>

</xml_diff>

<commit_message>
docs(report): v10 masuk laporan resmi — entri ORG-003 organizer v3 (0 LLM) di tabel eksperimen xlsx + addendum OOD-002 robustness di phase_v4_results_summary (docx/md)
</commit_message>
<xml_diff>
--- a/docs/report/benchmark_methods.docx
+++ b/docs/report/benchmark_methods.docx
@@ -11858,6 +11858,128 @@
           </w:p>
         </w:tc>
       </w:tr>
+      <w:tr>
+        <w:tc>
+          <w:tcPr>
+            <w:tcW w:type="dxa" w:w="1080"/>
+            <w:shd w:val="clear" w:color="auto" w:fill="F2F6FC"/>
+          </w:tcPr>
+          <w:p>
+            <w:r/>
+            <w:r>
+              <w:rPr>
+                <w:sz w:val="18"/>
+              </w:rPr>
+              <w:t>F1 organizer v3 (R0-R5, 0 LLM)</w:t>
+            </w:r>
+          </w:p>
+        </w:tc>
+        <w:tc>
+          <w:tcPr>
+            <w:tcW w:type="dxa" w:w="1080"/>
+            <w:shd w:val="clear" w:color="auto" w:fill="F2F6FC"/>
+          </w:tcPr>
+          <w:p>
+            <w:r/>
+            <w:r>
+              <w:rPr>
+                <w:sz w:val="18"/>
+              </w:rPr>
+              <w:t>81.1%</w:t>
+            </w:r>
+          </w:p>
+        </w:tc>
+        <w:tc>
+          <w:tcPr>
+            <w:tcW w:type="dxa" w:w="1080"/>
+            <w:shd w:val="clear" w:color="auto" w:fill="F2F6FC"/>
+          </w:tcPr>
+          <w:p>
+            <w:r/>
+            <w:r>
+              <w:rPr>
+                <w:sz w:val="18"/>
+              </w:rPr>
+              <w:t>59.6%</w:t>
+            </w:r>
+          </w:p>
+        </w:tc>
+        <w:tc>
+          <w:tcPr>
+            <w:tcW w:type="dxa" w:w="1080"/>
+            <w:shd w:val="clear" w:color="auto" w:fill="F2F6FC"/>
+          </w:tcPr>
+          <w:p>
+            <w:r/>
+            <w:r>
+              <w:rPr>
+                <w:sz w:val="18"/>
+              </w:rPr>
+              <w:t>0</w:t>
+            </w:r>
+          </w:p>
+        </w:tc>
+        <w:tc>
+          <w:tcPr>
+            <w:tcW w:type="dxa" w:w="1080"/>
+            <w:shd w:val="clear" w:color="auto" w:fill="F2F6FC"/>
+          </w:tcPr>
+          <w:p>
+            <w:r/>
+            <w:r>
+              <w:rPr>
+                <w:sz w:val="18"/>
+              </w:rPr>
+              <w:t>0</w:t>
+            </w:r>
+          </w:p>
+        </w:tc>
+        <w:tc>
+          <w:tcPr>
+            <w:tcW w:type="dxa" w:w="1080"/>
+            <w:shd w:val="clear" w:color="auto" w:fill="F2F6FC"/>
+          </w:tcPr>
+          <w:p>
+            <w:r/>
+            <w:r>
+              <w:rPr>
+                <w:sz w:val="18"/>
+              </w:rPr>
+              <w:t>-</w:t>
+            </w:r>
+          </w:p>
+        </w:tc>
+        <w:tc>
+          <w:tcPr>
+            <w:tcW w:type="dxa" w:w="1080"/>
+            <w:shd w:val="clear" w:color="auto" w:fill="F2F6FC"/>
+          </w:tcPr>
+          <w:p>
+            <w:r/>
+            <w:r>
+              <w:rPr>
+                <w:sz w:val="18"/>
+              </w:rPr>
+              <w:t>v9</w:t>
+            </w:r>
+          </w:p>
+        </w:tc>
+        <w:tc>
+          <w:tcPr>
+            <w:tcW w:type="dxa" w:w="1080"/>
+            <w:shd w:val="clear" w:color="auto" w:fill="F2F6FC"/>
+          </w:tcPr>
+          <w:p>
+            <w:r/>
+            <w:r>
+              <w:rPr>
+                <w:sz w:val="18"/>
+              </w:rPr>
+              <w:t>Aug 10</w:t>
+            </w:r>
+          </w:p>
+        </w:tc>
+      </w:tr>
     </w:tbl>
     <w:p/>
     <w:tbl>
@@ -12848,6 +12970,68 @@
                 <w:sz w:val="18"/>
               </w:rPr>
               <w:t>47.3%</w:t>
+            </w:r>
+          </w:p>
+        </w:tc>
+      </w:tr>
+      <w:tr>
+        <w:tc>
+          <w:tcPr>
+            <w:tcW w:type="dxa" w:w="2160"/>
+            <w:shd w:val="clear" w:color="auto" w:fill="F2F6FC"/>
+          </w:tcPr>
+          <w:p>
+            <w:r/>
+            <w:r>
+              <w:rPr>
+                <w:sz w:val="18"/>
+              </w:rPr>
+              <w:t>v10</w:t>
+            </w:r>
+          </w:p>
+        </w:tc>
+        <w:tc>
+          <w:tcPr>
+            <w:tcW w:type="dxa" w:w="2160"/>
+            <w:shd w:val="clear" w:color="auto" w:fill="F2F6FC"/>
+          </w:tcPr>
+          <w:p>
+            <w:r/>
+            <w:r>
+              <w:rPr>
+                <w:sz w:val="18"/>
+              </w:rPr>
+              <w:t>F1 organizer v3 (R0-R5, 0 LLM)</w:t>
+            </w:r>
+          </w:p>
+        </w:tc>
+        <w:tc>
+          <w:tcPr>
+            <w:tcW w:type="dxa" w:w="2160"/>
+            <w:shd w:val="clear" w:color="auto" w:fill="F2F6FC"/>
+          </w:tcPr>
+          <w:p>
+            <w:r/>
+            <w:r>
+              <w:rPr>
+                <w:sz w:val="18"/>
+              </w:rPr>
+              <w:t>81.1%</w:t>
+            </w:r>
+          </w:p>
+        </w:tc>
+        <w:tc>
+          <w:tcPr>
+            <w:tcW w:type="dxa" w:w="2160"/>
+            <w:shd w:val="clear" w:color="auto" w:fill="F2F6FC"/>
+          </w:tcPr>
+          <w:p>
+            <w:r/>
+            <w:r>
+              <w:rPr>
+                <w:sz w:val="18"/>
+              </w:rPr>
+              <w:t>59.6%</w:t>
             </w:r>
           </w:p>
         </w:tc>

</xml_diff>

<commit_message>
docs(report): F1C-001 + OOD-003 masuk laporan resmi (organizer 54.1%, MACRO 61.2%)
- report_data.json: entri org_003_v3 -> v3+R6 (run 160232, per_field_src baru,
  notes F1C-001 + OOD-003); blok dokumen F1C-001 + OOD-003; rekomendasi port
  final (KEEP R0/R2/PREFIX_HELD/R6, GUARD R1/R4, hapus R3/R5)
- generate_report.py: regenerate docx/md + results_comparison.xlsx lokal
  (phase_v4_results_summary.docx di-ignore .gitignore)
</commit_message>
<xml_diff>
--- a/docs/report/benchmark_methods.docx
+++ b/docs/report/benchmark_methods.docx
@@ -11870,7 +11870,7 @@
               <w:rPr>
                 <w:sz w:val="18"/>
               </w:rPr>
-              <w:t>F1 organizer v3 (R0-R5, 0 LLM)</w:t>
+              <w:t>F1 organizer v3 + R6 (0 LLM)</w:t>
             </w:r>
           </w:p>
         </w:tc>
@@ -11900,7 +11900,7 @@
               <w:rPr>
                 <w:sz w:val="18"/>
               </w:rPr>
-              <w:t>59.6%</w:t>
+              <w:t>61.2%</w:t>
             </w:r>
           </w:p>
         </w:tc>
@@ -13001,7 +13001,7 @@
               <w:rPr>
                 <w:sz w:val="18"/>
               </w:rPr>
-              <w:t>F1 organizer v3 (R0-R5, 0 LLM)</w:t>
+              <w:t>F1 organizer v3 + R6 (0 LLM)</w:t>
             </w:r>
           </w:p>
         </w:tc>
@@ -13031,7 +13031,7 @@
               <w:rPr>
                 <w:sz w:val="18"/>
               </w:rPr>
-              <w:t>59.6%</w:t>
+              <w:t>61.2%</w:t>
             </w:r>
           </w:p>
         </w:tc>

</xml_diff>

<commit_message>
docs(report): split KB ke team_review_kb (md+xlsx) + ORG-002/ORG-004 masuk report_data + ledger ref v28
</commit_message>
<xml_diff>
--- a/docs/report/benchmark_methods.docx
+++ b/docs/report/benchmark_methods.docx
@@ -11980,6 +11980,242 @@
           </w:p>
         </w:tc>
       </w:tr>
+      <w:tr>
+        <w:tc>
+          <w:tcPr>
+            <w:tcW w:type="dxa" w:w="1080"/>
+          </w:tcPr>
+          <w:p>
+            <w:r/>
+            <w:r>
+              <w:rPr>
+                <w:sz w:val="18"/>
+              </w:rPr>
+              <w:t>F1 normalisasi organizer &amp; nomor (0 LLM)</w:t>
+            </w:r>
+          </w:p>
+        </w:tc>
+        <w:tc>
+          <w:tcPr>
+            <w:tcW w:type="dxa" w:w="1080"/>
+          </w:tcPr>
+          <w:p>
+            <w:r/>
+            <w:r>
+              <w:rPr>
+                <w:sz w:val="18"/>
+              </w:rPr>
+              <w:t>81.1%</w:t>
+            </w:r>
+          </w:p>
+        </w:tc>
+        <w:tc>
+          <w:tcPr>
+            <w:tcW w:type="dxa" w:w="1080"/>
+          </w:tcPr>
+          <w:p>
+            <w:r/>
+            <w:r>
+              <w:rPr>
+                <w:sz w:val="18"/>
+              </w:rPr>
+              <w:t>58.3%</w:t>
+            </w:r>
+          </w:p>
+        </w:tc>
+        <w:tc>
+          <w:tcPr>
+            <w:tcW w:type="dxa" w:w="1080"/>
+          </w:tcPr>
+          <w:p>
+            <w:r/>
+            <w:r>
+              <w:rPr>
+                <w:sz w:val="18"/>
+              </w:rPr>
+              <w:t>0</w:t>
+            </w:r>
+          </w:p>
+        </w:tc>
+        <w:tc>
+          <w:tcPr>
+            <w:tcW w:type="dxa" w:w="1080"/>
+          </w:tcPr>
+          <w:p>
+            <w:r/>
+            <w:r>
+              <w:rPr>
+                <w:sz w:val="18"/>
+              </w:rPr>
+              <w:t>0</w:t>
+            </w:r>
+          </w:p>
+        </w:tc>
+        <w:tc>
+          <w:tcPr>
+            <w:tcW w:type="dxa" w:w="1080"/>
+          </w:tcPr>
+          <w:p>
+            <w:r/>
+            <w:r>
+              <w:rPr>
+                <w:sz w:val="18"/>
+              </w:rPr>
+              <w:t>-</w:t>
+            </w:r>
+          </w:p>
+        </w:tc>
+        <w:tc>
+          <w:tcPr>
+            <w:tcW w:type="dxa" w:w="1080"/>
+          </w:tcPr>
+          <w:p>
+            <w:r/>
+            <w:r>
+              <w:rPr>
+                <w:sz w:val="18"/>
+              </w:rPr>
+              <w:t>v9</w:t>
+            </w:r>
+          </w:p>
+        </w:tc>
+        <w:tc>
+          <w:tcPr>
+            <w:tcW w:type="dxa" w:w="1080"/>
+          </w:tcPr>
+          <w:p>
+            <w:r/>
+            <w:r>
+              <w:rPr>
+                <w:sz w:val="18"/>
+              </w:rPr>
+              <w:t>Aug 10</w:t>
+            </w:r>
+          </w:p>
+        </w:tc>
+      </w:tr>
+      <w:tr>
+        <w:tc>
+          <w:tcPr>
+            <w:tcW w:type="dxa" w:w="1080"/>
+            <w:shd w:val="clear" w:color="auto" w:fill="F2F6FC"/>
+          </w:tcPr>
+          <w:p>
+            <w:r/>
+            <w:r>
+              <w:rPr>
+                <w:sz w:val="18"/>
+              </w:rPr>
+              <w:t>ORG-004 canonicalisasi format (0 LLM)</w:t>
+            </w:r>
+          </w:p>
+        </w:tc>
+        <w:tc>
+          <w:tcPr>
+            <w:tcW w:type="dxa" w:w="1080"/>
+            <w:shd w:val="clear" w:color="auto" w:fill="F2F6FC"/>
+          </w:tcPr>
+          <w:p>
+            <w:r/>
+            <w:r>
+              <w:rPr>
+                <w:sz w:val="18"/>
+              </w:rPr>
+              <w:t>81.1%</w:t>
+            </w:r>
+          </w:p>
+        </w:tc>
+        <w:tc>
+          <w:tcPr>
+            <w:tcW w:type="dxa" w:w="1080"/>
+            <w:shd w:val="clear" w:color="auto" w:fill="F2F6FC"/>
+          </w:tcPr>
+          <w:p>
+            <w:r/>
+            <w:r>
+              <w:rPr>
+                <w:sz w:val="18"/>
+              </w:rPr>
+              <w:t>63.5%</w:t>
+            </w:r>
+          </w:p>
+        </w:tc>
+        <w:tc>
+          <w:tcPr>
+            <w:tcW w:type="dxa" w:w="1080"/>
+            <w:shd w:val="clear" w:color="auto" w:fill="F2F6FC"/>
+          </w:tcPr>
+          <w:p>
+            <w:r/>
+            <w:r>
+              <w:rPr>
+                <w:sz w:val="18"/>
+              </w:rPr>
+              <w:t>0</w:t>
+            </w:r>
+          </w:p>
+        </w:tc>
+        <w:tc>
+          <w:tcPr>
+            <w:tcW w:type="dxa" w:w="1080"/>
+            <w:shd w:val="clear" w:color="auto" w:fill="F2F6FC"/>
+          </w:tcPr>
+          <w:p>
+            <w:r/>
+            <w:r>
+              <w:rPr>
+                <w:sz w:val="18"/>
+              </w:rPr>
+              <w:t>0</w:t>
+            </w:r>
+          </w:p>
+        </w:tc>
+        <w:tc>
+          <w:tcPr>
+            <w:tcW w:type="dxa" w:w="1080"/>
+            <w:shd w:val="clear" w:color="auto" w:fill="F2F6FC"/>
+          </w:tcPr>
+          <w:p>
+            <w:r/>
+            <w:r>
+              <w:rPr>
+                <w:sz w:val="18"/>
+              </w:rPr>
+              <w:t>-</w:t>
+            </w:r>
+          </w:p>
+        </w:tc>
+        <w:tc>
+          <w:tcPr>
+            <w:tcW w:type="dxa" w:w="1080"/>
+            <w:shd w:val="clear" w:color="auto" w:fill="F2F6FC"/>
+          </w:tcPr>
+          <w:p>
+            <w:r/>
+            <w:r>
+              <w:rPr>
+                <w:sz w:val="18"/>
+              </w:rPr>
+              <w:t>v9</w:t>
+            </w:r>
+          </w:p>
+        </w:tc>
+        <w:tc>
+          <w:tcPr>
+            <w:tcW w:type="dxa" w:w="1080"/>
+            <w:shd w:val="clear" w:color="auto" w:fill="F2F6FC"/>
+          </w:tcPr>
+          <w:p>
+            <w:r/>
+            <w:r>
+              <w:rPr>
+                <w:sz w:val="18"/>
+              </w:rPr>
+              <w:t>Aug 13</w:t>
+            </w:r>
+          </w:p>
+        </w:tc>
+      </w:tr>
     </w:tbl>
     <w:p/>
     <w:tbl>
@@ -13032,6 +13268,126 @@
                 <w:sz w:val="18"/>
               </w:rPr>
               <w:t>61.2%</w:t>
+            </w:r>
+          </w:p>
+        </w:tc>
+      </w:tr>
+      <w:tr>
+        <w:tc>
+          <w:tcPr>
+            <w:tcW w:type="dxa" w:w="2160"/>
+          </w:tcPr>
+          <w:p>
+            <w:r/>
+            <w:r>
+              <w:rPr>
+                <w:sz w:val="18"/>
+              </w:rPr>
+              <w:t>v10</w:t>
+            </w:r>
+          </w:p>
+        </w:tc>
+        <w:tc>
+          <w:tcPr>
+            <w:tcW w:type="dxa" w:w="2160"/>
+          </w:tcPr>
+          <w:p>
+            <w:r/>
+            <w:r>
+              <w:rPr>
+                <w:sz w:val="18"/>
+              </w:rPr>
+              <w:t>F1 normalisasi organizer &amp; nomor (0 LLM)</w:t>
+            </w:r>
+          </w:p>
+        </w:tc>
+        <w:tc>
+          <w:tcPr>
+            <w:tcW w:type="dxa" w:w="2160"/>
+          </w:tcPr>
+          <w:p>
+            <w:r/>
+            <w:r>
+              <w:rPr>
+                <w:sz w:val="18"/>
+              </w:rPr>
+              <w:t>81.1%</w:t>
+            </w:r>
+          </w:p>
+        </w:tc>
+        <w:tc>
+          <w:tcPr>
+            <w:tcW w:type="dxa" w:w="2160"/>
+          </w:tcPr>
+          <w:p>
+            <w:r/>
+            <w:r>
+              <w:rPr>
+                <w:sz w:val="18"/>
+              </w:rPr>
+              <w:t>58.3%</w:t>
+            </w:r>
+          </w:p>
+        </w:tc>
+      </w:tr>
+      <w:tr>
+        <w:tc>
+          <w:tcPr>
+            <w:tcW w:type="dxa" w:w="2160"/>
+            <w:shd w:val="clear" w:color="auto" w:fill="F2F6FC"/>
+          </w:tcPr>
+          <w:p>
+            <w:r/>
+            <w:r>
+              <w:rPr>
+                <w:sz w:val="18"/>
+              </w:rPr>
+              <w:t>v10</w:t>
+            </w:r>
+          </w:p>
+        </w:tc>
+        <w:tc>
+          <w:tcPr>
+            <w:tcW w:type="dxa" w:w="2160"/>
+            <w:shd w:val="clear" w:color="auto" w:fill="F2F6FC"/>
+          </w:tcPr>
+          <w:p>
+            <w:r/>
+            <w:r>
+              <w:rPr>
+                <w:sz w:val="18"/>
+              </w:rPr>
+              <w:t>ORG-004 canonicalisasi format (0 LLM)</w:t>
+            </w:r>
+          </w:p>
+        </w:tc>
+        <w:tc>
+          <w:tcPr>
+            <w:tcW w:type="dxa" w:w="2160"/>
+            <w:shd w:val="clear" w:color="auto" w:fill="F2F6FC"/>
+          </w:tcPr>
+          <w:p>
+            <w:r/>
+            <w:r>
+              <w:rPr>
+                <w:sz w:val="18"/>
+              </w:rPr>
+              <w:t>81.1%</w:t>
+            </w:r>
+          </w:p>
+        </w:tc>
+        <w:tc>
+          <w:tcPr>
+            <w:tcW w:type="dxa" w:w="2160"/>
+            <w:shd w:val="clear" w:color="auto" w:fill="F2F6FC"/>
+          </w:tcPr>
+          <w:p>
+            <w:r/>
+            <w:r>
+              <w:rPr>
+                <w:sz w:val="18"/>
+              </w:rPr>
+              <w:t>63.5%</w:t>
             </w:r>
           </w:p>
         </w:tc>

</xml_diff>

<commit_message>
feat(port): PROD-002 port produksi organizer v3+R3+R6+format + nomor (flag-gated, GATE PASS)
- organizer_normalize.py: port verbatim R0/PREFIX_HELD/R2/R3/R6 + F1 alias + F3
  BEM FKM + nomor D/E; SKIP R1/R4 (keputusan user), DROP R5
- KOREKSI R3: ablation 'NO_FIX' diukur pre-ORG-004; R3 membuka alias APHSA
  (1952296/2030335 = 2 fix)
- flag ENABLE_ORGANIZER_NORMALIZATION default false (produksi tak berubah)
- re-eval: fidelity prod==ref 0 mismatch; organizer 37.8->63.5%, nomor
  59.6->76.9%, MACRO 55.7->63.0%, 28 fix / 0 regress, 0 LLM
- test_organizer.py 27 test; pytest 58 passed; report_data + runs_summary +
  handoff v29 + ledger
</commit_message>
<xml_diff>
--- a/docs/report/benchmark_methods.docx
+++ b/docs/report/benchmark_methods.docx
@@ -12216,6 +12216,120 @@
           </w:p>
         </w:tc>
       </w:tr>
+      <w:tr>
+        <w:tc>
+          <w:tcPr>
+            <w:tcW w:type="dxa" w:w="1080"/>
+          </w:tcPr>
+          <w:p>
+            <w:r/>
+            <w:r>
+              <w:rPr>
+                <w:sz w:val="18"/>
+              </w:rPr>
+              <w:t>PROD-002 port produksi organizer v3+R3+R6+format + nomor (flag-gated)</w:t>
+            </w:r>
+          </w:p>
+        </w:tc>
+        <w:tc>
+          <w:tcPr>
+            <w:tcW w:type="dxa" w:w="1080"/>
+          </w:tcPr>
+          <w:p>
+            <w:r/>
+            <w:r>
+              <w:rPr>
+                <w:sz w:val="18"/>
+              </w:rPr>
+              <w:t>81.1%</w:t>
+            </w:r>
+          </w:p>
+        </w:tc>
+        <w:tc>
+          <w:tcPr>
+            <w:tcW w:type="dxa" w:w="1080"/>
+          </w:tcPr>
+          <w:p>
+            <w:r/>
+            <w:r>
+              <w:rPr>
+                <w:sz w:val="18"/>
+              </w:rPr>
+              <w:t>63.0%</w:t>
+            </w:r>
+          </w:p>
+        </w:tc>
+        <w:tc>
+          <w:tcPr>
+            <w:tcW w:type="dxa" w:w="1080"/>
+          </w:tcPr>
+          <w:p>
+            <w:r/>
+            <w:r>
+              <w:rPr>
+                <w:sz w:val="18"/>
+              </w:rPr>
+              <w:t>0</w:t>
+            </w:r>
+          </w:p>
+        </w:tc>
+        <w:tc>
+          <w:tcPr>
+            <w:tcW w:type="dxa" w:w="1080"/>
+          </w:tcPr>
+          <w:p>
+            <w:r/>
+            <w:r>
+              <w:rPr>
+                <w:sz w:val="18"/>
+              </w:rPr>
+              <w:t>0</w:t>
+            </w:r>
+          </w:p>
+        </w:tc>
+        <w:tc>
+          <w:tcPr>
+            <w:tcW w:type="dxa" w:w="1080"/>
+          </w:tcPr>
+          <w:p>
+            <w:r/>
+            <w:r>
+              <w:rPr>
+                <w:sz w:val="18"/>
+              </w:rPr>
+              <w:t>-</w:t>
+            </w:r>
+          </w:p>
+        </w:tc>
+        <w:tc>
+          <w:tcPr>
+            <w:tcW w:type="dxa" w:w="1080"/>
+          </w:tcPr>
+          <w:p>
+            <w:r/>
+            <w:r>
+              <w:rPr>
+                <w:sz w:val="18"/>
+              </w:rPr>
+              <w:t>v9</w:t>
+            </w:r>
+          </w:p>
+        </w:tc>
+        <w:tc>
+          <w:tcPr>
+            <w:tcW w:type="dxa" w:w="1080"/>
+          </w:tcPr>
+          <w:p>
+            <w:r/>
+            <w:r>
+              <w:rPr>
+                <w:sz w:val="18"/>
+              </w:rPr>
+              <w:t>Aug 13</w:t>
+            </w:r>
+          </w:p>
+        </w:tc>
+      </w:tr>
     </w:tbl>
     <w:p/>
     <w:tbl>
@@ -13388,6 +13502,64 @@
                 <w:sz w:val="18"/>
               </w:rPr>
               <w:t>63.5%</w:t>
+            </w:r>
+          </w:p>
+        </w:tc>
+      </w:tr>
+      <w:tr>
+        <w:tc>
+          <w:tcPr>
+            <w:tcW w:type="dxa" w:w="2160"/>
+          </w:tcPr>
+          <w:p>
+            <w:r/>
+            <w:r>
+              <w:rPr>
+                <w:sz w:val="18"/>
+              </w:rPr>
+              <w:t>v10</w:t>
+            </w:r>
+          </w:p>
+        </w:tc>
+        <w:tc>
+          <w:tcPr>
+            <w:tcW w:type="dxa" w:w="2160"/>
+          </w:tcPr>
+          <w:p>
+            <w:r/>
+            <w:r>
+              <w:rPr>
+                <w:sz w:val="18"/>
+              </w:rPr>
+              <w:t>PROD-002 port produksi organizer v3+R3+R6+format + nomor (flag-gated)</w:t>
+            </w:r>
+          </w:p>
+        </w:tc>
+        <w:tc>
+          <w:tcPr>
+            <w:tcW w:type="dxa" w:w="2160"/>
+          </w:tcPr>
+          <w:p>
+            <w:r/>
+            <w:r>
+              <w:rPr>
+                <w:sz w:val="18"/>
+              </w:rPr>
+              <w:t>81.1%</w:t>
+            </w:r>
+          </w:p>
+        </w:tc>
+        <w:tc>
+          <w:tcPr>
+            <w:tcW w:type="dxa" w:w="2160"/>
+          </w:tcPr>
+          <w:p>
+            <w:r/>
+            <w:r>
+              <w:rPr>
+                <w:sz w:val="18"/>
+              </w:rPr>
+              <w:t>63.0%</w:t>
             </w:r>
           </w:p>
         </w:tc>

</xml_diff>

<commit_message>
feat(akt): AKT-002 deteksi nama_kegiatan v2 GATE PASS (+29.7pt, 0 LLM)
- extract_activity_v2: 16 anchor pattern (Kepengurusan full, Dalam
  acara/kegiatan/memperingati, pada ajang/kegiatan/kompetisi, pada X yang
  dilaksanakan, entitled/titled, kutip agenda/kegiatan, participation at,
  the X organized by, winner of the, at the X) + repair OCR word-merge +
  strip junk 'untuk kategori'; guard \bpada (fix KEPADA false-positive)
- hasil (GT v9 + matcher v2, baseline offline_prod): nama_kegiatan exact
  6.8->36.5% (5->27/74), fuzzy 17.6->56.8%, MACRO 63.0->68.8%, 22 fix /
  0 regress, 0 LLM
- OOD noise (QA): drop ekstra 10% +2.7pt / 25% +8.1pt (anchor teks-
  bergantung, pola R1/R4) -> gain absolut positif semua level
- bug regex dicatat: IGNORECASE global merusak camel-split
- report_data akt_002_detection + runs_summary + handoff v31 + ledger
</commit_message>
<xml_diff>
--- a/docs/report/benchmark_methods.docx
+++ b/docs/report/benchmark_methods.docx
@@ -12330,6 +12330,128 @@
           </w:p>
         </w:tc>
       </w:tr>
+      <w:tr>
+        <w:tc>
+          <w:tcPr>
+            <w:tcW w:type="dxa" w:w="1080"/>
+            <w:shd w:val="clear" w:color="auto" w:fill="F2F6FC"/>
+          </w:tcPr>
+          <w:p>
+            <w:r/>
+            <w:r>
+              <w:rPr>
+                <w:sz w:val="18"/>
+              </w:rPr>
+              <w:t>AKT-002 deteksi nama_kegiatan v2 (0 LLM)</w:t>
+            </w:r>
+          </w:p>
+        </w:tc>
+        <w:tc>
+          <w:tcPr>
+            <w:tcW w:type="dxa" w:w="1080"/>
+            <w:shd w:val="clear" w:color="auto" w:fill="F2F6FC"/>
+          </w:tcPr>
+          <w:p>
+            <w:r/>
+            <w:r>
+              <w:rPr>
+                <w:sz w:val="18"/>
+              </w:rPr>
+              <w:t>81.1%</w:t>
+            </w:r>
+          </w:p>
+        </w:tc>
+        <w:tc>
+          <w:tcPr>
+            <w:tcW w:type="dxa" w:w="1080"/>
+            <w:shd w:val="clear" w:color="auto" w:fill="F2F6FC"/>
+          </w:tcPr>
+          <w:p>
+            <w:r/>
+            <w:r>
+              <w:rPr>
+                <w:sz w:val="18"/>
+              </w:rPr>
+              <w:t>68.8%</w:t>
+            </w:r>
+          </w:p>
+        </w:tc>
+        <w:tc>
+          <w:tcPr>
+            <w:tcW w:type="dxa" w:w="1080"/>
+            <w:shd w:val="clear" w:color="auto" w:fill="F2F6FC"/>
+          </w:tcPr>
+          <w:p>
+            <w:r/>
+            <w:r>
+              <w:rPr>
+                <w:sz w:val="18"/>
+              </w:rPr>
+              <w:t>0</w:t>
+            </w:r>
+          </w:p>
+        </w:tc>
+        <w:tc>
+          <w:tcPr>
+            <w:tcW w:type="dxa" w:w="1080"/>
+            <w:shd w:val="clear" w:color="auto" w:fill="F2F6FC"/>
+          </w:tcPr>
+          <w:p>
+            <w:r/>
+            <w:r>
+              <w:rPr>
+                <w:sz w:val="18"/>
+              </w:rPr>
+              <w:t>0</w:t>
+            </w:r>
+          </w:p>
+        </w:tc>
+        <w:tc>
+          <w:tcPr>
+            <w:tcW w:type="dxa" w:w="1080"/>
+            <w:shd w:val="clear" w:color="auto" w:fill="F2F6FC"/>
+          </w:tcPr>
+          <w:p>
+            <w:r/>
+            <w:r>
+              <w:rPr>
+                <w:sz w:val="18"/>
+              </w:rPr>
+              <w:t>-</w:t>
+            </w:r>
+          </w:p>
+        </w:tc>
+        <w:tc>
+          <w:tcPr>
+            <w:tcW w:type="dxa" w:w="1080"/>
+            <w:shd w:val="clear" w:color="auto" w:fill="F2F6FC"/>
+          </w:tcPr>
+          <w:p>
+            <w:r/>
+            <w:r>
+              <w:rPr>
+                <w:sz w:val="18"/>
+              </w:rPr>
+              <w:t>v9</w:t>
+            </w:r>
+          </w:p>
+        </w:tc>
+        <w:tc>
+          <w:tcPr>
+            <w:tcW w:type="dxa" w:w="1080"/>
+            <w:shd w:val="clear" w:color="auto" w:fill="F2F6FC"/>
+          </w:tcPr>
+          <w:p>
+            <w:r/>
+            <w:r>
+              <w:rPr>
+                <w:sz w:val="18"/>
+              </w:rPr>
+              <w:t>Aug 13</w:t>
+            </w:r>
+          </w:p>
+        </w:tc>
+      </w:tr>
     </w:tbl>
     <w:p/>
     <w:tbl>
@@ -13560,6 +13682,68 @@
                 <w:sz w:val="18"/>
               </w:rPr>
               <w:t>63.0%</w:t>
+            </w:r>
+          </w:p>
+        </w:tc>
+      </w:tr>
+      <w:tr>
+        <w:tc>
+          <w:tcPr>
+            <w:tcW w:type="dxa" w:w="2160"/>
+            <w:shd w:val="clear" w:color="auto" w:fill="F2F6FC"/>
+          </w:tcPr>
+          <w:p>
+            <w:r/>
+            <w:r>
+              <w:rPr>
+                <w:sz w:val="18"/>
+              </w:rPr>
+              <w:t>v10</w:t>
+            </w:r>
+          </w:p>
+        </w:tc>
+        <w:tc>
+          <w:tcPr>
+            <w:tcW w:type="dxa" w:w="2160"/>
+            <w:shd w:val="clear" w:color="auto" w:fill="F2F6FC"/>
+          </w:tcPr>
+          <w:p>
+            <w:r/>
+            <w:r>
+              <w:rPr>
+                <w:sz w:val="18"/>
+              </w:rPr>
+              <w:t>AKT-002 deteksi nama_kegiatan v2 (0 LLM)</w:t>
+            </w:r>
+          </w:p>
+        </w:tc>
+        <w:tc>
+          <w:tcPr>
+            <w:tcW w:type="dxa" w:w="2160"/>
+            <w:shd w:val="clear" w:color="auto" w:fill="F2F6FC"/>
+          </w:tcPr>
+          <w:p>
+            <w:r/>
+            <w:r>
+              <w:rPr>
+                <w:sz w:val="18"/>
+              </w:rPr>
+              <w:t>81.1%</w:t>
+            </w:r>
+          </w:p>
+        </w:tc>
+        <w:tc>
+          <w:tcPr>
+            <w:tcW w:type="dxa" w:w="2160"/>
+            <w:shd w:val="clear" w:color="auto" w:fill="F2F6FC"/>
+          </w:tcPr>
+          <w:p>
+            <w:r/>
+            <w:r>
+              <w:rPr>
+                <w:sz w:val="18"/>
+              </w:rPr>
+              <w:t>68.8%</w:t>
             </w:r>
           </w:p>
         </w:tc>

</xml_diff>

<commit_message>
feat(ocr): OCR-007 LFM2.5-VL-3B VLM probe GATE PASS (nomor no-regress, organizer 0->20%, 0 LLM)
</commit_message>
<xml_diff>
--- a/docs/report/benchmark_methods.docx
+++ b/docs/report/benchmark_methods.docx
@@ -11634,7 +11634,7 @@
               <w:rPr>
                 <w:sz w:val="18"/>
               </w:rPr>
-              <w:t>HYB-001 hybrid OCR per-field (DocTR dates+organizer / baseline nomor)</w:t>
+              <w:t>OCR-007 LFM2.5-VL-3B probe (VLM OCR, GGUF Q4_0 + mmproj Q8_0, 10 scan)</w:t>
             </w:r>
           </w:p>
         </w:tc>
@@ -11664,7 +11664,7 @@
               <w:rPr>
                 <w:sz w:val="18"/>
               </w:rPr>
-              <w:t>46.8%</w:t>
+              <w:t>44.4%</w:t>
             </w:r>
           </w:p>
         </w:tc>
@@ -11739,7 +11739,7 @@
               <w:rPr>
                 <w:sz w:val="18"/>
               </w:rPr>
-              <w:t>Aug 6</w:t>
+              <w:t>Aug 13</w:t>
             </w:r>
           </w:p>
         </w:tc>
@@ -11755,7 +11755,7 @@
               <w:rPr>
                 <w:sz w:val="18"/>
               </w:rPr>
-              <w:t>NC-002 region-OCR murah (rapid / tess psm tunggal) utk 2-pass nomor</w:t>
+              <w:t>HYB-001 hybrid OCR per-field (DocTR dates+organizer / baseline nomor)</w:t>
             </w:r>
           </w:p>
         </w:tc>
@@ -11783,7 +11783,7 @@
               <w:rPr>
                 <w:sz w:val="18"/>
               </w:rPr>
-              <w:t>47.3%</w:t>
+              <w:t>46.8%</w:t>
             </w:r>
           </w:p>
         </w:tc>
@@ -11870,7 +11870,7 @@
               <w:rPr>
                 <w:sz w:val="18"/>
               </w:rPr>
-              <w:t>F1 organizer v3 + R6 (0 LLM)</w:t>
+              <w:t>NC-002 region-OCR murah (rapid / tess psm tunggal) utk 2-pass nomor</w:t>
             </w:r>
           </w:p>
         </w:tc>
@@ -11885,7 +11885,7 @@
               <w:rPr>
                 <w:sz w:val="18"/>
               </w:rPr>
-              <w:t>81.1%</w:t>
+              <w:t>n/a</w:t>
             </w:r>
           </w:p>
         </w:tc>
@@ -11900,7 +11900,7 @@
               <w:rPr>
                 <w:sz w:val="18"/>
               </w:rPr>
-              <w:t>61.2%</w:t>
+              <w:t>47.3%</w:t>
             </w:r>
           </w:p>
         </w:tc>
@@ -11975,7 +11975,7 @@
               <w:rPr>
                 <w:sz w:val="18"/>
               </w:rPr>
-              <w:t>Aug 10</w:t>
+              <w:t>Aug 6</w:t>
             </w:r>
           </w:p>
         </w:tc>
@@ -11991,7 +11991,7 @@
               <w:rPr>
                 <w:sz w:val="18"/>
               </w:rPr>
-              <w:t>F1 normalisasi organizer &amp; nomor (0 LLM)</w:t>
+              <w:t>F1 organizer v3 + R6 (0 LLM)</w:t>
             </w:r>
           </w:p>
         </w:tc>
@@ -12019,7 +12019,7 @@
               <w:rPr>
                 <w:sz w:val="18"/>
               </w:rPr>
-              <w:t>58.3%</w:t>
+              <w:t>61.2%</w:t>
             </w:r>
           </w:p>
         </w:tc>
@@ -12106,7 +12106,7 @@
               <w:rPr>
                 <w:sz w:val="18"/>
               </w:rPr>
-              <w:t>ORG-004 canonicalisasi format (0 LLM)</w:t>
+              <w:t>F1 normalisasi organizer &amp; nomor (0 LLM)</w:t>
             </w:r>
           </w:p>
         </w:tc>
@@ -12136,7 +12136,7 @@
               <w:rPr>
                 <w:sz w:val="18"/>
               </w:rPr>
-              <w:t>63.5%</w:t>
+              <w:t>58.3%</w:t>
             </w:r>
           </w:p>
         </w:tc>
@@ -12211,7 +12211,7 @@
               <w:rPr>
                 <w:sz w:val="18"/>
               </w:rPr>
-              <w:t>Aug 13</w:t>
+              <w:t>Aug 10</w:t>
             </w:r>
           </w:p>
         </w:tc>
@@ -12227,7 +12227,7 @@
               <w:rPr>
                 <w:sz w:val="18"/>
               </w:rPr>
-              <w:t>PROD-002 port produksi organizer v3+R3+R6+format + nomor (flag-gated)</w:t>
+              <w:t>ORG-004 canonicalisasi format (0 LLM)</w:t>
             </w:r>
           </w:p>
         </w:tc>
@@ -12255,7 +12255,7 @@
               <w:rPr>
                 <w:sz w:val="18"/>
               </w:rPr>
-              <w:t>63.0%</w:t>
+              <w:t>63.5%</w:t>
             </w:r>
           </w:p>
         </w:tc>
@@ -12342,7 +12342,7 @@
               <w:rPr>
                 <w:sz w:val="18"/>
               </w:rPr>
-              <w:t>AKT-002 deteksi nama_kegiatan v2 (0 LLM)</w:t>
+              <w:t>PROD-002 port produksi organizer v3+R3+R6+format + nomor (flag-gated)</w:t>
             </w:r>
           </w:p>
         </w:tc>
@@ -12372,7 +12372,7 @@
               <w:rPr>
                 <w:sz w:val="18"/>
               </w:rPr>
-              <w:t>68.8%</w:t>
+              <w:t>63.0%</w:t>
             </w:r>
           </w:p>
         </w:tc>
@@ -12440,6 +12440,120 @@
           <w:tcPr>
             <w:tcW w:type="dxa" w:w="1080"/>
             <w:shd w:val="clear" w:color="auto" w:fill="F2F6FC"/>
+          </w:tcPr>
+          <w:p>
+            <w:r/>
+            <w:r>
+              <w:rPr>
+                <w:sz w:val="18"/>
+              </w:rPr>
+              <w:t>Aug 13</w:t>
+            </w:r>
+          </w:p>
+        </w:tc>
+      </w:tr>
+      <w:tr>
+        <w:tc>
+          <w:tcPr>
+            <w:tcW w:type="dxa" w:w="1080"/>
+          </w:tcPr>
+          <w:p>
+            <w:r/>
+            <w:r>
+              <w:rPr>
+                <w:sz w:val="18"/>
+              </w:rPr>
+              <w:t>AKT-002 deteksi nama_kegiatan v2 (0 LLM)</w:t>
+            </w:r>
+          </w:p>
+        </w:tc>
+        <w:tc>
+          <w:tcPr>
+            <w:tcW w:type="dxa" w:w="1080"/>
+          </w:tcPr>
+          <w:p>
+            <w:r/>
+            <w:r>
+              <w:rPr>
+                <w:sz w:val="18"/>
+              </w:rPr>
+              <w:t>81.1%</w:t>
+            </w:r>
+          </w:p>
+        </w:tc>
+        <w:tc>
+          <w:tcPr>
+            <w:tcW w:type="dxa" w:w="1080"/>
+          </w:tcPr>
+          <w:p>
+            <w:r/>
+            <w:r>
+              <w:rPr>
+                <w:sz w:val="18"/>
+              </w:rPr>
+              <w:t>68.8%</w:t>
+            </w:r>
+          </w:p>
+        </w:tc>
+        <w:tc>
+          <w:tcPr>
+            <w:tcW w:type="dxa" w:w="1080"/>
+          </w:tcPr>
+          <w:p>
+            <w:r/>
+            <w:r>
+              <w:rPr>
+                <w:sz w:val="18"/>
+              </w:rPr>
+              <w:t>0</w:t>
+            </w:r>
+          </w:p>
+        </w:tc>
+        <w:tc>
+          <w:tcPr>
+            <w:tcW w:type="dxa" w:w="1080"/>
+          </w:tcPr>
+          <w:p>
+            <w:r/>
+            <w:r>
+              <w:rPr>
+                <w:sz w:val="18"/>
+              </w:rPr>
+              <w:t>0</w:t>
+            </w:r>
+          </w:p>
+        </w:tc>
+        <w:tc>
+          <w:tcPr>
+            <w:tcW w:type="dxa" w:w="1080"/>
+          </w:tcPr>
+          <w:p>
+            <w:r/>
+            <w:r>
+              <w:rPr>
+                <w:sz w:val="18"/>
+              </w:rPr>
+              <w:t>-</w:t>
+            </w:r>
+          </w:p>
+        </w:tc>
+        <w:tc>
+          <w:tcPr>
+            <w:tcW w:type="dxa" w:w="1080"/>
+          </w:tcPr>
+          <w:p>
+            <w:r/>
+            <w:r>
+              <w:rPr>
+                <w:sz w:val="18"/>
+              </w:rPr>
+              <w:t>v9</w:t>
+            </w:r>
+          </w:p>
+        </w:tc>
+        <w:tc>
+          <w:tcPr>
+            <w:tcW w:type="dxa" w:w="1080"/>
           </w:tcPr>
           <w:p>
             <w:r/>
@@ -13353,7 +13467,7 @@
               <w:rPr>
                 <w:sz w:val="18"/>
               </w:rPr>
-              <w:t>HYB-001 hybrid OCR per-field (DocTR dates+organizer / baseline nomor)</w:t>
+              <w:t>OCR-007 LFM2.5-VL-3B probe (VLM OCR, GGUF Q4_0 + mmproj Q8_0, 10 scan)</w:t>
             </w:r>
           </w:p>
         </w:tc>
@@ -13383,7 +13497,7 @@
               <w:rPr>
                 <w:sz w:val="18"/>
               </w:rPr>
-              <w:t>46.8%</w:t>
+              <w:t>44.4%</w:t>
             </w:r>
           </w:p>
         </w:tc>
@@ -13413,7 +13527,7 @@
               <w:rPr>
                 <w:sz w:val="18"/>
               </w:rPr>
-              <w:t>NC-002 region-OCR murah (rapid / tess psm tunggal) utk 2-pass nomor</w:t>
+              <w:t>HYB-001 hybrid OCR per-field (DocTR dates+organizer / baseline nomor)</w:t>
             </w:r>
           </w:p>
         </w:tc>
@@ -13441,7 +13555,7 @@
               <w:rPr>
                 <w:sz w:val="18"/>
               </w:rPr>
-              <w:t>47.3%</w:t>
+              <w:t>46.8%</w:t>
             </w:r>
           </w:p>
         </w:tc>
@@ -13458,7 +13572,7 @@
               <w:rPr>
                 <w:sz w:val="18"/>
               </w:rPr>
-              <w:t>v10</w:t>
+              <w:t>ocr</w:t>
             </w:r>
           </w:p>
         </w:tc>
@@ -13473,7 +13587,7 @@
               <w:rPr>
                 <w:sz w:val="18"/>
               </w:rPr>
-              <w:t>F1 organizer v3 + R6 (0 LLM)</w:t>
+              <w:t>NC-002 region-OCR murah (rapid / tess psm tunggal) utk 2-pass nomor</w:t>
             </w:r>
           </w:p>
         </w:tc>
@@ -13488,7 +13602,7 @@
               <w:rPr>
                 <w:sz w:val="18"/>
               </w:rPr>
-              <w:t>81.1%</w:t>
+              <w:t>n/a</w:t>
             </w:r>
           </w:p>
         </w:tc>
@@ -13503,7 +13617,7 @@
               <w:rPr>
                 <w:sz w:val="18"/>
               </w:rPr>
-              <w:t>61.2%</w:t>
+              <w:t>47.3%</w:t>
             </w:r>
           </w:p>
         </w:tc>
@@ -13533,7 +13647,7 @@
               <w:rPr>
                 <w:sz w:val="18"/>
               </w:rPr>
-              <w:t>F1 normalisasi organizer &amp; nomor (0 LLM)</w:t>
+              <w:t>F1 organizer v3 + R6 (0 LLM)</w:t>
             </w:r>
           </w:p>
         </w:tc>
@@ -13561,7 +13675,7 @@
               <w:rPr>
                 <w:sz w:val="18"/>
               </w:rPr>
-              <w:t>58.3%</w:t>
+              <w:t>61.2%</w:t>
             </w:r>
           </w:p>
         </w:tc>
@@ -13593,7 +13707,7 @@
               <w:rPr>
                 <w:sz w:val="18"/>
               </w:rPr>
-              <w:t>ORG-004 canonicalisasi format (0 LLM)</w:t>
+              <w:t>F1 normalisasi organizer &amp; nomor (0 LLM)</w:t>
             </w:r>
           </w:p>
         </w:tc>
@@ -13623,7 +13737,7 @@
               <w:rPr>
                 <w:sz w:val="18"/>
               </w:rPr>
-              <w:t>63.5%</w:t>
+              <w:t>58.3%</w:t>
             </w:r>
           </w:p>
         </w:tc>
@@ -13653,7 +13767,7 @@
               <w:rPr>
                 <w:sz w:val="18"/>
               </w:rPr>
-              <w:t>PROD-002 port produksi organizer v3+R3+R6+format + nomor (flag-gated)</w:t>
+              <w:t>ORG-004 canonicalisasi format (0 LLM)</w:t>
             </w:r>
           </w:p>
         </w:tc>
@@ -13681,7 +13795,7 @@
               <w:rPr>
                 <w:sz w:val="18"/>
               </w:rPr>
-              <w:t>63.0%</w:t>
+              <w:t>63.5%</w:t>
             </w:r>
           </w:p>
         </w:tc>
@@ -13713,7 +13827,7 @@
               <w:rPr>
                 <w:sz w:val="18"/>
               </w:rPr>
-              <w:t>AKT-002 deteksi nama_kegiatan v2 (0 LLM)</w:t>
+              <w:t>PROD-002 port produksi organizer v3+R3+R6+format + nomor (flag-gated)</w:t>
             </w:r>
           </w:p>
         </w:tc>
@@ -13736,6 +13850,64 @@
           <w:tcPr>
             <w:tcW w:type="dxa" w:w="2160"/>
             <w:shd w:val="clear" w:color="auto" w:fill="F2F6FC"/>
+          </w:tcPr>
+          <w:p>
+            <w:r/>
+            <w:r>
+              <w:rPr>
+                <w:sz w:val="18"/>
+              </w:rPr>
+              <w:t>63.0%</w:t>
+            </w:r>
+          </w:p>
+        </w:tc>
+      </w:tr>
+      <w:tr>
+        <w:tc>
+          <w:tcPr>
+            <w:tcW w:type="dxa" w:w="2160"/>
+          </w:tcPr>
+          <w:p>
+            <w:r/>
+            <w:r>
+              <w:rPr>
+                <w:sz w:val="18"/>
+              </w:rPr>
+              <w:t>v10</w:t>
+            </w:r>
+          </w:p>
+        </w:tc>
+        <w:tc>
+          <w:tcPr>
+            <w:tcW w:type="dxa" w:w="2160"/>
+          </w:tcPr>
+          <w:p>
+            <w:r/>
+            <w:r>
+              <w:rPr>
+                <w:sz w:val="18"/>
+              </w:rPr>
+              <w:t>AKT-002 deteksi nama_kegiatan v2 (0 LLM)</w:t>
+            </w:r>
+          </w:p>
+        </w:tc>
+        <w:tc>
+          <w:tcPr>
+            <w:tcW w:type="dxa" w:w="2160"/>
+          </w:tcPr>
+          <w:p>
+            <w:r/>
+            <w:r>
+              <w:rPr>
+                <w:sz w:val="18"/>
+              </w:rPr>
+              <w:t>81.1%</w:t>
+            </w:r>
+          </w:p>
+        </w:tc>
+        <w:tc>
+          <w:tcPr>
+            <w:tcW w:type="dxa" w:w="2160"/>
           </w:tcPr>
           <w:p>
             <w:r/>

</xml_diff>

<commit_message>
feat(akt): AKT-003 deteksi nama_kegiatan v3 GATE PASS (+13.5pt, 0 LLM)
- grup A 'Sebagai [:] Peserta X' (7 fix: Public Health x2, Airlangga Job
  Preparation, Magang UKM x3, KIM); prefix Sebagai WAJIB (anti header/role),
  stop bare Dalam|Pada, newline-boundary stop, negative lookahead
  Talkshow|campaign
- grup B 'Sebagai Peserta "X"' kutip (ORM exact, ACIC fuzzy)
- grup C repair atthe/in the/AT THE/organizedby + digit-merge
  (Track2oleh, 2026yang, 7.0with) -> Hology, Poisson exact; FIT partial
- hasil (GT v9 + matcher v2): nama_kegiatan exact 36.5->51.4% (27->38/74,
  +44.6pt kumulatif vs produksi), MACRO 68.8->71.6%, 0 regress, 0 LLM
- QA: sloppiness changed non-exact 5 wajar (ACIC, 2954571, ACW GT v10,
  hakim OCR, FIT all-caps); OOD noise drop ekstra 10% +4.1 / 25% +9.5pt
- report_data akt_003_detection + runs_summary + handoff v33 + ledger
</commit_message>
<xml_diff>
--- a/docs/report/benchmark_methods.docx
+++ b/docs/report/benchmark_methods.docx
@@ -12566,6 +12566,128 @@
           </w:p>
         </w:tc>
       </w:tr>
+      <w:tr>
+        <w:tc>
+          <w:tcPr>
+            <w:tcW w:type="dxa" w:w="1080"/>
+            <w:shd w:val="clear" w:color="auto" w:fill="F2F6FC"/>
+          </w:tcPr>
+          <w:p>
+            <w:r/>
+            <w:r>
+              <w:rPr>
+                <w:sz w:val="18"/>
+              </w:rPr>
+              <w:t>AKT-003 deteksi nama_kegiatan v3: Sebagai Peserta + atthe/inthe (0 LLM)</w:t>
+            </w:r>
+          </w:p>
+        </w:tc>
+        <w:tc>
+          <w:tcPr>
+            <w:tcW w:type="dxa" w:w="1080"/>
+            <w:shd w:val="clear" w:color="auto" w:fill="F2F6FC"/>
+          </w:tcPr>
+          <w:p>
+            <w:r/>
+            <w:r>
+              <w:rPr>
+                <w:sz w:val="18"/>
+              </w:rPr>
+              <w:t>81.1%</w:t>
+            </w:r>
+          </w:p>
+        </w:tc>
+        <w:tc>
+          <w:tcPr>
+            <w:tcW w:type="dxa" w:w="1080"/>
+            <w:shd w:val="clear" w:color="auto" w:fill="F2F6FC"/>
+          </w:tcPr>
+          <w:p>
+            <w:r/>
+            <w:r>
+              <w:rPr>
+                <w:sz w:val="18"/>
+              </w:rPr>
+              <w:t>71.6%</w:t>
+            </w:r>
+          </w:p>
+        </w:tc>
+        <w:tc>
+          <w:tcPr>
+            <w:tcW w:type="dxa" w:w="1080"/>
+            <w:shd w:val="clear" w:color="auto" w:fill="F2F6FC"/>
+          </w:tcPr>
+          <w:p>
+            <w:r/>
+            <w:r>
+              <w:rPr>
+                <w:sz w:val="18"/>
+              </w:rPr>
+              <w:t>0</w:t>
+            </w:r>
+          </w:p>
+        </w:tc>
+        <w:tc>
+          <w:tcPr>
+            <w:tcW w:type="dxa" w:w="1080"/>
+            <w:shd w:val="clear" w:color="auto" w:fill="F2F6FC"/>
+          </w:tcPr>
+          <w:p>
+            <w:r/>
+            <w:r>
+              <w:rPr>
+                <w:sz w:val="18"/>
+              </w:rPr>
+              <w:t>0</w:t>
+            </w:r>
+          </w:p>
+        </w:tc>
+        <w:tc>
+          <w:tcPr>
+            <w:tcW w:type="dxa" w:w="1080"/>
+            <w:shd w:val="clear" w:color="auto" w:fill="F2F6FC"/>
+          </w:tcPr>
+          <w:p>
+            <w:r/>
+            <w:r>
+              <w:rPr>
+                <w:sz w:val="18"/>
+              </w:rPr>
+              <w:t>-</w:t>
+            </w:r>
+          </w:p>
+        </w:tc>
+        <w:tc>
+          <w:tcPr>
+            <w:tcW w:type="dxa" w:w="1080"/>
+            <w:shd w:val="clear" w:color="auto" w:fill="F2F6FC"/>
+          </w:tcPr>
+          <w:p>
+            <w:r/>
+            <w:r>
+              <w:rPr>
+                <w:sz w:val="18"/>
+              </w:rPr>
+              <w:t>v9</w:t>
+            </w:r>
+          </w:p>
+        </w:tc>
+        <w:tc>
+          <w:tcPr>
+            <w:tcW w:type="dxa" w:w="1080"/>
+            <w:shd w:val="clear" w:color="auto" w:fill="F2F6FC"/>
+          </w:tcPr>
+          <w:p>
+            <w:r/>
+            <w:r>
+              <w:rPr>
+                <w:sz w:val="18"/>
+              </w:rPr>
+              <w:t>Aug 13</w:t>
+            </w:r>
+          </w:p>
+        </w:tc>
+      </w:tr>
     </w:tbl>
     <w:p/>
     <w:tbl>
@@ -13916,6 +14038,68 @@
                 <w:sz w:val="18"/>
               </w:rPr>
               <w:t>68.8%</w:t>
+            </w:r>
+          </w:p>
+        </w:tc>
+      </w:tr>
+      <w:tr>
+        <w:tc>
+          <w:tcPr>
+            <w:tcW w:type="dxa" w:w="2160"/>
+            <w:shd w:val="clear" w:color="auto" w:fill="F2F6FC"/>
+          </w:tcPr>
+          <w:p>
+            <w:r/>
+            <w:r>
+              <w:rPr>
+                <w:sz w:val="18"/>
+              </w:rPr>
+              <w:t>v10</w:t>
+            </w:r>
+          </w:p>
+        </w:tc>
+        <w:tc>
+          <w:tcPr>
+            <w:tcW w:type="dxa" w:w="2160"/>
+            <w:shd w:val="clear" w:color="auto" w:fill="F2F6FC"/>
+          </w:tcPr>
+          <w:p>
+            <w:r/>
+            <w:r>
+              <w:rPr>
+                <w:sz w:val="18"/>
+              </w:rPr>
+              <w:t>AKT-003 deteksi nama_kegiatan v3: Sebagai Peserta + atthe/inthe (0 LLM)</w:t>
+            </w:r>
+          </w:p>
+        </w:tc>
+        <w:tc>
+          <w:tcPr>
+            <w:tcW w:type="dxa" w:w="2160"/>
+            <w:shd w:val="clear" w:color="auto" w:fill="F2F6FC"/>
+          </w:tcPr>
+          <w:p>
+            <w:r/>
+            <w:r>
+              <w:rPr>
+                <w:sz w:val="18"/>
+              </w:rPr>
+              <w:t>81.1%</w:t>
+            </w:r>
+          </w:p>
+        </w:tc>
+        <w:tc>
+          <w:tcPr>
+            <w:tcW w:type="dxa" w:w="2160"/>
+            <w:shd w:val="clear" w:color="auto" w:fill="F2F6FC"/>
+          </w:tcPr>
+          <w:p>
+            <w:r/>
+            <w:r>
+              <w:rPr>
+                <w:sz w:val="18"/>
+              </w:rPr>
+              <w:t>71.6%</w:t>
             </w:r>
           </w:p>
         </w:tc>

</xml_diff>

<commit_message>
feat(akt): AKT-004 deteksi nama_kegiatan v4 GATE PASS (+2 exact, gate scope-kecil)
- anchor: 'dalam Event X' (Girifest, repair OCR-alias NisC pasca
  camel-split), 'lomba tingkat Nasional "X"' (SDC Uniska = WRONG:
  cert Statistic vs GT Statistics -> kandidat GT v10), 'seminar on "X"'
  (2954283 exact)
- gate >=+2 exact (scope sengaja kecil 2-3 cert, keputusan user handoff v33)
- hasil (GT v9 + matcher v2): nama_kegiatan exact 51.4->54.1% (38->40/74),
  MACRO 71.6->72.1%, 35 fix / 0 regress, 0 LLM
- QA: changed non-exact 1 wajar; OOD drop ekstra 10% +4.1 / 25% +9.5pt
  (tidak naik vs AKT-003)
- report_data akt_004_detection + runs_summary + handoff v34 + ledger
</commit_message>
<xml_diff>
--- a/docs/report/benchmark_methods.docx
+++ b/docs/report/benchmark_methods.docx
@@ -12688,6 +12688,120 @@
           </w:p>
         </w:tc>
       </w:tr>
+      <w:tr>
+        <w:tc>
+          <w:tcPr>
+            <w:tcW w:type="dxa" w:w="1080"/>
+          </w:tcPr>
+          <w:p>
+            <w:r/>
+            <w:r>
+              <w:rPr>
+                <w:sz w:val="18"/>
+              </w:rPr>
+              <w:t>AKT-004 deteksi nama_kegiatan v4: Event/lomba/seminar on (0 LLM, gate scope-kecil)</w:t>
+            </w:r>
+          </w:p>
+        </w:tc>
+        <w:tc>
+          <w:tcPr>
+            <w:tcW w:type="dxa" w:w="1080"/>
+          </w:tcPr>
+          <w:p>
+            <w:r/>
+            <w:r>
+              <w:rPr>
+                <w:sz w:val="18"/>
+              </w:rPr>
+              <w:t>81.1%</w:t>
+            </w:r>
+          </w:p>
+        </w:tc>
+        <w:tc>
+          <w:tcPr>
+            <w:tcW w:type="dxa" w:w="1080"/>
+          </w:tcPr>
+          <w:p>
+            <w:r/>
+            <w:r>
+              <w:rPr>
+                <w:sz w:val="18"/>
+              </w:rPr>
+              <w:t>72.1%</w:t>
+            </w:r>
+          </w:p>
+        </w:tc>
+        <w:tc>
+          <w:tcPr>
+            <w:tcW w:type="dxa" w:w="1080"/>
+          </w:tcPr>
+          <w:p>
+            <w:r/>
+            <w:r>
+              <w:rPr>
+                <w:sz w:val="18"/>
+              </w:rPr>
+              <w:t>0</w:t>
+            </w:r>
+          </w:p>
+        </w:tc>
+        <w:tc>
+          <w:tcPr>
+            <w:tcW w:type="dxa" w:w="1080"/>
+          </w:tcPr>
+          <w:p>
+            <w:r/>
+            <w:r>
+              <w:rPr>
+                <w:sz w:val="18"/>
+              </w:rPr>
+              <w:t>0</w:t>
+            </w:r>
+          </w:p>
+        </w:tc>
+        <w:tc>
+          <w:tcPr>
+            <w:tcW w:type="dxa" w:w="1080"/>
+          </w:tcPr>
+          <w:p>
+            <w:r/>
+            <w:r>
+              <w:rPr>
+                <w:sz w:val="18"/>
+              </w:rPr>
+              <w:t>-</w:t>
+            </w:r>
+          </w:p>
+        </w:tc>
+        <w:tc>
+          <w:tcPr>
+            <w:tcW w:type="dxa" w:w="1080"/>
+          </w:tcPr>
+          <w:p>
+            <w:r/>
+            <w:r>
+              <w:rPr>
+                <w:sz w:val="18"/>
+              </w:rPr>
+              <w:t>v9</w:t>
+            </w:r>
+          </w:p>
+        </w:tc>
+        <w:tc>
+          <w:tcPr>
+            <w:tcW w:type="dxa" w:w="1080"/>
+          </w:tcPr>
+          <w:p>
+            <w:r/>
+            <w:r>
+              <w:rPr>
+                <w:sz w:val="18"/>
+              </w:rPr>
+              <w:t>Aug 14</w:t>
+            </w:r>
+          </w:p>
+        </w:tc>
+      </w:tr>
     </w:tbl>
     <w:p/>
     <w:tbl>
@@ -14100,6 +14214,64 @@
                 <w:sz w:val="18"/>
               </w:rPr>
               <w:t>71.6%</w:t>
+            </w:r>
+          </w:p>
+        </w:tc>
+      </w:tr>
+      <w:tr>
+        <w:tc>
+          <w:tcPr>
+            <w:tcW w:type="dxa" w:w="2160"/>
+          </w:tcPr>
+          <w:p>
+            <w:r/>
+            <w:r>
+              <w:rPr>
+                <w:sz w:val="18"/>
+              </w:rPr>
+              <w:t>v10</w:t>
+            </w:r>
+          </w:p>
+        </w:tc>
+        <w:tc>
+          <w:tcPr>
+            <w:tcW w:type="dxa" w:w="2160"/>
+          </w:tcPr>
+          <w:p>
+            <w:r/>
+            <w:r>
+              <w:rPr>
+                <w:sz w:val="18"/>
+              </w:rPr>
+              <w:t>AKT-004 deteksi nama_kegiatan v4: Event/lomba/seminar on (0 LLM, gate scope-kecil)</w:t>
+            </w:r>
+          </w:p>
+        </w:tc>
+        <w:tc>
+          <w:tcPr>
+            <w:tcW w:type="dxa" w:w="2160"/>
+          </w:tcPr>
+          <w:p>
+            <w:r/>
+            <w:r>
+              <w:rPr>
+                <w:sz w:val="18"/>
+              </w:rPr>
+              <w:t>81.1%</w:t>
+            </w:r>
+          </w:p>
+        </w:tc>
+        <w:tc>
+          <w:tcPr>
+            <w:tcW w:type="dxa" w:w="2160"/>
+          </w:tcPr>
+          <w:p>
+            <w:r/>
+            <w:r>
+              <w:rPr>
+                <w:sz w:val="18"/>
+              </w:rPr>
+              <w:t>72.1%</w:t>
             </w:r>
           </w:p>
         </w:tc>

</xml_diff>

<commit_message>
feat(akt): AKT-005 deteksi nama_kegiatan v5 GATE PASS (+6 exact) — rangkaian AKT selesai
- grup D all-caps/spacing: collapse run huruf-berjarak >=3 (SDC Unisba),
  split keyword all-caps (synreaach, Gelar Rasa, ACIC), UXDESIGN +
  (?i)competition + (?i)dengan pre-camel (2954685), join2 anchor
  kutip+sisa [ACIC] span newline, sentinel \n sebelum Himpunan digit-bound
- hasil (GT v9 + matcher v2, no-regress vs baseline DAN vs AKT-004):
  nama_kegiatan exact 54.1->62.2% (40->46/74), MACRO 72.1->73.7%,
  41 fix / 0 regress, 0 LLM
- 2 regress vs AKT-004 tertangkap saat iterasi (competition lowercase
  membunuh camel-boundary -> post-repair re-split)
- OOD: drop ekstra 10% +4.1 / 25% +13.5pt (grup D paling noise-fragile)
- BINARY SKIP (OCR 2o23 vs GT 3.0 -> GT v10); TIDAK di-port produksi
  (keputusan user)
- report_data akt_005_detection + runs_summary + handoff v35 + ledger
</commit_message>
<xml_diff>
--- a/docs/report/benchmark_methods.docx
+++ b/docs/report/benchmark_methods.docx
@@ -12802,6 +12802,128 @@
           </w:p>
         </w:tc>
       </w:tr>
+      <w:tr>
+        <w:tc>
+          <w:tcPr>
+            <w:tcW w:type="dxa" w:w="1080"/>
+            <w:shd w:val="clear" w:color="auto" w:fill="F2F6FC"/>
+          </w:tcPr>
+          <w:p>
+            <w:r/>
+            <w:r>
+              <w:rPr>
+                <w:sz w:val="18"/>
+              </w:rPr>
+              <w:t>AKT-005 deteksi nama_kegiatan v5: grup D all-caps/spacing (0 LLM)</w:t>
+            </w:r>
+          </w:p>
+        </w:tc>
+        <w:tc>
+          <w:tcPr>
+            <w:tcW w:type="dxa" w:w="1080"/>
+            <w:shd w:val="clear" w:color="auto" w:fill="F2F6FC"/>
+          </w:tcPr>
+          <w:p>
+            <w:r/>
+            <w:r>
+              <w:rPr>
+                <w:sz w:val="18"/>
+              </w:rPr>
+              <w:t>81.1%</w:t>
+            </w:r>
+          </w:p>
+        </w:tc>
+        <w:tc>
+          <w:tcPr>
+            <w:tcW w:type="dxa" w:w="1080"/>
+            <w:shd w:val="clear" w:color="auto" w:fill="F2F6FC"/>
+          </w:tcPr>
+          <w:p>
+            <w:r/>
+            <w:r>
+              <w:rPr>
+                <w:sz w:val="18"/>
+              </w:rPr>
+              <w:t>73.7%</w:t>
+            </w:r>
+          </w:p>
+        </w:tc>
+        <w:tc>
+          <w:tcPr>
+            <w:tcW w:type="dxa" w:w="1080"/>
+            <w:shd w:val="clear" w:color="auto" w:fill="F2F6FC"/>
+          </w:tcPr>
+          <w:p>
+            <w:r/>
+            <w:r>
+              <w:rPr>
+                <w:sz w:val="18"/>
+              </w:rPr>
+              <w:t>0</w:t>
+            </w:r>
+          </w:p>
+        </w:tc>
+        <w:tc>
+          <w:tcPr>
+            <w:tcW w:type="dxa" w:w="1080"/>
+            <w:shd w:val="clear" w:color="auto" w:fill="F2F6FC"/>
+          </w:tcPr>
+          <w:p>
+            <w:r/>
+            <w:r>
+              <w:rPr>
+                <w:sz w:val="18"/>
+              </w:rPr>
+              <w:t>0</w:t>
+            </w:r>
+          </w:p>
+        </w:tc>
+        <w:tc>
+          <w:tcPr>
+            <w:tcW w:type="dxa" w:w="1080"/>
+            <w:shd w:val="clear" w:color="auto" w:fill="F2F6FC"/>
+          </w:tcPr>
+          <w:p>
+            <w:r/>
+            <w:r>
+              <w:rPr>
+                <w:sz w:val="18"/>
+              </w:rPr>
+              <w:t>-</w:t>
+            </w:r>
+          </w:p>
+        </w:tc>
+        <w:tc>
+          <w:tcPr>
+            <w:tcW w:type="dxa" w:w="1080"/>
+            <w:shd w:val="clear" w:color="auto" w:fill="F2F6FC"/>
+          </w:tcPr>
+          <w:p>
+            <w:r/>
+            <w:r>
+              <w:rPr>
+                <w:sz w:val="18"/>
+              </w:rPr>
+              <w:t>v9</w:t>
+            </w:r>
+          </w:p>
+        </w:tc>
+        <w:tc>
+          <w:tcPr>
+            <w:tcW w:type="dxa" w:w="1080"/>
+            <w:shd w:val="clear" w:color="auto" w:fill="F2F6FC"/>
+          </w:tcPr>
+          <w:p>
+            <w:r/>
+            <w:r>
+              <w:rPr>
+                <w:sz w:val="18"/>
+              </w:rPr>
+              <w:t>Aug 14</w:t>
+            </w:r>
+          </w:p>
+        </w:tc>
+      </w:tr>
     </w:tbl>
     <w:p/>
     <w:tbl>
@@ -14272,6 +14394,68 @@
                 <w:sz w:val="18"/>
               </w:rPr>
               <w:t>72.1%</w:t>
+            </w:r>
+          </w:p>
+        </w:tc>
+      </w:tr>
+      <w:tr>
+        <w:tc>
+          <w:tcPr>
+            <w:tcW w:type="dxa" w:w="2160"/>
+            <w:shd w:val="clear" w:color="auto" w:fill="F2F6FC"/>
+          </w:tcPr>
+          <w:p>
+            <w:r/>
+            <w:r>
+              <w:rPr>
+                <w:sz w:val="18"/>
+              </w:rPr>
+              <w:t>v10</w:t>
+            </w:r>
+          </w:p>
+        </w:tc>
+        <w:tc>
+          <w:tcPr>
+            <w:tcW w:type="dxa" w:w="2160"/>
+            <w:shd w:val="clear" w:color="auto" w:fill="F2F6FC"/>
+          </w:tcPr>
+          <w:p>
+            <w:r/>
+            <w:r>
+              <w:rPr>
+                <w:sz w:val="18"/>
+              </w:rPr>
+              <w:t>AKT-005 deteksi nama_kegiatan v5: grup D all-caps/spacing (0 LLM)</w:t>
+            </w:r>
+          </w:p>
+        </w:tc>
+        <w:tc>
+          <w:tcPr>
+            <w:tcW w:type="dxa" w:w="2160"/>
+            <w:shd w:val="clear" w:color="auto" w:fill="F2F6FC"/>
+          </w:tcPr>
+          <w:p>
+            <w:r/>
+            <w:r>
+              <w:rPr>
+                <w:sz w:val="18"/>
+              </w:rPr>
+              <w:t>81.1%</w:t>
+            </w:r>
+          </w:p>
+        </w:tc>
+        <w:tc>
+          <w:tcPr>
+            <w:tcW w:type="dxa" w:w="2160"/>
+            <w:shd w:val="clear" w:color="auto" w:fill="F2F6FC"/>
+          </w:tcPr>
+          <w:p>
+            <w:r/>
+            <w:r>
+              <w:rPr>
+                <w:sz w:val="18"/>
+              </w:rPr>
+              <w:t>73.7%</w:t>
             </w:r>
           </w:p>
         </w:tc>

</xml_diff>

<commit_message>
docs(report): isi macro/tingkat untuk eksperimen yang "-" + clarifikasi notes
Fill values dari summary files:
- f3_001/kb_001..006: macro = pipeline tingkat accuracy (83.8-84.4%)
- router_001: tingkat = 82.4% (dari v8 f_bias baseline)
- org_005: tingkat = 81.1% (dari offline baseline)

Clarification notes ditambah untuk 8 eksperimen yang legitimately "-":
review_001, kb_004_audit, akt_001_taxonomy (analisis),
kb_prod_001 (prototipe), kb_scale_001..004 (simulasi sintetis).

regenerate: benchmark_methods + evaluation_methodology (docx+md),
phase_v4_results_summary.md.
</commit_message>
<xml_diff>
--- a/docs/report/benchmark_methods.docx
+++ b/docs/report/benchmark_methods.docx
@@ -10941,7 +10941,7 @@
               <w:rPr>
                 <w:sz w:val="18"/>
               </w:rPr>
-              <w:t>-</w:t>
+              <w:t>82.4%</w:t>
             </w:r>
           </w:p>
         </w:tc>
@@ -12608,7 +12608,7 @@
               <w:rPr>
                 <w:sz w:val="18"/>
               </w:rPr>
-              <w:t>-</w:t>
+              <w:t>84.4%</w:t>
             </w:r>
           </w:p>
         </w:tc>
@@ -13316,7 +13316,7 @@
               <w:rPr>
                 <w:sz w:val="18"/>
               </w:rPr>
-              <w:t>-</w:t>
+              <w:t>84.4%</w:t>
             </w:r>
           </w:p>
         </w:tc>
@@ -13435,7 +13435,7 @@
               <w:rPr>
                 <w:sz w:val="18"/>
               </w:rPr>
-              <w:t>-</w:t>
+              <w:t>83.8%</w:t>
             </w:r>
           </w:p>
         </w:tc>
@@ -13552,7 +13552,7 @@
               <w:rPr>
                 <w:sz w:val="18"/>
               </w:rPr>
-              <w:t>-</w:t>
+              <w:t>83.8%</w:t>
             </w:r>
           </w:p>
         </w:tc>
@@ -13788,7 +13788,7 @@
               <w:rPr>
                 <w:sz w:val="18"/>
               </w:rPr>
-              <w:t>-</w:t>
+              <w:t>83.8%</w:t>
             </w:r>
           </w:p>
         </w:tc>
@@ -13907,7 +13907,7 @@
               <w:rPr>
                 <w:sz w:val="18"/>
               </w:rPr>
-              <w:t>-</w:t>
+              <w:t>83.8%</w:t>
             </w:r>
           </w:p>
         </w:tc>
@@ -14601,7 +14601,7 @@
               <w:rPr>
                 <w:sz w:val="18"/>
               </w:rPr>
-              <w:t>-</w:t>
+              <w:t>81.1%</w:t>
             </w:r>
           </w:p>
         </w:tc>
@@ -16308,7 +16308,7 @@
               <w:rPr>
                 <w:sz w:val="18"/>
               </w:rPr>
-              <w:t>-</w:t>
+              <w:t>82.4%</w:t>
             </w:r>
           </w:p>
         </w:tc>
@@ -17167,7 +17167,7 @@
               <w:rPr>
                 <w:sz w:val="18"/>
               </w:rPr>
-              <w:t>-</w:t>
+              <w:t>84.4%</w:t>
             </w:r>
           </w:p>
         </w:tc>
@@ -17527,7 +17527,7 @@
               <w:rPr>
                 <w:sz w:val="18"/>
               </w:rPr>
-              <w:t>-</w:t>
+              <w:t>84.4%</w:t>
             </w:r>
           </w:p>
         </w:tc>
@@ -17585,7 +17585,7 @@
               <w:rPr>
                 <w:sz w:val="18"/>
               </w:rPr>
-              <w:t>-</w:t>
+              <w:t>83.8%</w:t>
             </w:r>
           </w:p>
         </w:tc>
@@ -17647,7 +17647,7 @@
               <w:rPr>
                 <w:sz w:val="18"/>
               </w:rPr>
-              <w:t>-</w:t>
+              <w:t>83.8%</w:t>
             </w:r>
           </w:p>
         </w:tc>
@@ -17767,7 +17767,7 @@
               <w:rPr>
                 <w:sz w:val="18"/>
               </w:rPr>
-              <w:t>-</w:t>
+              <w:t>83.8%</w:t>
             </w:r>
           </w:p>
         </w:tc>
@@ -17825,7 +17825,7 @@
               <w:rPr>
                 <w:sz w:val="18"/>
               </w:rPr>
-              <w:t>-</w:t>
+              <w:t>83.8%</w:t>
             </w:r>
           </w:p>
         </w:tc>
@@ -18171,7 +18171,7 @@
               <w:rPr>
                 <w:sz w:val="18"/>
               </w:rPr>
-              <w:t>-</w:t>
+              <w:t>81.1%</w:t>
             </w:r>
           </w:p>
         </w:tc>

</xml_diff>

<commit_message>
feat(hyb): HYB-COMBINED-001 gabungan terbaik pipeline — MACRO 73.7% (+10.7pp, new winner)
Eksperimen baru: gabungan semua improvements terbaik tanpa LLM.
- Tingkat: router rules (48/74 routed @100%, 81.1%)
- Nama kegiatan: AKT-005 v5 (62.2%, +55.4pt dari baseline 6.8%)
- Organizer: ORG-004 canonical format (63.5%)
- Nomor: PROD-002 normalization (76.9%)
- Tanggal: pipeline baseline (81.8%)

Hasil:
- MACRO exact: 63.0→73.7% (+10.7pp)
- MACRO fuzzy: 68.0→80.2% (+12.2pp)
- 0 regress per-field, 0 LLM calls, 0 tokens
- New winner vs v9 reval (60.2%)
- Router: 48/74 routed, 26 need LLM

Gate: PASS (target MACRO > 60.2%)
Pytest: 31 passed

files:
- tests/benchmark_hybrid_combined.py: new benchmark script
- docs/report/report_data.json: +1 experiment (49 total), hyb_combined_001 = new winner
- docs/experiments_ledger.md: +HYB-COMBINED-001 entry
- docs/kb_design.md: +Eksperimen vs Produksi section (previous commit)
- docs/report/*.{docx,md}: regenerate
</commit_message>
<xml_diff>
--- a/docs/report/benchmark_methods.docx
+++ b/docs/report/benchmark_methods.docx
@@ -12608,7 +12608,7 @@
               <w:rPr>
                 <w:sz w:val="18"/>
               </w:rPr>
-              <w:t>84.4%</w:t>
+              <w:t>-</w:t>
             </w:r>
           </w:p>
         </w:tc>
@@ -13316,7 +13316,7 @@
               <w:rPr>
                 <w:sz w:val="18"/>
               </w:rPr>
-              <w:t>84.4%</w:t>
+              <w:t>-</w:t>
             </w:r>
           </w:p>
         </w:tc>
@@ -13435,7 +13435,7 @@
               <w:rPr>
                 <w:sz w:val="18"/>
               </w:rPr>
-              <w:t>83.8%</w:t>
+              <w:t>-</w:t>
             </w:r>
           </w:p>
         </w:tc>
@@ -13552,7 +13552,7 @@
               <w:rPr>
                 <w:sz w:val="18"/>
               </w:rPr>
-              <w:t>83.8%</w:t>
+              <w:t>-</w:t>
             </w:r>
           </w:p>
         </w:tc>
@@ -13788,7 +13788,7 @@
               <w:rPr>
                 <w:sz w:val="18"/>
               </w:rPr>
-              <w:t>83.8%</w:t>
+              <w:t>-</w:t>
             </w:r>
           </w:p>
         </w:tc>
@@ -13907,7 +13907,7 @@
               <w:rPr>
                 <w:sz w:val="18"/>
               </w:rPr>
-              <w:t>83.8%</w:t>
+              <w:t>-</w:t>
             </w:r>
           </w:p>
         </w:tc>
@@ -15752,6 +15752,120 @@
                 <w:sz w:val="18"/>
               </w:rPr>
               <w:t>Aug 14</w:t>
+            </w:r>
+          </w:p>
+        </w:tc>
+      </w:tr>
+      <w:tr>
+        <w:tc>
+          <w:tcPr>
+            <w:tcW w:type="dxa" w:w="1080"/>
+          </w:tcPr>
+          <w:p>
+            <w:r/>
+            <w:r>
+              <w:rPr>
+                <w:sz w:val="18"/>
+              </w:rPr>
+              <w:t>HYB-COMBINED gabungan terbaik (router + AKT-005 + ORG-004, 0 LLM)</w:t>
+            </w:r>
+          </w:p>
+        </w:tc>
+        <w:tc>
+          <w:tcPr>
+            <w:tcW w:type="dxa" w:w="1080"/>
+          </w:tcPr>
+          <w:p>
+            <w:r/>
+            <w:r>
+              <w:rPr>
+                <w:sz w:val="18"/>
+              </w:rPr>
+              <w:t>81.1%</w:t>
+            </w:r>
+          </w:p>
+        </w:tc>
+        <w:tc>
+          <w:tcPr>
+            <w:tcW w:type="dxa" w:w="1080"/>
+          </w:tcPr>
+          <w:p>
+            <w:r/>
+            <w:r>
+              <w:rPr>
+                <w:sz w:val="18"/>
+              </w:rPr>
+              <w:t>73.7%</w:t>
+            </w:r>
+          </w:p>
+        </w:tc>
+        <w:tc>
+          <w:tcPr>
+            <w:tcW w:type="dxa" w:w="1080"/>
+          </w:tcPr>
+          <w:p>
+            <w:r/>
+            <w:r>
+              <w:rPr>
+                <w:sz w:val="18"/>
+              </w:rPr>
+              <w:t>0</w:t>
+            </w:r>
+          </w:p>
+        </w:tc>
+        <w:tc>
+          <w:tcPr>
+            <w:tcW w:type="dxa" w:w="1080"/>
+          </w:tcPr>
+          <w:p>
+            <w:r/>
+            <w:r>
+              <w:rPr>
+                <w:sz w:val="18"/>
+              </w:rPr>
+              <w:t>0</w:t>
+            </w:r>
+          </w:p>
+        </w:tc>
+        <w:tc>
+          <w:tcPr>
+            <w:tcW w:type="dxa" w:w="1080"/>
+          </w:tcPr>
+          <w:p>
+            <w:r/>
+            <w:r>
+              <w:rPr>
+                <w:sz w:val="18"/>
+              </w:rPr>
+              <w:t>-</w:t>
+            </w:r>
+          </w:p>
+        </w:tc>
+        <w:tc>
+          <w:tcPr>
+            <w:tcW w:type="dxa" w:w="1080"/>
+          </w:tcPr>
+          <w:p>
+            <w:r/>
+            <w:r>
+              <w:rPr>
+                <w:sz w:val="18"/>
+              </w:rPr>
+              <w:t>v9</w:t>
+            </w:r>
+          </w:p>
+        </w:tc>
+        <w:tc>
+          <w:tcPr>
+            <w:tcW w:type="dxa" w:w="1080"/>
+          </w:tcPr>
+          <w:p>
+            <w:r/>
+            <w:r>
+              <w:rPr>
+                <w:sz w:val="18"/>
+              </w:rPr>
+              <w:t>Aug 21</w:t>
             </w:r>
           </w:p>
         </w:tc>
@@ -16750,19 +16864,1985 @@
         <w:tc>
           <w:tcPr>
             <w:tcW w:type="dxa" w:w="2160"/>
-            <w:shd w:val="clear" w:color="auto" w:fill="FDF3D7"/>
-          </w:tcPr>
-          <w:p>
-            <w:r/>
-            <w:r>
-              <w:rPr>
-                <w:b/>
+            <w:shd w:val="clear" w:color="auto" w:fill="F2F6FC"/>
+          </w:tcPr>
+          <w:p>
+            <w:r/>
+            <w:r>
+              <w:rPr>
                 <w:sz w:val="18"/>
               </w:rPr>
               <w:t>v9</w:t>
             </w:r>
           </w:p>
         </w:tc>
+        <w:tc>
+          <w:tcPr>
+            <w:tcW w:type="dxa" w:w="2160"/>
+            <w:shd w:val="clear" w:color="auto" w:fill="F2F6FC"/>
+          </w:tcPr>
+          <w:p>
+            <w:r/>
+            <w:r>
+              <w:rPr>
+                <w:sz w:val="18"/>
+              </w:rPr>
+              <w:t>v9 organizer_v2 + router fix</w:t>
+            </w:r>
+          </w:p>
+        </w:tc>
+        <w:tc>
+          <w:tcPr>
+            <w:tcW w:type="dxa" w:w="2160"/>
+            <w:shd w:val="clear" w:color="auto" w:fill="F2F6FC"/>
+          </w:tcPr>
+          <w:p>
+            <w:r/>
+            <w:r>
+              <w:rPr>
+                <w:sz w:val="18"/>
+              </w:rPr>
+              <w:t>83.8%</w:t>
+            </w:r>
+          </w:p>
+        </w:tc>
+        <w:tc>
+          <w:tcPr>
+            <w:tcW w:type="dxa" w:w="2160"/>
+            <w:shd w:val="clear" w:color="auto" w:fill="F2F6FC"/>
+          </w:tcPr>
+          <w:p>
+            <w:r/>
+            <w:r>
+              <w:rPr>
+                <w:sz w:val="18"/>
+              </w:rPr>
+              <w:t>58.9%</w:t>
+            </w:r>
+          </w:p>
+        </w:tc>
+      </w:tr>
+      <w:tr>
+        <w:tc>
+          <w:tcPr>
+            <w:tcW w:type="dxa" w:w="2160"/>
+          </w:tcPr>
+          <w:p>
+            <w:r/>
+            <w:r>
+              <w:rPr>
+                <w:sz w:val="18"/>
+              </w:rPr>
+              <w:t>v12</w:t>
+            </w:r>
+          </w:p>
+        </w:tc>
+        <w:tc>
+          <w:tcPr>
+            <w:tcW w:type="dxa" w:w="2160"/>
+          </w:tcPr>
+          <w:p>
+            <w:r/>
+            <w:r>
+              <w:rPr>
+                <w:sz w:val="18"/>
+              </w:rPr>
+              <w:t>v9 winner re-baseline (GT v9 + matcher v2)</w:t>
+            </w:r>
+          </w:p>
+        </w:tc>
+        <w:tc>
+          <w:tcPr>
+            <w:tcW w:type="dxa" w:w="2160"/>
+          </w:tcPr>
+          <w:p>
+            <w:r/>
+            <w:r>
+              <w:rPr>
+                <w:sz w:val="18"/>
+              </w:rPr>
+              <w:t>83.8%</w:t>
+            </w:r>
+          </w:p>
+        </w:tc>
+        <w:tc>
+          <w:tcPr>
+            <w:tcW w:type="dxa" w:w="2160"/>
+          </w:tcPr>
+          <w:p>
+            <w:r/>
+            <w:r>
+              <w:rPr>
+                <w:sz w:val="18"/>
+              </w:rPr>
+              <w:t>60.2%</w:t>
+            </w:r>
+          </w:p>
+        </w:tc>
+      </w:tr>
+      <w:tr>
+        <w:tc>
+          <w:tcPr>
+            <w:tcW w:type="dxa" w:w="2160"/>
+            <w:shd w:val="clear" w:color="auto" w:fill="F2F6FC"/>
+          </w:tcPr>
+          <w:p>
+            <w:r/>
+            <w:r>
+              <w:rPr>
+                <w:sz w:val="18"/>
+              </w:rPr>
+              <w:t>ocr</w:t>
+            </w:r>
+          </w:p>
+        </w:tc>
+        <w:tc>
+          <w:tcPr>
+            <w:tcW w:type="dxa" w:w="2160"/>
+            <w:shd w:val="clear" w:color="auto" w:fill="F2F6FC"/>
+          </w:tcPr>
+          <w:p>
+            <w:r/>
+            <w:r>
+              <w:rPr>
+                <w:sz w:val="18"/>
+              </w:rPr>
+              <w:t>HYB-001 hybrid OCR per-field (DocTR dates+organizer / baseline nomor)</w:t>
+            </w:r>
+          </w:p>
+        </w:tc>
+        <w:tc>
+          <w:tcPr>
+            <w:tcW w:type="dxa" w:w="2160"/>
+            <w:shd w:val="clear" w:color="auto" w:fill="F2F6FC"/>
+          </w:tcPr>
+          <w:p>
+            <w:r/>
+            <w:r>
+              <w:rPr>
+                <w:sz w:val="18"/>
+              </w:rPr>
+              <w:t>n/a</w:t>
+            </w:r>
+          </w:p>
+        </w:tc>
+        <w:tc>
+          <w:tcPr>
+            <w:tcW w:type="dxa" w:w="2160"/>
+            <w:shd w:val="clear" w:color="auto" w:fill="F2F6FC"/>
+          </w:tcPr>
+          <w:p>
+            <w:r/>
+            <w:r>
+              <w:rPr>
+                <w:sz w:val="18"/>
+              </w:rPr>
+              <w:t>46.8%</w:t>
+            </w:r>
+          </w:p>
+        </w:tc>
+      </w:tr>
+      <w:tr>
+        <w:tc>
+          <w:tcPr>
+            <w:tcW w:type="dxa" w:w="2160"/>
+          </w:tcPr>
+          <w:p>
+            <w:r/>
+            <w:r>
+              <w:rPr>
+                <w:sz w:val="18"/>
+              </w:rPr>
+              <w:t>ocr</w:t>
+            </w:r>
+          </w:p>
+        </w:tc>
+        <w:tc>
+          <w:tcPr>
+            <w:tcW w:type="dxa" w:w="2160"/>
+          </w:tcPr>
+          <w:p>
+            <w:r/>
+            <w:r>
+              <w:rPr>
+                <w:sz w:val="18"/>
+              </w:rPr>
+              <w:t>NC-001 nomor crop preprocessing (re-render region zoom 6x)</w:t>
+            </w:r>
+          </w:p>
+        </w:tc>
+        <w:tc>
+          <w:tcPr>
+            <w:tcW w:type="dxa" w:w="2160"/>
+          </w:tcPr>
+          <w:p>
+            <w:r/>
+            <w:r>
+              <w:rPr>
+                <w:sz w:val="18"/>
+              </w:rPr>
+              <w:t>n/a</w:t>
+            </w:r>
+          </w:p>
+        </w:tc>
+        <w:tc>
+          <w:tcPr>
+            <w:tcW w:type="dxa" w:w="2160"/>
+          </w:tcPr>
+          <w:p>
+            <w:r/>
+            <w:r>
+              <w:rPr>
+                <w:sz w:val="18"/>
+              </w:rPr>
+              <w:t>46.3%</w:t>
+            </w:r>
+          </w:p>
+        </w:tc>
+      </w:tr>
+      <w:tr>
+        <w:tc>
+          <w:tcPr>
+            <w:tcW w:type="dxa" w:w="2160"/>
+            <w:shd w:val="clear" w:color="auto" w:fill="F2F6FC"/>
+          </w:tcPr>
+          <w:p>
+            <w:r/>
+            <w:r>
+              <w:rPr>
+                <w:sz w:val="18"/>
+              </w:rPr>
+              <w:t>ocr</w:t>
+            </w:r>
+          </w:p>
+        </w:tc>
+        <w:tc>
+          <w:tcPr>
+            <w:tcW w:type="dxa" w:w="2160"/>
+            <w:shd w:val="clear" w:color="auto" w:fill="F2F6FC"/>
+          </w:tcPr>
+          <w:p>
+            <w:r/>
+            <w:r>
+              <w:rPr>
+                <w:sz w:val="18"/>
+              </w:rPr>
+              <w:t>NC-002 region-OCR murah (rapid / tess psm tunggal) utk 2-pass nomor</w:t>
+            </w:r>
+          </w:p>
+        </w:tc>
+        <w:tc>
+          <w:tcPr>
+            <w:tcW w:type="dxa" w:w="2160"/>
+            <w:shd w:val="clear" w:color="auto" w:fill="F2F6FC"/>
+          </w:tcPr>
+          <w:p>
+            <w:r/>
+            <w:r>
+              <w:rPr>
+                <w:sz w:val="18"/>
+              </w:rPr>
+              <w:t>n/a</w:t>
+            </w:r>
+          </w:p>
+        </w:tc>
+        <w:tc>
+          <w:tcPr>
+            <w:tcW w:type="dxa" w:w="2160"/>
+            <w:shd w:val="clear" w:color="auto" w:fill="F2F6FC"/>
+          </w:tcPr>
+          <w:p>
+            <w:r/>
+            <w:r>
+              <w:rPr>
+                <w:sz w:val="18"/>
+              </w:rPr>
+              <w:t>47.3%</w:t>
+            </w:r>
+          </w:p>
+        </w:tc>
+      </w:tr>
+      <w:tr>
+        <w:tc>
+          <w:tcPr>
+            <w:tcW w:type="dxa" w:w="2160"/>
+          </w:tcPr>
+          <w:p>
+            <w:r/>
+            <w:r>
+              <w:rPr>
+                <w:sz w:val="18"/>
+              </w:rPr>
+              <w:t>ocr</w:t>
+            </w:r>
+          </w:p>
+        </w:tc>
+        <w:tc>
+          <w:tcPr>
+            <w:tcW w:type="dxa" w:w="2160"/>
+          </w:tcPr>
+          <w:p>
+            <w:r/>
+            <w:r>
+              <w:rPr>
+                <w:sz w:val="18"/>
+              </w:rPr>
+              <w:t>OCR-006 DocTR probe (mobilenet CPU, 10 scan)</w:t>
+            </w:r>
+          </w:p>
+        </w:tc>
+        <w:tc>
+          <w:tcPr>
+            <w:tcW w:type="dxa" w:w="2160"/>
+          </w:tcPr>
+          <w:p>
+            <w:r/>
+            <w:r>
+              <w:rPr>
+                <w:sz w:val="18"/>
+              </w:rPr>
+              <w:t>n/a</w:t>
+            </w:r>
+          </w:p>
+        </w:tc>
+        <w:tc>
+          <w:tcPr>
+            <w:tcW w:type="dxa" w:w="2160"/>
+          </w:tcPr>
+          <w:p>
+            <w:r/>
+            <w:r>
+              <w:rPr>
+                <w:sz w:val="18"/>
+              </w:rPr>
+              <w:t>40.0%</w:t>
+            </w:r>
+          </w:p>
+        </w:tc>
+      </w:tr>
+      <w:tr>
+        <w:tc>
+          <w:tcPr>
+            <w:tcW w:type="dxa" w:w="2160"/>
+            <w:shd w:val="clear" w:color="auto" w:fill="F2F6FC"/>
+          </w:tcPr>
+          <w:p>
+            <w:r/>
+            <w:r>
+              <w:rPr>
+                <w:sz w:val="18"/>
+              </w:rPr>
+              <w:t>v10</w:t>
+            </w:r>
+          </w:p>
+        </w:tc>
+        <w:tc>
+          <w:tcPr>
+            <w:tcW w:type="dxa" w:w="2160"/>
+            <w:shd w:val="clear" w:color="auto" w:fill="F2F6FC"/>
+          </w:tcPr>
+          <w:p>
+            <w:r/>
+            <w:r>
+              <w:rPr>
+                <w:sz w:val="18"/>
+              </w:rPr>
+              <w:t>F3-001 KB prototype warmup in-memory (opsi B, key=organizer+role)</w:t>
+            </w:r>
+          </w:p>
+        </w:tc>
+        <w:tc>
+          <w:tcPr>
+            <w:tcW w:type="dxa" w:w="2160"/>
+            <w:shd w:val="clear" w:color="auto" w:fill="F2F6FC"/>
+          </w:tcPr>
+          <w:p>
+            <w:r/>
+            <w:r>
+              <w:rPr>
+                <w:sz w:val="18"/>
+              </w:rPr>
+              <w:t>84.4%</w:t>
+            </w:r>
+          </w:p>
+        </w:tc>
+        <w:tc>
+          <w:tcPr>
+            <w:tcW w:type="dxa" w:w="2160"/>
+            <w:shd w:val="clear" w:color="auto" w:fill="F2F6FC"/>
+          </w:tcPr>
+          <w:p>
+            <w:r/>
+            <w:r>
+              <w:rPr>
+                <w:sz w:val="18"/>
+              </w:rPr>
+              <w:t>-</w:t>
+            </w:r>
+          </w:p>
+        </w:tc>
+      </w:tr>
+      <w:tr>
+        <w:tc>
+          <w:tcPr>
+            <w:tcW w:type="dxa" w:w="2160"/>
+          </w:tcPr>
+          <w:p>
+            <w:r/>
+            <w:r>
+              <w:rPr>
+                <w:sz w:val="18"/>
+              </w:rPr>
+              <w:t>v10</w:t>
+            </w:r>
+          </w:p>
+        </w:tc>
+        <w:tc>
+          <w:tcPr>
+            <w:tcW w:type="dxa" w:w="2160"/>
+          </w:tcPr>
+          <w:p>
+            <w:r/>
+            <w:r>
+              <w:rPr>
+                <w:sz w:val="18"/>
+              </w:rPr>
+              <w:t>OOD-001 probe mutation + noise (template &amp; OCR noise injection)</w:t>
+            </w:r>
+          </w:p>
+        </w:tc>
+        <w:tc>
+          <w:tcPr>
+            <w:tcW w:type="dxa" w:w="2160"/>
+          </w:tcPr>
+          <w:p>
+            <w:r/>
+            <w:r>
+              <w:rPr>
+                <w:sz w:val="18"/>
+              </w:rPr>
+              <w:t>83.8%</w:t>
+            </w:r>
+          </w:p>
+        </w:tc>
+        <w:tc>
+          <w:tcPr>
+            <w:tcW w:type="dxa" w:w="2160"/>
+          </w:tcPr>
+          <w:p>
+            <w:r/>
+            <w:r>
+              <w:rPr>
+                <w:sz w:val="18"/>
+              </w:rPr>
+              <w:t>55.7%</w:t>
+            </w:r>
+          </w:p>
+        </w:tc>
+      </w:tr>
+      <w:tr>
+        <w:tc>
+          <w:tcPr>
+            <w:tcW w:type="dxa" w:w="2160"/>
+            <w:shd w:val="clear" w:color="auto" w:fill="F2F6FC"/>
+          </w:tcPr>
+          <w:p>
+            <w:r/>
+            <w:r>
+              <w:rPr>
+                <w:sz w:val="18"/>
+              </w:rPr>
+              <w:t>v10</w:t>
+            </w:r>
+          </w:p>
+        </w:tc>
+        <w:tc>
+          <w:tcPr>
+            <w:tcW w:type="dxa" w:w="2160"/>
+            <w:shd w:val="clear" w:color="auto" w:fill="F2F6FC"/>
+          </w:tcPr>
+          <w:p>
+            <w:r/>
+            <w:r>
+              <w:rPr>
+                <w:sz w:val="18"/>
+              </w:rPr>
+              <w:t>F1 normalisasi organizer &amp; nomor (0 LLM)</w:t>
+            </w:r>
+          </w:p>
+        </w:tc>
+        <w:tc>
+          <w:tcPr>
+            <w:tcW w:type="dxa" w:w="2160"/>
+            <w:shd w:val="clear" w:color="auto" w:fill="F2F6FC"/>
+          </w:tcPr>
+          <w:p>
+            <w:r/>
+            <w:r>
+              <w:rPr>
+                <w:sz w:val="18"/>
+              </w:rPr>
+              <w:t>81.1%</w:t>
+            </w:r>
+          </w:p>
+        </w:tc>
+        <w:tc>
+          <w:tcPr>
+            <w:tcW w:type="dxa" w:w="2160"/>
+            <w:shd w:val="clear" w:color="auto" w:fill="F2F6FC"/>
+          </w:tcPr>
+          <w:p>
+            <w:r/>
+            <w:r>
+              <w:rPr>
+                <w:sz w:val="18"/>
+              </w:rPr>
+              <w:t>58.3%</w:t>
+            </w:r>
+          </w:p>
+        </w:tc>
+      </w:tr>
+      <w:tr>
+        <w:tc>
+          <w:tcPr>
+            <w:tcW w:type="dxa" w:w="2160"/>
+          </w:tcPr>
+          <w:p>
+            <w:r/>
+            <w:r>
+              <w:rPr>
+                <w:sz w:val="18"/>
+              </w:rPr>
+              <w:t>v10</w:t>
+            </w:r>
+          </w:p>
+        </w:tc>
+        <w:tc>
+          <w:tcPr>
+            <w:tcW w:type="dxa" w:w="2160"/>
+          </w:tcPr>
+          <w:p>
+            <w:r/>
+            <w:r>
+              <w:rPr>
+                <w:sz w:val="18"/>
+              </w:rPr>
+              <w:t>F1 organizer v3 + R6 (0 LLM)</w:t>
+            </w:r>
+          </w:p>
+        </w:tc>
+        <w:tc>
+          <w:tcPr>
+            <w:tcW w:type="dxa" w:w="2160"/>
+          </w:tcPr>
+          <w:p>
+            <w:r/>
+            <w:r>
+              <w:rPr>
+                <w:sz w:val="18"/>
+              </w:rPr>
+              <w:t>81.1%</w:t>
+            </w:r>
+          </w:p>
+        </w:tc>
+        <w:tc>
+          <w:tcPr>
+            <w:tcW w:type="dxa" w:w="2160"/>
+          </w:tcPr>
+          <w:p>
+            <w:r/>
+            <w:r>
+              <w:rPr>
+                <w:sz w:val="18"/>
+              </w:rPr>
+              <w:t>61.2%</w:t>
+            </w:r>
+          </w:p>
+        </w:tc>
+      </w:tr>
+      <w:tr>
+        <w:tc>
+          <w:tcPr>
+            <w:tcW w:type="dxa" w:w="2160"/>
+            <w:shd w:val="clear" w:color="auto" w:fill="F2F6FC"/>
+          </w:tcPr>
+          <w:p>
+            <w:r/>
+            <w:r>
+              <w:rPr>
+                <w:sz w:val="18"/>
+              </w:rPr>
+              <w:t>v10</w:t>
+            </w:r>
+          </w:p>
+        </w:tc>
+        <w:tc>
+          <w:tcPr>
+            <w:tcW w:type="dxa" w:w="2160"/>
+            <w:shd w:val="clear" w:color="auto" w:fill="F2F6FC"/>
+          </w:tcPr>
+          <w:p>
+            <w:r/>
+            <w:r>
+              <w:rPr>
+                <w:sz w:val="18"/>
+              </w:rPr>
+              <w:t>REVIEW-001 needs_review field lemah (confidence berbasis pola)</w:t>
+            </w:r>
+          </w:p>
+        </w:tc>
+        <w:tc>
+          <w:tcPr>
+            <w:tcW w:type="dxa" w:w="2160"/>
+            <w:shd w:val="clear" w:color="auto" w:fill="F2F6FC"/>
+          </w:tcPr>
+          <w:p>
+            <w:r/>
+            <w:r>
+              <w:rPr>
+                <w:sz w:val="18"/>
+              </w:rPr>
+              <w:t>-</w:t>
+            </w:r>
+          </w:p>
+        </w:tc>
+        <w:tc>
+          <w:tcPr>
+            <w:tcW w:type="dxa" w:w="2160"/>
+            <w:shd w:val="clear" w:color="auto" w:fill="F2F6FC"/>
+          </w:tcPr>
+          <w:p>
+            <w:r/>
+            <w:r>
+              <w:rPr>
+                <w:sz w:val="18"/>
+              </w:rPr>
+              <w:t>-</w:t>
+            </w:r>
+          </w:p>
+        </w:tc>
+      </w:tr>
+      <w:tr>
+        <w:tc>
+          <w:tcPr>
+            <w:tcW w:type="dxa" w:w="2160"/>
+          </w:tcPr>
+          <w:p>
+            <w:r/>
+            <w:r>
+              <w:rPr>
+                <w:sz w:val="18"/>
+              </w:rPr>
+              <w:t>v10</w:t>
+            </w:r>
+          </w:p>
+        </w:tc>
+        <w:tc>
+          <w:tcPr>
+            <w:tcW w:type="dxa" w:w="2160"/>
+          </w:tcPr>
+          <w:p>
+            <w:r/>
+            <w:r>
+              <w:rPr>
+                <w:sz w:val="18"/>
+              </w:rPr>
+              <w:t>STAT-001 validasi statistik 5-fold + bootstrap CI 1000×</w:t>
+            </w:r>
+          </w:p>
+        </w:tc>
+        <w:tc>
+          <w:tcPr>
+            <w:tcW w:type="dxa" w:w="2160"/>
+          </w:tcPr>
+          <w:p>
+            <w:r/>
+            <w:r>
+              <w:rPr>
+                <w:sz w:val="18"/>
+              </w:rPr>
+              <w:t>83.8%</w:t>
+            </w:r>
+          </w:p>
+        </w:tc>
+        <w:tc>
+          <w:tcPr>
+            <w:tcW w:type="dxa" w:w="2160"/>
+          </w:tcPr>
+          <w:p>
+            <w:r/>
+            <w:r>
+              <w:rPr>
+                <w:sz w:val="18"/>
+              </w:rPr>
+              <w:t>60.1%</w:t>
+            </w:r>
+          </w:p>
+        </w:tc>
+      </w:tr>
+      <w:tr>
+        <w:tc>
+          <w:tcPr>
+            <w:tcW w:type="dxa" w:w="2160"/>
+            <w:shd w:val="clear" w:color="auto" w:fill="F2F6FC"/>
+          </w:tcPr>
+          <w:p>
+            <w:r/>
+            <w:r>
+              <w:rPr>
+                <w:sz w:val="18"/>
+              </w:rPr>
+              <w:t>kb</w:t>
+            </w:r>
+          </w:p>
+        </w:tc>
+        <w:tc>
+          <w:tcPr>
+            <w:tcW w:type="dxa" w:w="2160"/>
+            <w:shd w:val="clear" w:color="auto" w:fill="F2F6FC"/>
+          </w:tcPr>
+          <w:p>
+            <w:r/>
+            <w:r>
+              <w:rPr>
+                <w:sz w:val="18"/>
+              </w:rPr>
+              <w:t>KB-001 shadow replay key v1 (router→KB→LLM)</w:t>
+            </w:r>
+          </w:p>
+        </w:tc>
+        <w:tc>
+          <w:tcPr>
+            <w:tcW w:type="dxa" w:w="2160"/>
+            <w:shd w:val="clear" w:color="auto" w:fill="F2F6FC"/>
+          </w:tcPr>
+          <w:p>
+            <w:r/>
+            <w:r>
+              <w:rPr>
+                <w:sz w:val="18"/>
+              </w:rPr>
+              <w:t>84.4%</w:t>
+            </w:r>
+          </w:p>
+        </w:tc>
+        <w:tc>
+          <w:tcPr>
+            <w:tcW w:type="dxa" w:w="2160"/>
+            <w:shd w:val="clear" w:color="auto" w:fill="F2F6FC"/>
+          </w:tcPr>
+          <w:p>
+            <w:r/>
+            <w:r>
+              <w:rPr>
+                <w:sz w:val="18"/>
+              </w:rPr>
+              <w:t>-</w:t>
+            </w:r>
+          </w:p>
+        </w:tc>
+      </w:tr>
+      <w:tr>
+        <w:tc>
+          <w:tcPr>
+            <w:tcW w:type="dxa" w:w="2160"/>
+          </w:tcPr>
+          <w:p>
+            <w:r/>
+            <w:r>
+              <w:rPr>
+                <w:sz w:val="18"/>
+              </w:rPr>
+              <w:t>kb</w:t>
+            </w:r>
+          </w:p>
+        </w:tc>
+        <w:tc>
+          <w:tcPr>
+            <w:tcW w:type="dxa" w:w="2160"/>
+          </w:tcPr>
+          <w:p>
+            <w:r/>
+            <w:r>
+              <w:rPr>
+                <w:sz w:val="18"/>
+              </w:rPr>
+              <w:t>KB-002 seeded persistent KB (smoke, ceiling, persistence, noise, fragmentasi)</w:t>
+            </w:r>
+          </w:p>
+        </w:tc>
+        <w:tc>
+          <w:tcPr>
+            <w:tcW w:type="dxa" w:w="2160"/>
+          </w:tcPr>
+          <w:p>
+            <w:r/>
+            <w:r>
+              <w:rPr>
+                <w:sz w:val="18"/>
+              </w:rPr>
+              <w:t>83.8%</w:t>
+            </w:r>
+          </w:p>
+        </w:tc>
+        <w:tc>
+          <w:tcPr>
+            <w:tcW w:type="dxa" w:w="2160"/>
+          </w:tcPr>
+          <w:p>
+            <w:r/>
+            <w:r>
+              <w:rPr>
+                <w:sz w:val="18"/>
+              </w:rPr>
+              <w:t>-</w:t>
+            </w:r>
+          </w:p>
+        </w:tc>
+      </w:tr>
+      <w:tr>
+        <w:tc>
+          <w:tcPr>
+            <w:tcW w:type="dxa" w:w="2160"/>
+            <w:shd w:val="clear" w:color="auto" w:fill="F2F6FC"/>
+          </w:tcPr>
+          <w:p>
+            <w:r/>
+            <w:r>
+              <w:rPr>
+                <w:sz w:val="18"/>
+              </w:rPr>
+              <w:t>kb</w:t>
+            </w:r>
+          </w:p>
+        </w:tc>
+        <w:tc>
+          <w:tcPr>
+            <w:tcW w:type="dxa" w:w="2160"/>
+            <w:shd w:val="clear" w:color="auto" w:fill="F2F6FC"/>
+          </w:tcPr>
+          <w:p>
+            <w:r/>
+            <w:r>
+              <w:rPr>
+                <w:sz w:val="18"/>
+              </w:rPr>
+              <w:t>KB-003 normalisasi key v2 (plain/stem/alias/both)</w:t>
+            </w:r>
+          </w:p>
+        </w:tc>
+        <w:tc>
+          <w:tcPr>
+            <w:tcW w:type="dxa" w:w="2160"/>
+            <w:shd w:val="clear" w:color="auto" w:fill="F2F6FC"/>
+          </w:tcPr>
+          <w:p>
+            <w:r/>
+            <w:r>
+              <w:rPr>
+                <w:sz w:val="18"/>
+              </w:rPr>
+              <w:t>83.8%</w:t>
+            </w:r>
+          </w:p>
+        </w:tc>
+        <w:tc>
+          <w:tcPr>
+            <w:tcW w:type="dxa" w:w="2160"/>
+            <w:shd w:val="clear" w:color="auto" w:fill="F2F6FC"/>
+          </w:tcPr>
+          <w:p>
+            <w:r/>
+            <w:r>
+              <w:rPr>
+                <w:sz w:val="18"/>
+              </w:rPr>
+              <w:t>-</w:t>
+            </w:r>
+          </w:p>
+        </w:tc>
+      </w:tr>
+      <w:tr>
+        <w:tc>
+          <w:tcPr>
+            <w:tcW w:type="dxa" w:w="2160"/>
+          </w:tcPr>
+          <w:p>
+            <w:r/>
+            <w:r>
+              <w:rPr>
+                <w:sz w:val="18"/>
+              </w:rPr>
+              <w:t>kb</w:t>
+            </w:r>
+          </w:p>
+        </w:tc>
+        <w:tc>
+          <w:tcPr>
+            <w:tcW w:type="dxa" w:w="2160"/>
+          </w:tcPr>
+          <w:p>
+            <w:r/>
+            <w:r>
+              <w:rPr>
+                <w:sz w:val="18"/>
+              </w:rPr>
+              <w:t>KB-004 alat audit korpus (tests/kb/audit.py)</w:t>
+            </w:r>
+          </w:p>
+        </w:tc>
+        <w:tc>
+          <w:tcPr>
+            <w:tcW w:type="dxa" w:w="2160"/>
+          </w:tcPr>
+          <w:p>
+            <w:r/>
+            <w:r>
+              <w:rPr>
+                <w:sz w:val="18"/>
+              </w:rPr>
+              <w:t>-</w:t>
+            </w:r>
+          </w:p>
+        </w:tc>
+        <w:tc>
+          <w:tcPr>
+            <w:tcW w:type="dxa" w:w="2160"/>
+          </w:tcPr>
+          <w:p>
+            <w:r/>
+            <w:r>
+              <w:rPr>
+                <w:sz w:val="18"/>
+              </w:rPr>
+              <w:t>-</w:t>
+            </w:r>
+          </w:p>
+        </w:tc>
+      </w:tr>
+      <w:tr>
+        <w:tc>
+          <w:tcPr>
+            <w:tcW w:type="dxa" w:w="2160"/>
+            <w:shd w:val="clear" w:color="auto" w:fill="F2F6FC"/>
+          </w:tcPr>
+          <w:p>
+            <w:r/>
+            <w:r>
+              <w:rPr>
+                <w:sz w:val="18"/>
+              </w:rPr>
+              <w:t>kb</w:t>
+            </w:r>
+          </w:p>
+        </w:tc>
+        <w:tc>
+          <w:tcPr>
+            <w:tcW w:type="dxa" w:w="2160"/>
+            <w:shd w:val="clear" w:color="auto" w:fill="F2F6FC"/>
+          </w:tcPr>
+          <w:p>
+            <w:r/>
+            <w:r>
+              <w:rPr>
+                <w:sz w:val="18"/>
+              </w:rPr>
+              <w:t>KB-005 event_type=role terbaik (role/jenis/kelompok × 4 normalisasi)</w:t>
+            </w:r>
+          </w:p>
+        </w:tc>
+        <w:tc>
+          <w:tcPr>
+            <w:tcW w:type="dxa" w:w="2160"/>
+            <w:shd w:val="clear" w:color="auto" w:fill="F2F6FC"/>
+          </w:tcPr>
+          <w:p>
+            <w:r/>
+            <w:r>
+              <w:rPr>
+                <w:sz w:val="18"/>
+              </w:rPr>
+              <w:t>83.8%</w:t>
+            </w:r>
+          </w:p>
+        </w:tc>
+        <w:tc>
+          <w:tcPr>
+            <w:tcW w:type="dxa" w:w="2160"/>
+            <w:shd w:val="clear" w:color="auto" w:fill="F2F6FC"/>
+          </w:tcPr>
+          <w:p>
+            <w:r/>
+            <w:r>
+              <w:rPr>
+                <w:sz w:val="18"/>
+              </w:rPr>
+              <w:t>-</w:t>
+            </w:r>
+          </w:p>
+        </w:tc>
+      </w:tr>
+      <w:tr>
+        <w:tc>
+          <w:tcPr>
+            <w:tcW w:type="dxa" w:w="2160"/>
+          </w:tcPr>
+          <w:p>
+            <w:r/>
+            <w:r>
+              <w:rPr>
+                <w:sz w:val="18"/>
+              </w:rPr>
+              <w:t>kb</w:t>
+            </w:r>
+          </w:p>
+        </w:tc>
+        <w:tc>
+          <w:tcPr>
+            <w:tcW w:type="dxa" w:w="2160"/>
+          </w:tcPr>
+          <w:p>
+            <w:r/>
+            <w:r>
+              <w:rPr>
+                <w:sz w:val="18"/>
+              </w:rPr>
+              <w:t>KB-006 alias mining data-driven (auto-alias = manual)</w:t>
+            </w:r>
+          </w:p>
+        </w:tc>
+        <w:tc>
+          <w:tcPr>
+            <w:tcW w:type="dxa" w:w="2160"/>
+          </w:tcPr>
+          <w:p>
+            <w:r/>
+            <w:r>
+              <w:rPr>
+                <w:sz w:val="18"/>
+              </w:rPr>
+              <w:t>83.8%</w:t>
+            </w:r>
+          </w:p>
+        </w:tc>
+        <w:tc>
+          <w:tcPr>
+            <w:tcW w:type="dxa" w:w="2160"/>
+          </w:tcPr>
+          <w:p>
+            <w:r/>
+            <w:r>
+              <w:rPr>
+                <w:sz w:val="18"/>
+              </w:rPr>
+              <w:t>-</w:t>
+            </w:r>
+          </w:p>
+        </w:tc>
+      </w:tr>
+      <w:tr>
+        <w:tc>
+          <w:tcPr>
+            <w:tcW w:type="dxa" w:w="2160"/>
+            <w:shd w:val="clear" w:color="auto" w:fill="F2F6FC"/>
+          </w:tcPr>
+          <w:p>
+            <w:r/>
+            <w:r>
+              <w:rPr>
+                <w:sz w:val="18"/>
+              </w:rPr>
+              <w:t>ocr</w:t>
+            </w:r>
+          </w:p>
+        </w:tc>
+        <w:tc>
+          <w:tcPr>
+            <w:tcW w:type="dxa" w:w="2160"/>
+            <w:shd w:val="clear" w:color="auto" w:fill="F2F6FC"/>
+          </w:tcPr>
+          <w:p>
+            <w:r/>
+            <w:r>
+              <w:rPr>
+                <w:sz w:val="18"/>
+              </w:rPr>
+              <w:t>OCR-007 LFM2.5-VL-3B probe (VLM OCR, GGUF Q4_0 + mmproj Q8_0, 10 scan)</w:t>
+            </w:r>
+          </w:p>
+        </w:tc>
+        <w:tc>
+          <w:tcPr>
+            <w:tcW w:type="dxa" w:w="2160"/>
+            <w:shd w:val="clear" w:color="auto" w:fill="F2F6FC"/>
+          </w:tcPr>
+          <w:p>
+            <w:r/>
+            <w:r>
+              <w:rPr>
+                <w:sz w:val="18"/>
+              </w:rPr>
+              <w:t>n/a</w:t>
+            </w:r>
+          </w:p>
+        </w:tc>
+        <w:tc>
+          <w:tcPr>
+            <w:tcW w:type="dxa" w:w="2160"/>
+            <w:shd w:val="clear" w:color="auto" w:fill="F2F6FC"/>
+          </w:tcPr>
+          <w:p>
+            <w:r/>
+            <w:r>
+              <w:rPr>
+                <w:sz w:val="18"/>
+              </w:rPr>
+              <w:t>44.4%</w:t>
+            </w:r>
+          </w:p>
+        </w:tc>
+      </w:tr>
+      <w:tr>
+        <w:tc>
+          <w:tcPr>
+            <w:tcW w:type="dxa" w:w="2160"/>
+          </w:tcPr>
+          <w:p>
+            <w:r/>
+            <w:r>
+              <w:rPr>
+                <w:sz w:val="18"/>
+              </w:rPr>
+              <w:t>v10</w:t>
+            </w:r>
+          </w:p>
+        </w:tc>
+        <w:tc>
+          <w:tcPr>
+            <w:tcW w:type="dxa" w:w="2160"/>
+          </w:tcPr>
+          <w:p>
+            <w:r/>
+            <w:r>
+              <w:rPr>
+                <w:sz w:val="18"/>
+              </w:rPr>
+              <w:t>AKT-001 taksonomi nama_kegiatan (report-only, 6.8% exact)</w:t>
+            </w:r>
+          </w:p>
+        </w:tc>
+        <w:tc>
+          <w:tcPr>
+            <w:tcW w:type="dxa" w:w="2160"/>
+          </w:tcPr>
+          <w:p>
+            <w:r/>
+            <w:r>
+              <w:rPr>
+                <w:sz w:val="18"/>
+              </w:rPr>
+              <w:t>-</w:t>
+            </w:r>
+          </w:p>
+        </w:tc>
+        <w:tc>
+          <w:tcPr>
+            <w:tcW w:type="dxa" w:w="2160"/>
+          </w:tcPr>
+          <w:p>
+            <w:r/>
+            <w:r>
+              <w:rPr>
+                <w:sz w:val="18"/>
+              </w:rPr>
+              <w:t>-</w:t>
+            </w:r>
+          </w:p>
+        </w:tc>
+      </w:tr>
+      <w:tr>
+        <w:tc>
+          <w:tcPr>
+            <w:tcW w:type="dxa" w:w="2160"/>
+            <w:shd w:val="clear" w:color="auto" w:fill="F2F6FC"/>
+          </w:tcPr>
+          <w:p>
+            <w:r/>
+            <w:r>
+              <w:rPr>
+                <w:sz w:val="18"/>
+              </w:rPr>
+              <w:t>v10</w:t>
+            </w:r>
+          </w:p>
+        </w:tc>
+        <w:tc>
+          <w:tcPr>
+            <w:tcW w:type="dxa" w:w="2160"/>
+            <w:shd w:val="clear" w:color="auto" w:fill="F2F6FC"/>
+          </w:tcPr>
+          <w:p>
+            <w:r/>
+            <w:r>
+              <w:rPr>
+                <w:sz w:val="18"/>
+              </w:rPr>
+              <w:t>AKT-002 deteksi nama_kegiatan v2 (0 LLM)</w:t>
+            </w:r>
+          </w:p>
+        </w:tc>
+        <w:tc>
+          <w:tcPr>
+            <w:tcW w:type="dxa" w:w="2160"/>
+            <w:shd w:val="clear" w:color="auto" w:fill="F2F6FC"/>
+          </w:tcPr>
+          <w:p>
+            <w:r/>
+            <w:r>
+              <w:rPr>
+                <w:sz w:val="18"/>
+              </w:rPr>
+              <w:t>81.1%</w:t>
+            </w:r>
+          </w:p>
+        </w:tc>
+        <w:tc>
+          <w:tcPr>
+            <w:tcW w:type="dxa" w:w="2160"/>
+            <w:shd w:val="clear" w:color="auto" w:fill="F2F6FC"/>
+          </w:tcPr>
+          <w:p>
+            <w:r/>
+            <w:r>
+              <w:rPr>
+                <w:sz w:val="18"/>
+              </w:rPr>
+              <w:t>68.8%</w:t>
+            </w:r>
+          </w:p>
+        </w:tc>
+      </w:tr>
+      <w:tr>
+        <w:tc>
+          <w:tcPr>
+            <w:tcW w:type="dxa" w:w="2160"/>
+          </w:tcPr>
+          <w:p>
+            <w:r/>
+            <w:r>
+              <w:rPr>
+                <w:sz w:val="18"/>
+              </w:rPr>
+              <w:t>v10</w:t>
+            </w:r>
+          </w:p>
+        </w:tc>
+        <w:tc>
+          <w:tcPr>
+            <w:tcW w:type="dxa" w:w="2160"/>
+          </w:tcPr>
+          <w:p>
+            <w:r/>
+            <w:r>
+              <w:rPr>
+                <w:sz w:val="18"/>
+              </w:rPr>
+              <w:t>AKT-003 deteksi nama_kegiatan v3: Sebagai Peserta + atthe/inthe (0 LLM)</w:t>
+            </w:r>
+          </w:p>
+        </w:tc>
+        <w:tc>
+          <w:tcPr>
+            <w:tcW w:type="dxa" w:w="2160"/>
+          </w:tcPr>
+          <w:p>
+            <w:r/>
+            <w:r>
+              <w:rPr>
+                <w:sz w:val="18"/>
+              </w:rPr>
+              <w:t>81.1%</w:t>
+            </w:r>
+          </w:p>
+        </w:tc>
+        <w:tc>
+          <w:tcPr>
+            <w:tcW w:type="dxa" w:w="2160"/>
+          </w:tcPr>
+          <w:p>
+            <w:r/>
+            <w:r>
+              <w:rPr>
+                <w:sz w:val="18"/>
+              </w:rPr>
+              <w:t>71.6%</w:t>
+            </w:r>
+          </w:p>
+        </w:tc>
+      </w:tr>
+      <w:tr>
+        <w:tc>
+          <w:tcPr>
+            <w:tcW w:type="dxa" w:w="2160"/>
+            <w:shd w:val="clear" w:color="auto" w:fill="F2F6FC"/>
+          </w:tcPr>
+          <w:p>
+            <w:r/>
+            <w:r>
+              <w:rPr>
+                <w:sz w:val="18"/>
+              </w:rPr>
+              <w:t>v10</w:t>
+            </w:r>
+          </w:p>
+        </w:tc>
+        <w:tc>
+          <w:tcPr>
+            <w:tcW w:type="dxa" w:w="2160"/>
+            <w:shd w:val="clear" w:color="auto" w:fill="F2F6FC"/>
+          </w:tcPr>
+          <w:p>
+            <w:r/>
+            <w:r>
+              <w:rPr>
+                <w:sz w:val="18"/>
+              </w:rPr>
+              <w:t>ORG-004 canonicalisasi format (0 LLM)</w:t>
+            </w:r>
+          </w:p>
+        </w:tc>
+        <w:tc>
+          <w:tcPr>
+            <w:tcW w:type="dxa" w:w="2160"/>
+            <w:shd w:val="clear" w:color="auto" w:fill="F2F6FC"/>
+          </w:tcPr>
+          <w:p>
+            <w:r/>
+            <w:r>
+              <w:rPr>
+                <w:sz w:val="18"/>
+              </w:rPr>
+              <w:t>81.1%</w:t>
+            </w:r>
+          </w:p>
+        </w:tc>
+        <w:tc>
+          <w:tcPr>
+            <w:tcW w:type="dxa" w:w="2160"/>
+            <w:shd w:val="clear" w:color="auto" w:fill="F2F6FC"/>
+          </w:tcPr>
+          <w:p>
+            <w:r/>
+            <w:r>
+              <w:rPr>
+                <w:sz w:val="18"/>
+              </w:rPr>
+              <w:t>63.5%</w:t>
+            </w:r>
+          </w:p>
+        </w:tc>
+      </w:tr>
+      <w:tr>
+        <w:tc>
+          <w:tcPr>
+            <w:tcW w:type="dxa" w:w="2160"/>
+          </w:tcPr>
+          <w:p>
+            <w:r/>
+            <w:r>
+              <w:rPr>
+                <w:sz w:val="18"/>
+              </w:rPr>
+              <w:t>v10</w:t>
+            </w:r>
+          </w:p>
+        </w:tc>
+        <w:tc>
+          <w:tcPr>
+            <w:tcW w:type="dxa" w:w="2160"/>
+          </w:tcPr>
+          <w:p>
+            <w:r/>
+            <w:r>
+              <w:rPr>
+                <w:sz w:val="18"/>
+              </w:rPr>
+              <w:t>ORG-005 probe scoring extractor (sisa 12 kasus)</w:t>
+            </w:r>
+          </w:p>
+        </w:tc>
+        <w:tc>
+          <w:tcPr>
+            <w:tcW w:type="dxa" w:w="2160"/>
+          </w:tcPr>
+          <w:p>
+            <w:r/>
+            <w:r>
+              <w:rPr>
+                <w:sz w:val="18"/>
+              </w:rPr>
+              <w:t>81.1%</w:t>
+            </w:r>
+          </w:p>
+        </w:tc>
+        <w:tc>
+          <w:tcPr>
+            <w:tcW w:type="dxa" w:w="2160"/>
+          </w:tcPr>
+          <w:p>
+            <w:r/>
+            <w:r>
+              <w:rPr>
+                <w:sz w:val="18"/>
+              </w:rPr>
+              <w:t>63.5%</w:t>
+            </w:r>
+          </w:p>
+        </w:tc>
+      </w:tr>
+      <w:tr>
+        <w:tc>
+          <w:tcPr>
+            <w:tcW w:type="dxa" w:w="2160"/>
+            <w:shd w:val="clear" w:color="auto" w:fill="F2F6FC"/>
+          </w:tcPr>
+          <w:p>
+            <w:r/>
+            <w:r>
+              <w:rPr>
+                <w:sz w:val="18"/>
+              </w:rPr>
+              <w:t>v10</w:t>
+            </w:r>
+          </w:p>
+        </w:tc>
+        <w:tc>
+          <w:tcPr>
+            <w:tcW w:type="dxa" w:w="2160"/>
+            <w:shd w:val="clear" w:color="auto" w:fill="F2F6FC"/>
+          </w:tcPr>
+          <w:p>
+            <w:r/>
+            <w:r>
+              <w:rPr>
+                <w:sz w:val="18"/>
+              </w:rPr>
+              <w:t>PROD-002 port produksi organizer v3+R3+R6+format + nomor (flag-gated)</w:t>
+            </w:r>
+          </w:p>
+        </w:tc>
+        <w:tc>
+          <w:tcPr>
+            <w:tcW w:type="dxa" w:w="2160"/>
+            <w:shd w:val="clear" w:color="auto" w:fill="F2F6FC"/>
+          </w:tcPr>
+          <w:p>
+            <w:r/>
+            <w:r>
+              <w:rPr>
+                <w:sz w:val="18"/>
+              </w:rPr>
+              <w:t>81.1%</w:t>
+            </w:r>
+          </w:p>
+        </w:tc>
+        <w:tc>
+          <w:tcPr>
+            <w:tcW w:type="dxa" w:w="2160"/>
+            <w:shd w:val="clear" w:color="auto" w:fill="F2F6FC"/>
+          </w:tcPr>
+          <w:p>
+            <w:r/>
+            <w:r>
+              <w:rPr>
+                <w:sz w:val="18"/>
+              </w:rPr>
+              <w:t>63.0%</w:t>
+            </w:r>
+          </w:p>
+        </w:tc>
+      </w:tr>
+      <w:tr>
+        <w:tc>
+          <w:tcPr>
+            <w:tcW w:type="dxa" w:w="2160"/>
+          </w:tcPr>
+          <w:p>
+            <w:r/>
+            <w:r>
+              <w:rPr>
+                <w:sz w:val="18"/>
+              </w:rPr>
+              <w:t>v10</w:t>
+            </w:r>
+          </w:p>
+        </w:tc>
+        <w:tc>
+          <w:tcPr>
+            <w:tcW w:type="dxa" w:w="2160"/>
+          </w:tcPr>
+          <w:p>
+            <w:r/>
+            <w:r>
+              <w:rPr>
+                <w:sz w:val="18"/>
+              </w:rPr>
+              <w:t>AKT-004 deteksi nama_kegiatan v4: Event/lomba/seminar on (0 LLM, gate scope-kecil)</w:t>
+            </w:r>
+          </w:p>
+        </w:tc>
+        <w:tc>
+          <w:tcPr>
+            <w:tcW w:type="dxa" w:w="2160"/>
+          </w:tcPr>
+          <w:p>
+            <w:r/>
+            <w:r>
+              <w:rPr>
+                <w:sz w:val="18"/>
+              </w:rPr>
+              <w:t>81.1%</w:t>
+            </w:r>
+          </w:p>
+        </w:tc>
+        <w:tc>
+          <w:tcPr>
+            <w:tcW w:type="dxa" w:w="2160"/>
+          </w:tcPr>
+          <w:p>
+            <w:r/>
+            <w:r>
+              <w:rPr>
+                <w:sz w:val="18"/>
+              </w:rPr>
+              <w:t>72.1%</w:t>
+            </w:r>
+          </w:p>
+        </w:tc>
+      </w:tr>
+      <w:tr>
+        <w:tc>
+          <w:tcPr>
+            <w:tcW w:type="dxa" w:w="2160"/>
+            <w:shd w:val="clear" w:color="auto" w:fill="F2F6FC"/>
+          </w:tcPr>
+          <w:p>
+            <w:r/>
+            <w:r>
+              <w:rPr>
+                <w:sz w:val="18"/>
+              </w:rPr>
+              <w:t>v10</w:t>
+            </w:r>
+          </w:p>
+        </w:tc>
+        <w:tc>
+          <w:tcPr>
+            <w:tcW w:type="dxa" w:w="2160"/>
+            <w:shd w:val="clear" w:color="auto" w:fill="F2F6FC"/>
+          </w:tcPr>
+          <w:p>
+            <w:r/>
+            <w:r>
+              <w:rPr>
+                <w:sz w:val="18"/>
+              </w:rPr>
+              <w:t>AKT-005 deteksi nama_kegiatan v5: grup D all-caps/spacing (0 LLM)</w:t>
+            </w:r>
+          </w:p>
+        </w:tc>
+        <w:tc>
+          <w:tcPr>
+            <w:tcW w:type="dxa" w:w="2160"/>
+            <w:shd w:val="clear" w:color="auto" w:fill="F2F6FC"/>
+          </w:tcPr>
+          <w:p>
+            <w:r/>
+            <w:r>
+              <w:rPr>
+                <w:sz w:val="18"/>
+              </w:rPr>
+              <w:t>81.1%</w:t>
+            </w:r>
+          </w:p>
+        </w:tc>
+        <w:tc>
+          <w:tcPr>
+            <w:tcW w:type="dxa" w:w="2160"/>
+            <w:shd w:val="clear" w:color="auto" w:fill="F2F6FC"/>
+          </w:tcPr>
+          <w:p>
+            <w:r/>
+            <w:r>
+              <w:rPr>
+                <w:sz w:val="18"/>
+              </w:rPr>
+              <w:t>73.7%</w:t>
+            </w:r>
+          </w:p>
+        </w:tc>
+      </w:tr>
+      <w:tr>
+        <w:tc>
+          <w:tcPr>
+            <w:tcW w:type="dxa" w:w="2160"/>
+          </w:tcPr>
+          <w:p>
+            <w:r/>
+            <w:r>
+              <w:rPr>
+                <w:sz w:val="18"/>
+              </w:rPr>
+              <w:t>kb</w:t>
+            </w:r>
+          </w:p>
+        </w:tc>
+        <w:tc>
+          <w:tcPr>
+            <w:tcW w:type="dxa" w:w="2160"/>
+          </w:tcPr>
+          <w:p>
+            <w:r/>
+            <w:r>
+              <w:rPr>
+                <w:sz w:val="18"/>
+              </w:rPr>
+              <w:t>KB-PROD-001 semantik produksi (servable/resolve/audit_due)</w:t>
+            </w:r>
+          </w:p>
+        </w:tc>
+        <w:tc>
+          <w:tcPr>
+            <w:tcW w:type="dxa" w:w="2160"/>
+          </w:tcPr>
+          <w:p>
+            <w:r/>
+            <w:r>
+              <w:rPr>
+                <w:sz w:val="18"/>
+              </w:rPr>
+              <w:t>-</w:t>
+            </w:r>
+          </w:p>
+        </w:tc>
+        <w:tc>
+          <w:tcPr>
+            <w:tcW w:type="dxa" w:w="2160"/>
+          </w:tcPr>
+          <w:p>
+            <w:r/>
+            <w:r>
+              <w:rPr>
+                <w:sz w:val="18"/>
+              </w:rPr>
+              <w:t>-</w:t>
+            </w:r>
+          </w:p>
+        </w:tc>
+      </w:tr>
+      <w:tr>
+        <w:tc>
+          <w:tcPr>
+            <w:tcW w:type="dxa" w:w="2160"/>
+            <w:shd w:val="clear" w:color="auto" w:fill="F2F6FC"/>
+          </w:tcPr>
+          <w:p>
+            <w:r/>
+            <w:r>
+              <w:rPr>
+                <w:sz w:val="18"/>
+              </w:rPr>
+              <w:t>kb</w:t>
+            </w:r>
+          </w:p>
+        </w:tc>
+        <w:tc>
+          <w:tcPr>
+            <w:tcW w:type="dxa" w:w="2160"/>
+            <w:shd w:val="clear" w:color="auto" w:fill="F2F6FC"/>
+          </w:tcPr>
+          <w:p>
+            <w:r/>
+            <w:r>
+              <w:rPr>
+                <w:sz w:val="18"/>
+              </w:rPr>
+              <w:t>KB-SCALE-001 simulasi workload skewed (500-5000 req)</w:t>
+            </w:r>
+          </w:p>
+        </w:tc>
+        <w:tc>
+          <w:tcPr>
+            <w:tcW w:type="dxa" w:w="2160"/>
+            <w:shd w:val="clear" w:color="auto" w:fill="F2F6FC"/>
+          </w:tcPr>
+          <w:p>
+            <w:r/>
+            <w:r>
+              <w:rPr>
+                <w:sz w:val="18"/>
+              </w:rPr>
+              <w:t>-</w:t>
+            </w:r>
+          </w:p>
+        </w:tc>
+        <w:tc>
+          <w:tcPr>
+            <w:tcW w:type="dxa" w:w="2160"/>
+            <w:shd w:val="clear" w:color="auto" w:fill="F2F6FC"/>
+          </w:tcPr>
+          <w:p>
+            <w:r/>
+            <w:r>
+              <w:rPr>
+                <w:sz w:val="18"/>
+              </w:rPr>
+              <w:t>-</w:t>
+            </w:r>
+          </w:p>
+        </w:tc>
+      </w:tr>
+      <w:tr>
+        <w:tc>
+          <w:tcPr>
+            <w:tcW w:type="dxa" w:w="2160"/>
+          </w:tcPr>
+          <w:p>
+            <w:r/>
+            <w:r>
+              <w:rPr>
+                <w:sz w:val="18"/>
+              </w:rPr>
+              <w:t>kb</w:t>
+            </w:r>
+          </w:p>
+        </w:tc>
+        <w:tc>
+          <w:tcPr>
+            <w:tcW w:type="dxa" w:w="2160"/>
+          </w:tcPr>
+          <w:p>
+            <w:r/>
+            <w:r>
+              <w:rPr>
+                <w:sz w:val="18"/>
+              </w:rPr>
+              <w:t>KB-SCALE-002 race tulis multi-worker (threading.Lock fix)</w:t>
+            </w:r>
+          </w:p>
+        </w:tc>
+        <w:tc>
+          <w:tcPr>
+            <w:tcW w:type="dxa" w:w="2160"/>
+          </w:tcPr>
+          <w:p>
+            <w:r/>
+            <w:r>
+              <w:rPr>
+                <w:sz w:val="18"/>
+              </w:rPr>
+              <w:t>-</w:t>
+            </w:r>
+          </w:p>
+        </w:tc>
+        <w:tc>
+          <w:tcPr>
+            <w:tcW w:type="dxa" w:w="2160"/>
+          </w:tcPr>
+          <w:p>
+            <w:r/>
+            <w:r>
+              <w:rPr>
+                <w:sz w:val="18"/>
+              </w:rPr>
+              <w:t>-</w:t>
+            </w:r>
+          </w:p>
+        </w:tc>
+      </w:tr>
+      <w:tr>
+        <w:tc>
+          <w:tcPr>
+            <w:tcW w:type="dxa" w:w="2160"/>
+            <w:shd w:val="clear" w:color="auto" w:fill="F2F6FC"/>
+          </w:tcPr>
+          <w:p>
+            <w:r/>
+            <w:r>
+              <w:rPr>
+                <w:sz w:val="18"/>
+              </w:rPr>
+              <w:t>kb</w:t>
+            </w:r>
+          </w:p>
+        </w:tc>
+        <w:tc>
+          <w:tcPr>
+            <w:tcW w:type="dxa" w:w="2160"/>
+            <w:shd w:val="clear" w:color="auto" w:fill="F2F6FC"/>
+          </w:tcPr>
+          <w:p>
+            <w:r/>
+            <w:r>
+              <w:rPr>
+                <w:sz w:val="18"/>
+              </w:rPr>
+              <w:t>KB-SCALE-003 peta hemat (5 volume × 5 key space × 3 skew)</w:t>
+            </w:r>
+          </w:p>
+        </w:tc>
+        <w:tc>
+          <w:tcPr>
+            <w:tcW w:type="dxa" w:w="2160"/>
+            <w:shd w:val="clear" w:color="auto" w:fill="F2F6FC"/>
+          </w:tcPr>
+          <w:p>
+            <w:r/>
+            <w:r>
+              <w:rPr>
+                <w:sz w:val="18"/>
+              </w:rPr>
+              <w:t>-</w:t>
+            </w:r>
+          </w:p>
+        </w:tc>
+        <w:tc>
+          <w:tcPr>
+            <w:tcW w:type="dxa" w:w="2160"/>
+            <w:shd w:val="clear" w:color="auto" w:fill="F2F6FC"/>
+          </w:tcPr>
+          <w:p>
+            <w:r/>
+            <w:r>
+              <w:rPr>
+                <w:sz w:val="18"/>
+              </w:rPr>
+              <w:t>-</w:t>
+            </w:r>
+          </w:p>
+        </w:tc>
+      </w:tr>
+      <w:tr>
+        <w:tc>
+          <w:tcPr>
+            <w:tcW w:type="dxa" w:w="2160"/>
+          </w:tcPr>
+          <w:p>
+            <w:r/>
+            <w:r>
+              <w:rPr>
+                <w:sz w:val="18"/>
+              </w:rPr>
+              <w:t>kb</w:t>
+            </w:r>
+          </w:p>
+        </w:tc>
+        <w:tc>
+          <w:tcPr>
+            <w:tcW w:type="dxa" w:w="2160"/>
+          </w:tcPr>
+          <w:p>
+            <w:r/>
+            <w:r>
+              <w:rPr>
+                <w:sz w:val="18"/>
+              </w:rPr>
+              <w:t>KB-SCALE-004 confirm 2x vs 3x (wrong +20 @2x)</w:t>
+            </w:r>
+          </w:p>
+        </w:tc>
+        <w:tc>
+          <w:tcPr>
+            <w:tcW w:type="dxa" w:w="2160"/>
+          </w:tcPr>
+          <w:p>
+            <w:r/>
+            <w:r>
+              <w:rPr>
+                <w:sz w:val="18"/>
+              </w:rPr>
+              <w:t>-</w:t>
+            </w:r>
+          </w:p>
+        </w:tc>
+        <w:tc>
+          <w:tcPr>
+            <w:tcW w:type="dxa" w:w="2160"/>
+          </w:tcPr>
+          <w:p>
+            <w:r/>
+            <w:r>
+              <w:rPr>
+                <w:sz w:val="18"/>
+              </w:rPr>
+              <w:t>-</w:t>
+            </w:r>
+          </w:p>
+        </w:tc>
+      </w:tr>
+      <w:tr>
+        <w:tc>
+          <w:tcPr>
+            <w:tcW w:type="dxa" w:w="2160"/>
+            <w:shd w:val="clear" w:color="auto" w:fill="F2F6FC"/>
+          </w:tcPr>
+          <w:p>
+            <w:r/>
+            <w:r>
+              <w:rPr>
+                <w:sz w:val="18"/>
+              </w:rPr>
+              <w:t>kb</w:t>
+            </w:r>
+          </w:p>
+        </w:tc>
+        <w:tc>
+          <w:tcPr>
+            <w:tcW w:type="dxa" w:w="2160"/>
+            <w:shd w:val="clear" w:color="auto" w:fill="F2F6FC"/>
+          </w:tcPr>
+          <w:p>
+            <w:r/>
+            <w:r>
+              <w:rPr>
+                <w:sz w:val="18"/>
+              </w:rPr>
+              <w:t>KB-SCALE-005 akurasi+biaya e2e (hemat 87%, akurasi 99.3%)</w:t>
+            </w:r>
+          </w:p>
+        </w:tc>
+        <w:tc>
+          <w:tcPr>
+            <w:tcW w:type="dxa" w:w="2160"/>
+            <w:shd w:val="clear" w:color="auto" w:fill="F2F6FC"/>
+          </w:tcPr>
+          <w:p>
+            <w:r/>
+            <w:r>
+              <w:rPr>
+                <w:sz w:val="18"/>
+              </w:rPr>
+              <w:t>-</w:t>
+            </w:r>
+          </w:p>
+        </w:tc>
+        <w:tc>
+          <w:tcPr>
+            <w:tcW w:type="dxa" w:w="2160"/>
+            <w:shd w:val="clear" w:color="auto" w:fill="F2F6FC"/>
+          </w:tcPr>
+          <w:p>
+            <w:r/>
+            <w:r>
+              <w:rPr>
+                <w:sz w:val="18"/>
+              </w:rPr>
+              <w:t>99.3%</w:t>
+            </w:r>
+          </w:p>
+        </w:tc>
+      </w:tr>
+      <w:tr>
         <w:tc>
           <w:tcPr>
             <w:tcW w:type="dxa" w:w="2160"/>
@@ -16775,7 +18855,7 @@
                 <w:b/>
                 <w:sz w:val="18"/>
               </w:rPr>
-              <w:t xml:space="preserve">v9 organizer_v2 + router fix </w:t>
+              <w:t>v10</w:t>
             </w:r>
           </w:p>
         </w:tc>
@@ -16791,7 +18871,7 @@
                 <w:b/>
                 <w:sz w:val="18"/>
               </w:rPr>
-              <w:t>83.8%</w:t>
+              <w:t xml:space="preserve">HYB-COMBINED gabungan terbaik (router + AKT-005 + ORG-004, 0 LLM) </w:t>
             </w:r>
           </w:p>
         </w:tc>
@@ -16807,1927 +18887,23 @@
                 <w:b/>
                 <w:sz w:val="18"/>
               </w:rPr>
-              <w:t>58.9%</w:t>
-            </w:r>
-          </w:p>
-        </w:tc>
-      </w:tr>
-      <w:tr>
+              <w:t>81.1%</w:t>
+            </w:r>
+          </w:p>
+        </w:tc>
         <w:tc>
           <w:tcPr>
             <w:tcW w:type="dxa" w:w="2160"/>
-          </w:tcPr>
-          <w:p>
-            <w:r/>
-            <w:r>
-              <w:rPr>
-                <w:sz w:val="18"/>
-              </w:rPr>
-              <w:t>v12</w:t>
-            </w:r>
-          </w:p>
-        </w:tc>
-        <w:tc>
-          <w:tcPr>
-            <w:tcW w:type="dxa" w:w="2160"/>
-          </w:tcPr>
-          <w:p>
-            <w:r/>
-            <w:r>
-              <w:rPr>
-                <w:sz w:val="18"/>
-              </w:rPr>
-              <w:t>v9 winner re-baseline (GT v9 + matcher v2)</w:t>
-            </w:r>
-          </w:p>
-        </w:tc>
-        <w:tc>
-          <w:tcPr>
-            <w:tcW w:type="dxa" w:w="2160"/>
-          </w:tcPr>
-          <w:p>
-            <w:r/>
-            <w:r>
-              <w:rPr>
-                <w:sz w:val="18"/>
-              </w:rPr>
-              <w:t>83.8%</w:t>
-            </w:r>
-          </w:p>
-        </w:tc>
-        <w:tc>
-          <w:tcPr>
-            <w:tcW w:type="dxa" w:w="2160"/>
-          </w:tcPr>
-          <w:p>
-            <w:r/>
-            <w:r>
-              <w:rPr>
-                <w:sz w:val="18"/>
-              </w:rPr>
-              <w:t>60.2%</w:t>
-            </w:r>
-          </w:p>
-        </w:tc>
-      </w:tr>
-      <w:tr>
-        <w:tc>
-          <w:tcPr>
-            <w:tcW w:type="dxa" w:w="2160"/>
-            <w:shd w:val="clear" w:color="auto" w:fill="F2F6FC"/>
-          </w:tcPr>
-          <w:p>
-            <w:r/>
-            <w:r>
-              <w:rPr>
-                <w:sz w:val="18"/>
-              </w:rPr>
-              <w:t>ocr</w:t>
-            </w:r>
-          </w:p>
-        </w:tc>
-        <w:tc>
-          <w:tcPr>
-            <w:tcW w:type="dxa" w:w="2160"/>
-            <w:shd w:val="clear" w:color="auto" w:fill="F2F6FC"/>
-          </w:tcPr>
-          <w:p>
-            <w:r/>
-            <w:r>
-              <w:rPr>
-                <w:sz w:val="18"/>
-              </w:rPr>
-              <w:t>HYB-001 hybrid OCR per-field (DocTR dates+organizer / baseline nomor)</w:t>
-            </w:r>
-          </w:p>
-        </w:tc>
-        <w:tc>
-          <w:tcPr>
-            <w:tcW w:type="dxa" w:w="2160"/>
-            <w:shd w:val="clear" w:color="auto" w:fill="F2F6FC"/>
-          </w:tcPr>
-          <w:p>
-            <w:r/>
-            <w:r>
-              <w:rPr>
-                <w:sz w:val="18"/>
-              </w:rPr>
-              <w:t>n/a</w:t>
-            </w:r>
-          </w:p>
-        </w:tc>
-        <w:tc>
-          <w:tcPr>
-            <w:tcW w:type="dxa" w:w="2160"/>
-            <w:shd w:val="clear" w:color="auto" w:fill="F2F6FC"/>
-          </w:tcPr>
-          <w:p>
-            <w:r/>
-            <w:r>
-              <w:rPr>
-                <w:sz w:val="18"/>
-              </w:rPr>
-              <w:t>46.8%</w:t>
-            </w:r>
-          </w:p>
-        </w:tc>
-      </w:tr>
-      <w:tr>
-        <w:tc>
-          <w:tcPr>
-            <w:tcW w:type="dxa" w:w="2160"/>
-          </w:tcPr>
-          <w:p>
-            <w:r/>
-            <w:r>
-              <w:rPr>
-                <w:sz w:val="18"/>
-              </w:rPr>
-              <w:t>ocr</w:t>
-            </w:r>
-          </w:p>
-        </w:tc>
-        <w:tc>
-          <w:tcPr>
-            <w:tcW w:type="dxa" w:w="2160"/>
-          </w:tcPr>
-          <w:p>
-            <w:r/>
-            <w:r>
-              <w:rPr>
-                <w:sz w:val="18"/>
-              </w:rPr>
-              <w:t>NC-001 nomor crop preprocessing (re-render region zoom 6x)</w:t>
-            </w:r>
-          </w:p>
-        </w:tc>
-        <w:tc>
-          <w:tcPr>
-            <w:tcW w:type="dxa" w:w="2160"/>
-          </w:tcPr>
-          <w:p>
-            <w:r/>
-            <w:r>
-              <w:rPr>
-                <w:sz w:val="18"/>
-              </w:rPr>
-              <w:t>n/a</w:t>
-            </w:r>
-          </w:p>
-        </w:tc>
-        <w:tc>
-          <w:tcPr>
-            <w:tcW w:type="dxa" w:w="2160"/>
-          </w:tcPr>
-          <w:p>
-            <w:r/>
-            <w:r>
-              <w:rPr>
-                <w:sz w:val="18"/>
-              </w:rPr>
-              <w:t>46.3%</w:t>
-            </w:r>
-          </w:p>
-        </w:tc>
-      </w:tr>
-      <w:tr>
-        <w:tc>
-          <w:tcPr>
-            <w:tcW w:type="dxa" w:w="2160"/>
-            <w:shd w:val="clear" w:color="auto" w:fill="F2F6FC"/>
-          </w:tcPr>
-          <w:p>
-            <w:r/>
-            <w:r>
-              <w:rPr>
-                <w:sz w:val="18"/>
-              </w:rPr>
-              <w:t>ocr</w:t>
-            </w:r>
-          </w:p>
-        </w:tc>
-        <w:tc>
-          <w:tcPr>
-            <w:tcW w:type="dxa" w:w="2160"/>
-            <w:shd w:val="clear" w:color="auto" w:fill="F2F6FC"/>
-          </w:tcPr>
-          <w:p>
-            <w:r/>
-            <w:r>
-              <w:rPr>
-                <w:sz w:val="18"/>
-              </w:rPr>
-              <w:t>NC-002 region-OCR murah (rapid / tess psm tunggal) utk 2-pass nomor</w:t>
-            </w:r>
-          </w:p>
-        </w:tc>
-        <w:tc>
-          <w:tcPr>
-            <w:tcW w:type="dxa" w:w="2160"/>
-            <w:shd w:val="clear" w:color="auto" w:fill="F2F6FC"/>
-          </w:tcPr>
-          <w:p>
-            <w:r/>
-            <w:r>
-              <w:rPr>
-                <w:sz w:val="18"/>
-              </w:rPr>
-              <w:t>n/a</w:t>
-            </w:r>
-          </w:p>
-        </w:tc>
-        <w:tc>
-          <w:tcPr>
-            <w:tcW w:type="dxa" w:w="2160"/>
-            <w:shd w:val="clear" w:color="auto" w:fill="F2F6FC"/>
-          </w:tcPr>
-          <w:p>
-            <w:r/>
-            <w:r>
-              <w:rPr>
-                <w:sz w:val="18"/>
-              </w:rPr>
-              <w:t>47.3%</w:t>
-            </w:r>
-          </w:p>
-        </w:tc>
-      </w:tr>
-      <w:tr>
-        <w:tc>
-          <w:tcPr>
-            <w:tcW w:type="dxa" w:w="2160"/>
-          </w:tcPr>
-          <w:p>
-            <w:r/>
-            <w:r>
-              <w:rPr>
-                <w:sz w:val="18"/>
-              </w:rPr>
-              <w:t>ocr</w:t>
-            </w:r>
-          </w:p>
-        </w:tc>
-        <w:tc>
-          <w:tcPr>
-            <w:tcW w:type="dxa" w:w="2160"/>
-          </w:tcPr>
-          <w:p>
-            <w:r/>
-            <w:r>
-              <w:rPr>
-                <w:sz w:val="18"/>
-              </w:rPr>
-              <w:t>OCR-006 DocTR probe (mobilenet CPU, 10 scan)</w:t>
-            </w:r>
-          </w:p>
-        </w:tc>
-        <w:tc>
-          <w:tcPr>
-            <w:tcW w:type="dxa" w:w="2160"/>
-          </w:tcPr>
-          <w:p>
-            <w:r/>
-            <w:r>
-              <w:rPr>
-                <w:sz w:val="18"/>
-              </w:rPr>
-              <w:t>n/a</w:t>
-            </w:r>
-          </w:p>
-        </w:tc>
-        <w:tc>
-          <w:tcPr>
-            <w:tcW w:type="dxa" w:w="2160"/>
-          </w:tcPr>
-          <w:p>
-            <w:r/>
-            <w:r>
-              <w:rPr>
-                <w:sz w:val="18"/>
-              </w:rPr>
-              <w:t>40.0%</w:t>
-            </w:r>
-          </w:p>
-        </w:tc>
-      </w:tr>
-      <w:tr>
-        <w:tc>
-          <w:tcPr>
-            <w:tcW w:type="dxa" w:w="2160"/>
-            <w:shd w:val="clear" w:color="auto" w:fill="F2F6FC"/>
-          </w:tcPr>
-          <w:p>
-            <w:r/>
-            <w:r>
-              <w:rPr>
-                <w:sz w:val="18"/>
-              </w:rPr>
-              <w:t>v10</w:t>
-            </w:r>
-          </w:p>
-        </w:tc>
-        <w:tc>
-          <w:tcPr>
-            <w:tcW w:type="dxa" w:w="2160"/>
-            <w:shd w:val="clear" w:color="auto" w:fill="F2F6FC"/>
-          </w:tcPr>
-          <w:p>
-            <w:r/>
-            <w:r>
-              <w:rPr>
-                <w:sz w:val="18"/>
-              </w:rPr>
-              <w:t>F3-001 KB prototype warmup in-memory (opsi B, key=organizer+role)</w:t>
-            </w:r>
-          </w:p>
-        </w:tc>
-        <w:tc>
-          <w:tcPr>
-            <w:tcW w:type="dxa" w:w="2160"/>
-            <w:shd w:val="clear" w:color="auto" w:fill="F2F6FC"/>
-          </w:tcPr>
-          <w:p>
-            <w:r/>
-            <w:r>
-              <w:rPr>
-                <w:sz w:val="18"/>
-              </w:rPr>
-              <w:t>84.4%</w:t>
-            </w:r>
-          </w:p>
-        </w:tc>
-        <w:tc>
-          <w:tcPr>
-            <w:tcW w:type="dxa" w:w="2160"/>
-            <w:shd w:val="clear" w:color="auto" w:fill="F2F6FC"/>
-          </w:tcPr>
-          <w:p>
-            <w:r/>
-            <w:r>
-              <w:rPr>
-                <w:sz w:val="18"/>
-              </w:rPr>
-              <w:t>84.4%</w:t>
-            </w:r>
-          </w:p>
-        </w:tc>
-      </w:tr>
-      <w:tr>
-        <w:tc>
-          <w:tcPr>
-            <w:tcW w:type="dxa" w:w="2160"/>
-          </w:tcPr>
-          <w:p>
-            <w:r/>
-            <w:r>
-              <w:rPr>
-                <w:sz w:val="18"/>
-              </w:rPr>
-              <w:t>v10</w:t>
-            </w:r>
-          </w:p>
-        </w:tc>
-        <w:tc>
-          <w:tcPr>
-            <w:tcW w:type="dxa" w:w="2160"/>
-          </w:tcPr>
-          <w:p>
-            <w:r/>
-            <w:r>
-              <w:rPr>
-                <w:sz w:val="18"/>
-              </w:rPr>
-              <w:t>OOD-001 probe mutation + noise (template &amp; OCR noise injection)</w:t>
-            </w:r>
-          </w:p>
-        </w:tc>
-        <w:tc>
-          <w:tcPr>
-            <w:tcW w:type="dxa" w:w="2160"/>
-          </w:tcPr>
-          <w:p>
-            <w:r/>
-            <w:r>
-              <w:rPr>
-                <w:sz w:val="18"/>
-              </w:rPr>
-              <w:t>83.8%</w:t>
-            </w:r>
-          </w:p>
-        </w:tc>
-        <w:tc>
-          <w:tcPr>
-            <w:tcW w:type="dxa" w:w="2160"/>
-          </w:tcPr>
-          <w:p>
-            <w:r/>
-            <w:r>
-              <w:rPr>
-                <w:sz w:val="18"/>
-              </w:rPr>
-              <w:t>55.7%</w:t>
-            </w:r>
-          </w:p>
-        </w:tc>
-      </w:tr>
-      <w:tr>
-        <w:tc>
-          <w:tcPr>
-            <w:tcW w:type="dxa" w:w="2160"/>
-            <w:shd w:val="clear" w:color="auto" w:fill="F2F6FC"/>
-          </w:tcPr>
-          <w:p>
-            <w:r/>
-            <w:r>
-              <w:rPr>
-                <w:sz w:val="18"/>
-              </w:rPr>
-              <w:t>v10</w:t>
-            </w:r>
-          </w:p>
-        </w:tc>
-        <w:tc>
-          <w:tcPr>
-            <w:tcW w:type="dxa" w:w="2160"/>
-            <w:shd w:val="clear" w:color="auto" w:fill="F2F6FC"/>
-          </w:tcPr>
-          <w:p>
-            <w:r/>
-            <w:r>
-              <w:rPr>
-                <w:sz w:val="18"/>
-              </w:rPr>
-              <w:t>F1 normalisasi organizer &amp; nomor (0 LLM)</w:t>
-            </w:r>
-          </w:p>
-        </w:tc>
-        <w:tc>
-          <w:tcPr>
-            <w:tcW w:type="dxa" w:w="2160"/>
-            <w:shd w:val="clear" w:color="auto" w:fill="F2F6FC"/>
-          </w:tcPr>
-          <w:p>
-            <w:r/>
-            <w:r>
-              <w:rPr>
-                <w:sz w:val="18"/>
-              </w:rPr>
-              <w:t>81.1%</w:t>
-            </w:r>
-          </w:p>
-        </w:tc>
-        <w:tc>
-          <w:tcPr>
-            <w:tcW w:type="dxa" w:w="2160"/>
-            <w:shd w:val="clear" w:color="auto" w:fill="F2F6FC"/>
-          </w:tcPr>
-          <w:p>
-            <w:r/>
-            <w:r>
-              <w:rPr>
-                <w:sz w:val="18"/>
-              </w:rPr>
-              <w:t>58.3%</w:t>
-            </w:r>
-          </w:p>
-        </w:tc>
-      </w:tr>
-      <w:tr>
-        <w:tc>
-          <w:tcPr>
-            <w:tcW w:type="dxa" w:w="2160"/>
-          </w:tcPr>
-          <w:p>
-            <w:r/>
-            <w:r>
-              <w:rPr>
-                <w:sz w:val="18"/>
-              </w:rPr>
-              <w:t>v10</w:t>
-            </w:r>
-          </w:p>
-        </w:tc>
-        <w:tc>
-          <w:tcPr>
-            <w:tcW w:type="dxa" w:w="2160"/>
-          </w:tcPr>
-          <w:p>
-            <w:r/>
-            <w:r>
-              <w:rPr>
-                <w:sz w:val="18"/>
-              </w:rPr>
-              <w:t>F1 organizer v3 + R6 (0 LLM)</w:t>
-            </w:r>
-          </w:p>
-        </w:tc>
-        <w:tc>
-          <w:tcPr>
-            <w:tcW w:type="dxa" w:w="2160"/>
-          </w:tcPr>
-          <w:p>
-            <w:r/>
-            <w:r>
-              <w:rPr>
-                <w:sz w:val="18"/>
-              </w:rPr>
-              <w:t>81.1%</w:t>
-            </w:r>
-          </w:p>
-        </w:tc>
-        <w:tc>
-          <w:tcPr>
-            <w:tcW w:type="dxa" w:w="2160"/>
-          </w:tcPr>
-          <w:p>
-            <w:r/>
-            <w:r>
-              <w:rPr>
-                <w:sz w:val="18"/>
-              </w:rPr>
-              <w:t>61.2%</w:t>
-            </w:r>
-          </w:p>
-        </w:tc>
-      </w:tr>
-      <w:tr>
-        <w:tc>
-          <w:tcPr>
-            <w:tcW w:type="dxa" w:w="2160"/>
-            <w:shd w:val="clear" w:color="auto" w:fill="F2F6FC"/>
-          </w:tcPr>
-          <w:p>
-            <w:r/>
-            <w:r>
-              <w:rPr>
-                <w:sz w:val="18"/>
-              </w:rPr>
-              <w:t>v10</w:t>
-            </w:r>
-          </w:p>
-        </w:tc>
-        <w:tc>
-          <w:tcPr>
-            <w:tcW w:type="dxa" w:w="2160"/>
-            <w:shd w:val="clear" w:color="auto" w:fill="F2F6FC"/>
-          </w:tcPr>
-          <w:p>
-            <w:r/>
-            <w:r>
-              <w:rPr>
-                <w:sz w:val="18"/>
-              </w:rPr>
-              <w:t>REVIEW-001 needs_review field lemah (confidence berbasis pola)</w:t>
-            </w:r>
-          </w:p>
-        </w:tc>
-        <w:tc>
-          <w:tcPr>
-            <w:tcW w:type="dxa" w:w="2160"/>
-            <w:shd w:val="clear" w:color="auto" w:fill="F2F6FC"/>
-          </w:tcPr>
-          <w:p>
-            <w:r/>
-            <w:r>
-              <w:rPr>
-                <w:sz w:val="18"/>
-              </w:rPr>
-              <w:t>-</w:t>
-            </w:r>
-          </w:p>
-        </w:tc>
-        <w:tc>
-          <w:tcPr>
-            <w:tcW w:type="dxa" w:w="2160"/>
-            <w:shd w:val="clear" w:color="auto" w:fill="F2F6FC"/>
-          </w:tcPr>
-          <w:p>
-            <w:r/>
-            <w:r>
-              <w:rPr>
-                <w:sz w:val="18"/>
-              </w:rPr>
-              <w:t>-</w:t>
-            </w:r>
-          </w:p>
-        </w:tc>
-      </w:tr>
-      <w:tr>
-        <w:tc>
-          <w:tcPr>
-            <w:tcW w:type="dxa" w:w="2160"/>
-          </w:tcPr>
-          <w:p>
-            <w:r/>
-            <w:r>
-              <w:rPr>
-                <w:sz w:val="18"/>
-              </w:rPr>
-              <w:t>v10</w:t>
-            </w:r>
-          </w:p>
-        </w:tc>
-        <w:tc>
-          <w:tcPr>
-            <w:tcW w:type="dxa" w:w="2160"/>
-          </w:tcPr>
-          <w:p>
-            <w:r/>
-            <w:r>
-              <w:rPr>
-                <w:sz w:val="18"/>
-              </w:rPr>
-              <w:t>STAT-001 validasi statistik 5-fold + bootstrap CI 1000×</w:t>
-            </w:r>
-          </w:p>
-        </w:tc>
-        <w:tc>
-          <w:tcPr>
-            <w:tcW w:type="dxa" w:w="2160"/>
-          </w:tcPr>
-          <w:p>
-            <w:r/>
-            <w:r>
-              <w:rPr>
-                <w:sz w:val="18"/>
-              </w:rPr>
-              <w:t>83.8%</w:t>
-            </w:r>
-          </w:p>
-        </w:tc>
-        <w:tc>
-          <w:tcPr>
-            <w:tcW w:type="dxa" w:w="2160"/>
-          </w:tcPr>
-          <w:p>
-            <w:r/>
-            <w:r>
-              <w:rPr>
-                <w:sz w:val="18"/>
-              </w:rPr>
-              <w:t>60.1%</w:t>
-            </w:r>
-          </w:p>
-        </w:tc>
-      </w:tr>
-      <w:tr>
-        <w:tc>
-          <w:tcPr>
-            <w:tcW w:type="dxa" w:w="2160"/>
-            <w:shd w:val="clear" w:color="auto" w:fill="F2F6FC"/>
-          </w:tcPr>
-          <w:p>
-            <w:r/>
-            <w:r>
-              <w:rPr>
-                <w:sz w:val="18"/>
-              </w:rPr>
-              <w:t>kb</w:t>
-            </w:r>
-          </w:p>
-        </w:tc>
-        <w:tc>
-          <w:tcPr>
-            <w:tcW w:type="dxa" w:w="2160"/>
-            <w:shd w:val="clear" w:color="auto" w:fill="F2F6FC"/>
-          </w:tcPr>
-          <w:p>
-            <w:r/>
-            <w:r>
-              <w:rPr>
-                <w:sz w:val="18"/>
-              </w:rPr>
-              <w:t>KB-001 shadow replay key v1 (router→KB→LLM)</w:t>
-            </w:r>
-          </w:p>
-        </w:tc>
-        <w:tc>
-          <w:tcPr>
-            <w:tcW w:type="dxa" w:w="2160"/>
-            <w:shd w:val="clear" w:color="auto" w:fill="F2F6FC"/>
-          </w:tcPr>
-          <w:p>
-            <w:r/>
-            <w:r>
-              <w:rPr>
-                <w:sz w:val="18"/>
-              </w:rPr>
-              <w:t>84.4%</w:t>
-            </w:r>
-          </w:p>
-        </w:tc>
-        <w:tc>
-          <w:tcPr>
-            <w:tcW w:type="dxa" w:w="2160"/>
-            <w:shd w:val="clear" w:color="auto" w:fill="F2F6FC"/>
-          </w:tcPr>
-          <w:p>
-            <w:r/>
-            <w:r>
-              <w:rPr>
-                <w:sz w:val="18"/>
-              </w:rPr>
-              <w:t>84.4%</w:t>
-            </w:r>
-          </w:p>
-        </w:tc>
-      </w:tr>
-      <w:tr>
-        <w:tc>
-          <w:tcPr>
-            <w:tcW w:type="dxa" w:w="2160"/>
-          </w:tcPr>
-          <w:p>
-            <w:r/>
-            <w:r>
-              <w:rPr>
-                <w:sz w:val="18"/>
-              </w:rPr>
-              <w:t>kb</w:t>
-            </w:r>
-          </w:p>
-        </w:tc>
-        <w:tc>
-          <w:tcPr>
-            <w:tcW w:type="dxa" w:w="2160"/>
-          </w:tcPr>
-          <w:p>
-            <w:r/>
-            <w:r>
-              <w:rPr>
-                <w:sz w:val="18"/>
-              </w:rPr>
-              <w:t>KB-002 seeded persistent KB (smoke, ceiling, persistence, noise, fragmentasi)</w:t>
-            </w:r>
-          </w:p>
-        </w:tc>
-        <w:tc>
-          <w:tcPr>
-            <w:tcW w:type="dxa" w:w="2160"/>
-          </w:tcPr>
-          <w:p>
-            <w:r/>
-            <w:r>
-              <w:rPr>
-                <w:sz w:val="18"/>
-              </w:rPr>
-              <w:t>83.8%</w:t>
-            </w:r>
-          </w:p>
-        </w:tc>
-        <w:tc>
-          <w:tcPr>
-            <w:tcW w:type="dxa" w:w="2160"/>
-          </w:tcPr>
-          <w:p>
-            <w:r/>
-            <w:r>
-              <w:rPr>
-                <w:sz w:val="18"/>
-              </w:rPr>
-              <w:t>83.8%</w:t>
-            </w:r>
-          </w:p>
-        </w:tc>
-      </w:tr>
-      <w:tr>
-        <w:tc>
-          <w:tcPr>
-            <w:tcW w:type="dxa" w:w="2160"/>
-            <w:shd w:val="clear" w:color="auto" w:fill="F2F6FC"/>
-          </w:tcPr>
-          <w:p>
-            <w:r/>
-            <w:r>
-              <w:rPr>
-                <w:sz w:val="18"/>
-              </w:rPr>
-              <w:t>kb</w:t>
-            </w:r>
-          </w:p>
-        </w:tc>
-        <w:tc>
-          <w:tcPr>
-            <w:tcW w:type="dxa" w:w="2160"/>
-            <w:shd w:val="clear" w:color="auto" w:fill="F2F6FC"/>
-          </w:tcPr>
-          <w:p>
-            <w:r/>
-            <w:r>
-              <w:rPr>
-                <w:sz w:val="18"/>
-              </w:rPr>
-              <w:t>KB-003 normalisasi key v2 (plain/stem/alias/both)</w:t>
-            </w:r>
-          </w:p>
-        </w:tc>
-        <w:tc>
-          <w:tcPr>
-            <w:tcW w:type="dxa" w:w="2160"/>
-            <w:shd w:val="clear" w:color="auto" w:fill="F2F6FC"/>
-          </w:tcPr>
-          <w:p>
-            <w:r/>
-            <w:r>
-              <w:rPr>
-                <w:sz w:val="18"/>
-              </w:rPr>
-              <w:t>83.8%</w:t>
-            </w:r>
-          </w:p>
-        </w:tc>
-        <w:tc>
-          <w:tcPr>
-            <w:tcW w:type="dxa" w:w="2160"/>
-            <w:shd w:val="clear" w:color="auto" w:fill="F2F6FC"/>
-          </w:tcPr>
-          <w:p>
-            <w:r/>
-            <w:r>
-              <w:rPr>
-                <w:sz w:val="18"/>
-              </w:rPr>
-              <w:t>83.8%</w:t>
-            </w:r>
-          </w:p>
-        </w:tc>
-      </w:tr>
-      <w:tr>
-        <w:tc>
-          <w:tcPr>
-            <w:tcW w:type="dxa" w:w="2160"/>
-          </w:tcPr>
-          <w:p>
-            <w:r/>
-            <w:r>
-              <w:rPr>
-                <w:sz w:val="18"/>
-              </w:rPr>
-              <w:t>kb</w:t>
-            </w:r>
-          </w:p>
-        </w:tc>
-        <w:tc>
-          <w:tcPr>
-            <w:tcW w:type="dxa" w:w="2160"/>
-          </w:tcPr>
-          <w:p>
-            <w:r/>
-            <w:r>
-              <w:rPr>
-                <w:sz w:val="18"/>
-              </w:rPr>
-              <w:t>KB-004 alat audit korpus (tests/kb/audit.py)</w:t>
-            </w:r>
-          </w:p>
-        </w:tc>
-        <w:tc>
-          <w:tcPr>
-            <w:tcW w:type="dxa" w:w="2160"/>
-          </w:tcPr>
-          <w:p>
-            <w:r/>
-            <w:r>
-              <w:rPr>
-                <w:sz w:val="18"/>
-              </w:rPr>
-              <w:t>-</w:t>
-            </w:r>
-          </w:p>
-        </w:tc>
-        <w:tc>
-          <w:tcPr>
-            <w:tcW w:type="dxa" w:w="2160"/>
-          </w:tcPr>
-          <w:p>
-            <w:r/>
-            <w:r>
-              <w:rPr>
-                <w:sz w:val="18"/>
-              </w:rPr>
-              <w:t>-</w:t>
-            </w:r>
-          </w:p>
-        </w:tc>
-      </w:tr>
-      <w:tr>
-        <w:tc>
-          <w:tcPr>
-            <w:tcW w:type="dxa" w:w="2160"/>
-            <w:shd w:val="clear" w:color="auto" w:fill="F2F6FC"/>
-          </w:tcPr>
-          <w:p>
-            <w:r/>
-            <w:r>
-              <w:rPr>
-                <w:sz w:val="18"/>
-              </w:rPr>
-              <w:t>kb</w:t>
-            </w:r>
-          </w:p>
-        </w:tc>
-        <w:tc>
-          <w:tcPr>
-            <w:tcW w:type="dxa" w:w="2160"/>
-            <w:shd w:val="clear" w:color="auto" w:fill="F2F6FC"/>
-          </w:tcPr>
-          <w:p>
-            <w:r/>
-            <w:r>
-              <w:rPr>
-                <w:sz w:val="18"/>
-              </w:rPr>
-              <w:t>KB-005 event_type=role terbaik (role/jenis/kelompok × 4 normalisasi)</w:t>
-            </w:r>
-          </w:p>
-        </w:tc>
-        <w:tc>
-          <w:tcPr>
-            <w:tcW w:type="dxa" w:w="2160"/>
-            <w:shd w:val="clear" w:color="auto" w:fill="F2F6FC"/>
-          </w:tcPr>
-          <w:p>
-            <w:r/>
-            <w:r>
-              <w:rPr>
-                <w:sz w:val="18"/>
-              </w:rPr>
-              <w:t>83.8%</w:t>
-            </w:r>
-          </w:p>
-        </w:tc>
-        <w:tc>
-          <w:tcPr>
-            <w:tcW w:type="dxa" w:w="2160"/>
-            <w:shd w:val="clear" w:color="auto" w:fill="F2F6FC"/>
-          </w:tcPr>
-          <w:p>
-            <w:r/>
-            <w:r>
-              <w:rPr>
-                <w:sz w:val="18"/>
-              </w:rPr>
-              <w:t>83.8%</w:t>
-            </w:r>
-          </w:p>
-        </w:tc>
-      </w:tr>
-      <w:tr>
-        <w:tc>
-          <w:tcPr>
-            <w:tcW w:type="dxa" w:w="2160"/>
-          </w:tcPr>
-          <w:p>
-            <w:r/>
-            <w:r>
-              <w:rPr>
-                <w:sz w:val="18"/>
-              </w:rPr>
-              <w:t>kb</w:t>
-            </w:r>
-          </w:p>
-        </w:tc>
-        <w:tc>
-          <w:tcPr>
-            <w:tcW w:type="dxa" w:w="2160"/>
-          </w:tcPr>
-          <w:p>
-            <w:r/>
-            <w:r>
-              <w:rPr>
-                <w:sz w:val="18"/>
-              </w:rPr>
-              <w:t>KB-006 alias mining data-driven (auto-alias = manual)</w:t>
-            </w:r>
-          </w:p>
-        </w:tc>
-        <w:tc>
-          <w:tcPr>
-            <w:tcW w:type="dxa" w:w="2160"/>
-          </w:tcPr>
-          <w:p>
-            <w:r/>
-            <w:r>
-              <w:rPr>
-                <w:sz w:val="18"/>
-              </w:rPr>
-              <w:t>83.8%</w:t>
-            </w:r>
-          </w:p>
-        </w:tc>
-        <w:tc>
-          <w:tcPr>
-            <w:tcW w:type="dxa" w:w="2160"/>
-          </w:tcPr>
-          <w:p>
-            <w:r/>
-            <w:r>
-              <w:rPr>
-                <w:sz w:val="18"/>
-              </w:rPr>
-              <w:t>83.8%</w:t>
-            </w:r>
-          </w:p>
-        </w:tc>
-      </w:tr>
-      <w:tr>
-        <w:tc>
-          <w:tcPr>
-            <w:tcW w:type="dxa" w:w="2160"/>
-            <w:shd w:val="clear" w:color="auto" w:fill="F2F6FC"/>
-          </w:tcPr>
-          <w:p>
-            <w:r/>
-            <w:r>
-              <w:rPr>
-                <w:sz w:val="18"/>
-              </w:rPr>
-              <w:t>ocr</w:t>
-            </w:r>
-          </w:p>
-        </w:tc>
-        <w:tc>
-          <w:tcPr>
-            <w:tcW w:type="dxa" w:w="2160"/>
-            <w:shd w:val="clear" w:color="auto" w:fill="F2F6FC"/>
-          </w:tcPr>
-          <w:p>
-            <w:r/>
-            <w:r>
-              <w:rPr>
-                <w:sz w:val="18"/>
-              </w:rPr>
-              <w:t>OCR-007 LFM2.5-VL-3B probe (VLM OCR, GGUF Q4_0 + mmproj Q8_0, 10 scan)</w:t>
-            </w:r>
-          </w:p>
-        </w:tc>
-        <w:tc>
-          <w:tcPr>
-            <w:tcW w:type="dxa" w:w="2160"/>
-            <w:shd w:val="clear" w:color="auto" w:fill="F2F6FC"/>
-          </w:tcPr>
-          <w:p>
-            <w:r/>
-            <w:r>
-              <w:rPr>
-                <w:sz w:val="18"/>
-              </w:rPr>
-              <w:t>n/a</w:t>
-            </w:r>
-          </w:p>
-        </w:tc>
-        <w:tc>
-          <w:tcPr>
-            <w:tcW w:type="dxa" w:w="2160"/>
-            <w:shd w:val="clear" w:color="auto" w:fill="F2F6FC"/>
-          </w:tcPr>
-          <w:p>
-            <w:r/>
-            <w:r>
-              <w:rPr>
-                <w:sz w:val="18"/>
-              </w:rPr>
-              <w:t>44.4%</w:t>
-            </w:r>
-          </w:p>
-        </w:tc>
-      </w:tr>
-      <w:tr>
-        <w:tc>
-          <w:tcPr>
-            <w:tcW w:type="dxa" w:w="2160"/>
-          </w:tcPr>
-          <w:p>
-            <w:r/>
-            <w:r>
-              <w:rPr>
-                <w:sz w:val="18"/>
-              </w:rPr>
-              <w:t>v10</w:t>
-            </w:r>
-          </w:p>
-        </w:tc>
-        <w:tc>
-          <w:tcPr>
-            <w:tcW w:type="dxa" w:w="2160"/>
-          </w:tcPr>
-          <w:p>
-            <w:r/>
-            <w:r>
-              <w:rPr>
-                <w:sz w:val="18"/>
-              </w:rPr>
-              <w:t>AKT-001 taksonomi nama_kegiatan (report-only, 6.8% exact)</w:t>
-            </w:r>
-          </w:p>
-        </w:tc>
-        <w:tc>
-          <w:tcPr>
-            <w:tcW w:type="dxa" w:w="2160"/>
-          </w:tcPr>
-          <w:p>
-            <w:r/>
-            <w:r>
-              <w:rPr>
-                <w:sz w:val="18"/>
-              </w:rPr>
-              <w:t>-</w:t>
-            </w:r>
-          </w:p>
-        </w:tc>
-        <w:tc>
-          <w:tcPr>
-            <w:tcW w:type="dxa" w:w="2160"/>
-          </w:tcPr>
-          <w:p>
-            <w:r/>
-            <w:r>
-              <w:rPr>
-                <w:sz w:val="18"/>
-              </w:rPr>
-              <w:t>-</w:t>
-            </w:r>
-          </w:p>
-        </w:tc>
-      </w:tr>
-      <w:tr>
-        <w:tc>
-          <w:tcPr>
-            <w:tcW w:type="dxa" w:w="2160"/>
-            <w:shd w:val="clear" w:color="auto" w:fill="F2F6FC"/>
-          </w:tcPr>
-          <w:p>
-            <w:r/>
-            <w:r>
-              <w:rPr>
-                <w:sz w:val="18"/>
-              </w:rPr>
-              <w:t>v10</w:t>
-            </w:r>
-          </w:p>
-        </w:tc>
-        <w:tc>
-          <w:tcPr>
-            <w:tcW w:type="dxa" w:w="2160"/>
-            <w:shd w:val="clear" w:color="auto" w:fill="F2F6FC"/>
-          </w:tcPr>
-          <w:p>
-            <w:r/>
-            <w:r>
-              <w:rPr>
-                <w:sz w:val="18"/>
-              </w:rPr>
-              <w:t>AKT-002 deteksi nama_kegiatan v2 (0 LLM)</w:t>
-            </w:r>
-          </w:p>
-        </w:tc>
-        <w:tc>
-          <w:tcPr>
-            <w:tcW w:type="dxa" w:w="2160"/>
-            <w:shd w:val="clear" w:color="auto" w:fill="F2F6FC"/>
-          </w:tcPr>
-          <w:p>
-            <w:r/>
-            <w:r>
-              <w:rPr>
-                <w:sz w:val="18"/>
-              </w:rPr>
-              <w:t>81.1%</w:t>
-            </w:r>
-          </w:p>
-        </w:tc>
-        <w:tc>
-          <w:tcPr>
-            <w:tcW w:type="dxa" w:w="2160"/>
-            <w:shd w:val="clear" w:color="auto" w:fill="F2F6FC"/>
-          </w:tcPr>
-          <w:p>
-            <w:r/>
-            <w:r>
-              <w:rPr>
-                <w:sz w:val="18"/>
-              </w:rPr>
-              <w:t>68.8%</w:t>
-            </w:r>
-          </w:p>
-        </w:tc>
-      </w:tr>
-      <w:tr>
-        <w:tc>
-          <w:tcPr>
-            <w:tcW w:type="dxa" w:w="2160"/>
-          </w:tcPr>
-          <w:p>
-            <w:r/>
-            <w:r>
-              <w:rPr>
-                <w:sz w:val="18"/>
-              </w:rPr>
-              <w:t>v10</w:t>
-            </w:r>
-          </w:p>
-        </w:tc>
-        <w:tc>
-          <w:tcPr>
-            <w:tcW w:type="dxa" w:w="2160"/>
-          </w:tcPr>
-          <w:p>
-            <w:r/>
-            <w:r>
-              <w:rPr>
-                <w:sz w:val="18"/>
-              </w:rPr>
-              <w:t>AKT-003 deteksi nama_kegiatan v3: Sebagai Peserta + atthe/inthe (0 LLM)</w:t>
-            </w:r>
-          </w:p>
-        </w:tc>
-        <w:tc>
-          <w:tcPr>
-            <w:tcW w:type="dxa" w:w="2160"/>
-          </w:tcPr>
-          <w:p>
-            <w:r/>
-            <w:r>
-              <w:rPr>
-                <w:sz w:val="18"/>
-              </w:rPr>
-              <w:t>81.1%</w:t>
-            </w:r>
-          </w:p>
-        </w:tc>
-        <w:tc>
-          <w:tcPr>
-            <w:tcW w:type="dxa" w:w="2160"/>
-          </w:tcPr>
-          <w:p>
-            <w:r/>
-            <w:r>
-              <w:rPr>
-                <w:sz w:val="18"/>
-              </w:rPr>
-              <w:t>71.6%</w:t>
-            </w:r>
-          </w:p>
-        </w:tc>
-      </w:tr>
-      <w:tr>
-        <w:tc>
-          <w:tcPr>
-            <w:tcW w:type="dxa" w:w="2160"/>
-            <w:shd w:val="clear" w:color="auto" w:fill="F2F6FC"/>
-          </w:tcPr>
-          <w:p>
-            <w:r/>
-            <w:r>
-              <w:rPr>
-                <w:sz w:val="18"/>
-              </w:rPr>
-              <w:t>v10</w:t>
-            </w:r>
-          </w:p>
-        </w:tc>
-        <w:tc>
-          <w:tcPr>
-            <w:tcW w:type="dxa" w:w="2160"/>
-            <w:shd w:val="clear" w:color="auto" w:fill="F2F6FC"/>
-          </w:tcPr>
-          <w:p>
-            <w:r/>
-            <w:r>
-              <w:rPr>
-                <w:sz w:val="18"/>
-              </w:rPr>
-              <w:t>ORG-004 canonicalisasi format (0 LLM)</w:t>
-            </w:r>
-          </w:p>
-        </w:tc>
-        <w:tc>
-          <w:tcPr>
-            <w:tcW w:type="dxa" w:w="2160"/>
-            <w:shd w:val="clear" w:color="auto" w:fill="F2F6FC"/>
-          </w:tcPr>
-          <w:p>
-            <w:r/>
-            <w:r>
-              <w:rPr>
-                <w:sz w:val="18"/>
-              </w:rPr>
-              <w:t>81.1%</w:t>
-            </w:r>
-          </w:p>
-        </w:tc>
-        <w:tc>
-          <w:tcPr>
-            <w:tcW w:type="dxa" w:w="2160"/>
-            <w:shd w:val="clear" w:color="auto" w:fill="F2F6FC"/>
-          </w:tcPr>
-          <w:p>
-            <w:r/>
-            <w:r>
-              <w:rPr>
-                <w:sz w:val="18"/>
-              </w:rPr>
-              <w:t>63.5%</w:t>
-            </w:r>
-          </w:p>
-        </w:tc>
-      </w:tr>
-      <w:tr>
-        <w:tc>
-          <w:tcPr>
-            <w:tcW w:type="dxa" w:w="2160"/>
-          </w:tcPr>
-          <w:p>
-            <w:r/>
-            <w:r>
-              <w:rPr>
-                <w:sz w:val="18"/>
-              </w:rPr>
-              <w:t>v10</w:t>
-            </w:r>
-          </w:p>
-        </w:tc>
-        <w:tc>
-          <w:tcPr>
-            <w:tcW w:type="dxa" w:w="2160"/>
-          </w:tcPr>
-          <w:p>
-            <w:r/>
-            <w:r>
-              <w:rPr>
-                <w:sz w:val="18"/>
-              </w:rPr>
-              <w:t>ORG-005 probe scoring extractor (sisa 12 kasus)</w:t>
-            </w:r>
-          </w:p>
-        </w:tc>
-        <w:tc>
-          <w:tcPr>
-            <w:tcW w:type="dxa" w:w="2160"/>
-          </w:tcPr>
-          <w:p>
-            <w:r/>
-            <w:r>
-              <w:rPr>
-                <w:sz w:val="18"/>
-              </w:rPr>
-              <w:t>81.1%</w:t>
-            </w:r>
-          </w:p>
-        </w:tc>
-        <w:tc>
-          <w:tcPr>
-            <w:tcW w:type="dxa" w:w="2160"/>
-          </w:tcPr>
-          <w:p>
-            <w:r/>
-            <w:r>
-              <w:rPr>
-                <w:sz w:val="18"/>
-              </w:rPr>
-              <w:t>63.5%</w:t>
-            </w:r>
-          </w:p>
-        </w:tc>
-      </w:tr>
-      <w:tr>
-        <w:tc>
-          <w:tcPr>
-            <w:tcW w:type="dxa" w:w="2160"/>
-            <w:shd w:val="clear" w:color="auto" w:fill="F2F6FC"/>
-          </w:tcPr>
-          <w:p>
-            <w:r/>
-            <w:r>
-              <w:rPr>
-                <w:sz w:val="18"/>
-              </w:rPr>
-              <w:t>v10</w:t>
-            </w:r>
-          </w:p>
-        </w:tc>
-        <w:tc>
-          <w:tcPr>
-            <w:tcW w:type="dxa" w:w="2160"/>
-            <w:shd w:val="clear" w:color="auto" w:fill="F2F6FC"/>
-          </w:tcPr>
-          <w:p>
-            <w:r/>
-            <w:r>
-              <w:rPr>
-                <w:sz w:val="18"/>
-              </w:rPr>
-              <w:t>PROD-002 port produksi organizer v3+R3+R6+format + nomor (flag-gated)</w:t>
-            </w:r>
-          </w:p>
-        </w:tc>
-        <w:tc>
-          <w:tcPr>
-            <w:tcW w:type="dxa" w:w="2160"/>
-            <w:shd w:val="clear" w:color="auto" w:fill="F2F6FC"/>
-          </w:tcPr>
-          <w:p>
-            <w:r/>
-            <w:r>
-              <w:rPr>
-                <w:sz w:val="18"/>
-              </w:rPr>
-              <w:t>81.1%</w:t>
-            </w:r>
-          </w:p>
-        </w:tc>
-        <w:tc>
-          <w:tcPr>
-            <w:tcW w:type="dxa" w:w="2160"/>
-            <w:shd w:val="clear" w:color="auto" w:fill="F2F6FC"/>
-          </w:tcPr>
-          <w:p>
-            <w:r/>
-            <w:r>
-              <w:rPr>
-                <w:sz w:val="18"/>
-              </w:rPr>
-              <w:t>63.0%</w:t>
-            </w:r>
-          </w:p>
-        </w:tc>
-      </w:tr>
-      <w:tr>
-        <w:tc>
-          <w:tcPr>
-            <w:tcW w:type="dxa" w:w="2160"/>
-          </w:tcPr>
-          <w:p>
-            <w:r/>
-            <w:r>
-              <w:rPr>
-                <w:sz w:val="18"/>
-              </w:rPr>
-              <w:t>v10</w:t>
-            </w:r>
-          </w:p>
-        </w:tc>
-        <w:tc>
-          <w:tcPr>
-            <w:tcW w:type="dxa" w:w="2160"/>
-          </w:tcPr>
-          <w:p>
-            <w:r/>
-            <w:r>
-              <w:rPr>
-                <w:sz w:val="18"/>
-              </w:rPr>
-              <w:t>AKT-004 deteksi nama_kegiatan v4: Event/lomba/seminar on (0 LLM, gate scope-kecil)</w:t>
-            </w:r>
-          </w:p>
-        </w:tc>
-        <w:tc>
-          <w:tcPr>
-            <w:tcW w:type="dxa" w:w="2160"/>
-          </w:tcPr>
-          <w:p>
-            <w:r/>
-            <w:r>
-              <w:rPr>
-                <w:sz w:val="18"/>
-              </w:rPr>
-              <w:t>81.1%</w:t>
-            </w:r>
-          </w:p>
-        </w:tc>
-        <w:tc>
-          <w:tcPr>
-            <w:tcW w:type="dxa" w:w="2160"/>
-          </w:tcPr>
-          <w:p>
-            <w:r/>
-            <w:r>
-              <w:rPr>
-                <w:sz w:val="18"/>
-              </w:rPr>
-              <w:t>72.1%</w:t>
-            </w:r>
-          </w:p>
-        </w:tc>
-      </w:tr>
-      <w:tr>
-        <w:tc>
-          <w:tcPr>
-            <w:tcW w:type="dxa" w:w="2160"/>
-            <w:shd w:val="clear" w:color="auto" w:fill="F2F6FC"/>
-          </w:tcPr>
-          <w:p>
-            <w:r/>
-            <w:r>
-              <w:rPr>
-                <w:sz w:val="18"/>
-              </w:rPr>
-              <w:t>v10</w:t>
-            </w:r>
-          </w:p>
-        </w:tc>
-        <w:tc>
-          <w:tcPr>
-            <w:tcW w:type="dxa" w:w="2160"/>
-            <w:shd w:val="clear" w:color="auto" w:fill="F2F6FC"/>
-          </w:tcPr>
-          <w:p>
-            <w:r/>
-            <w:r>
-              <w:rPr>
-                <w:sz w:val="18"/>
-              </w:rPr>
-              <w:t>AKT-005 deteksi nama_kegiatan v5: grup D all-caps/spacing (0 LLM)</w:t>
-            </w:r>
-          </w:p>
-        </w:tc>
-        <w:tc>
-          <w:tcPr>
-            <w:tcW w:type="dxa" w:w="2160"/>
-            <w:shd w:val="clear" w:color="auto" w:fill="F2F6FC"/>
-          </w:tcPr>
-          <w:p>
-            <w:r/>
-            <w:r>
-              <w:rPr>
-                <w:sz w:val="18"/>
-              </w:rPr>
-              <w:t>81.1%</w:t>
-            </w:r>
-          </w:p>
-        </w:tc>
-        <w:tc>
-          <w:tcPr>
-            <w:tcW w:type="dxa" w:w="2160"/>
-            <w:shd w:val="clear" w:color="auto" w:fill="F2F6FC"/>
-          </w:tcPr>
-          <w:p>
-            <w:r/>
-            <w:r>
-              <w:rPr>
+            <w:shd w:val="clear" w:color="auto" w:fill="FDF3D7"/>
+          </w:tcPr>
+          <w:p>
+            <w:r/>
+            <w:r>
+              <w:rPr>
+                <w:b/>
                 <w:sz w:val="18"/>
               </w:rPr>
               <w:t>73.7%</w:t>
-            </w:r>
-          </w:p>
-        </w:tc>
-      </w:tr>
-      <w:tr>
-        <w:tc>
-          <w:tcPr>
-            <w:tcW w:type="dxa" w:w="2160"/>
-          </w:tcPr>
-          <w:p>
-            <w:r/>
-            <w:r>
-              <w:rPr>
-                <w:sz w:val="18"/>
-              </w:rPr>
-              <w:t>kb</w:t>
-            </w:r>
-          </w:p>
-        </w:tc>
-        <w:tc>
-          <w:tcPr>
-            <w:tcW w:type="dxa" w:w="2160"/>
-          </w:tcPr>
-          <w:p>
-            <w:r/>
-            <w:r>
-              <w:rPr>
-                <w:sz w:val="18"/>
-              </w:rPr>
-              <w:t>KB-PROD-001 semantik produksi (servable/resolve/audit_due)</w:t>
-            </w:r>
-          </w:p>
-        </w:tc>
-        <w:tc>
-          <w:tcPr>
-            <w:tcW w:type="dxa" w:w="2160"/>
-          </w:tcPr>
-          <w:p>
-            <w:r/>
-            <w:r>
-              <w:rPr>
-                <w:sz w:val="18"/>
-              </w:rPr>
-              <w:t>-</w:t>
-            </w:r>
-          </w:p>
-        </w:tc>
-        <w:tc>
-          <w:tcPr>
-            <w:tcW w:type="dxa" w:w="2160"/>
-          </w:tcPr>
-          <w:p>
-            <w:r/>
-            <w:r>
-              <w:rPr>
-                <w:sz w:val="18"/>
-              </w:rPr>
-              <w:t>-</w:t>
-            </w:r>
-          </w:p>
-        </w:tc>
-      </w:tr>
-      <w:tr>
-        <w:tc>
-          <w:tcPr>
-            <w:tcW w:type="dxa" w:w="2160"/>
-            <w:shd w:val="clear" w:color="auto" w:fill="F2F6FC"/>
-          </w:tcPr>
-          <w:p>
-            <w:r/>
-            <w:r>
-              <w:rPr>
-                <w:sz w:val="18"/>
-              </w:rPr>
-              <w:t>kb</w:t>
-            </w:r>
-          </w:p>
-        </w:tc>
-        <w:tc>
-          <w:tcPr>
-            <w:tcW w:type="dxa" w:w="2160"/>
-            <w:shd w:val="clear" w:color="auto" w:fill="F2F6FC"/>
-          </w:tcPr>
-          <w:p>
-            <w:r/>
-            <w:r>
-              <w:rPr>
-                <w:sz w:val="18"/>
-              </w:rPr>
-              <w:t>KB-SCALE-001 simulasi workload skewed (500-5000 req)</w:t>
-            </w:r>
-          </w:p>
-        </w:tc>
-        <w:tc>
-          <w:tcPr>
-            <w:tcW w:type="dxa" w:w="2160"/>
-            <w:shd w:val="clear" w:color="auto" w:fill="F2F6FC"/>
-          </w:tcPr>
-          <w:p>
-            <w:r/>
-            <w:r>
-              <w:rPr>
-                <w:sz w:val="18"/>
-              </w:rPr>
-              <w:t>-</w:t>
-            </w:r>
-          </w:p>
-        </w:tc>
-        <w:tc>
-          <w:tcPr>
-            <w:tcW w:type="dxa" w:w="2160"/>
-            <w:shd w:val="clear" w:color="auto" w:fill="F2F6FC"/>
-          </w:tcPr>
-          <w:p>
-            <w:r/>
-            <w:r>
-              <w:rPr>
-                <w:sz w:val="18"/>
-              </w:rPr>
-              <w:t>-</w:t>
-            </w:r>
-          </w:p>
-        </w:tc>
-      </w:tr>
-      <w:tr>
-        <w:tc>
-          <w:tcPr>
-            <w:tcW w:type="dxa" w:w="2160"/>
-          </w:tcPr>
-          <w:p>
-            <w:r/>
-            <w:r>
-              <w:rPr>
-                <w:sz w:val="18"/>
-              </w:rPr>
-              <w:t>kb</w:t>
-            </w:r>
-          </w:p>
-        </w:tc>
-        <w:tc>
-          <w:tcPr>
-            <w:tcW w:type="dxa" w:w="2160"/>
-          </w:tcPr>
-          <w:p>
-            <w:r/>
-            <w:r>
-              <w:rPr>
-                <w:sz w:val="18"/>
-              </w:rPr>
-              <w:t>KB-SCALE-002 race tulis multi-worker (threading.Lock fix)</w:t>
-            </w:r>
-          </w:p>
-        </w:tc>
-        <w:tc>
-          <w:tcPr>
-            <w:tcW w:type="dxa" w:w="2160"/>
-          </w:tcPr>
-          <w:p>
-            <w:r/>
-            <w:r>
-              <w:rPr>
-                <w:sz w:val="18"/>
-              </w:rPr>
-              <w:t>-</w:t>
-            </w:r>
-          </w:p>
-        </w:tc>
-        <w:tc>
-          <w:tcPr>
-            <w:tcW w:type="dxa" w:w="2160"/>
-          </w:tcPr>
-          <w:p>
-            <w:r/>
-            <w:r>
-              <w:rPr>
-                <w:sz w:val="18"/>
-              </w:rPr>
-              <w:t>-</w:t>
-            </w:r>
-          </w:p>
-        </w:tc>
-      </w:tr>
-      <w:tr>
-        <w:tc>
-          <w:tcPr>
-            <w:tcW w:type="dxa" w:w="2160"/>
-            <w:shd w:val="clear" w:color="auto" w:fill="F2F6FC"/>
-          </w:tcPr>
-          <w:p>
-            <w:r/>
-            <w:r>
-              <w:rPr>
-                <w:sz w:val="18"/>
-              </w:rPr>
-              <w:t>kb</w:t>
-            </w:r>
-          </w:p>
-        </w:tc>
-        <w:tc>
-          <w:tcPr>
-            <w:tcW w:type="dxa" w:w="2160"/>
-            <w:shd w:val="clear" w:color="auto" w:fill="F2F6FC"/>
-          </w:tcPr>
-          <w:p>
-            <w:r/>
-            <w:r>
-              <w:rPr>
-                <w:sz w:val="18"/>
-              </w:rPr>
-              <w:t>KB-SCALE-003 peta hemat (5 volume × 5 key space × 3 skew)</w:t>
-            </w:r>
-          </w:p>
-        </w:tc>
-        <w:tc>
-          <w:tcPr>
-            <w:tcW w:type="dxa" w:w="2160"/>
-            <w:shd w:val="clear" w:color="auto" w:fill="F2F6FC"/>
-          </w:tcPr>
-          <w:p>
-            <w:r/>
-            <w:r>
-              <w:rPr>
-                <w:sz w:val="18"/>
-              </w:rPr>
-              <w:t>-</w:t>
-            </w:r>
-          </w:p>
-        </w:tc>
-        <w:tc>
-          <w:tcPr>
-            <w:tcW w:type="dxa" w:w="2160"/>
-            <w:shd w:val="clear" w:color="auto" w:fill="F2F6FC"/>
-          </w:tcPr>
-          <w:p>
-            <w:r/>
-            <w:r>
-              <w:rPr>
-                <w:sz w:val="18"/>
-              </w:rPr>
-              <w:t>-</w:t>
-            </w:r>
-          </w:p>
-        </w:tc>
-      </w:tr>
-      <w:tr>
-        <w:tc>
-          <w:tcPr>
-            <w:tcW w:type="dxa" w:w="2160"/>
-          </w:tcPr>
-          <w:p>
-            <w:r/>
-            <w:r>
-              <w:rPr>
-                <w:sz w:val="18"/>
-              </w:rPr>
-              <w:t>kb</w:t>
-            </w:r>
-          </w:p>
-        </w:tc>
-        <w:tc>
-          <w:tcPr>
-            <w:tcW w:type="dxa" w:w="2160"/>
-          </w:tcPr>
-          <w:p>
-            <w:r/>
-            <w:r>
-              <w:rPr>
-                <w:sz w:val="18"/>
-              </w:rPr>
-              <w:t>KB-SCALE-004 confirm 2x vs 3x (wrong +20 @2x)</w:t>
-            </w:r>
-          </w:p>
-        </w:tc>
-        <w:tc>
-          <w:tcPr>
-            <w:tcW w:type="dxa" w:w="2160"/>
-          </w:tcPr>
-          <w:p>
-            <w:r/>
-            <w:r>
-              <w:rPr>
-                <w:sz w:val="18"/>
-              </w:rPr>
-              <w:t>-</w:t>
-            </w:r>
-          </w:p>
-        </w:tc>
-        <w:tc>
-          <w:tcPr>
-            <w:tcW w:type="dxa" w:w="2160"/>
-          </w:tcPr>
-          <w:p>
-            <w:r/>
-            <w:r>
-              <w:rPr>
-                <w:sz w:val="18"/>
-              </w:rPr>
-              <w:t>-</w:t>
-            </w:r>
-          </w:p>
-        </w:tc>
-      </w:tr>
-      <w:tr>
-        <w:tc>
-          <w:tcPr>
-            <w:tcW w:type="dxa" w:w="2160"/>
-            <w:shd w:val="clear" w:color="auto" w:fill="F2F6FC"/>
-          </w:tcPr>
-          <w:p>
-            <w:r/>
-            <w:r>
-              <w:rPr>
-                <w:sz w:val="18"/>
-              </w:rPr>
-              <w:t>kb</w:t>
-            </w:r>
-          </w:p>
-        </w:tc>
-        <w:tc>
-          <w:tcPr>
-            <w:tcW w:type="dxa" w:w="2160"/>
-            <w:shd w:val="clear" w:color="auto" w:fill="F2F6FC"/>
-          </w:tcPr>
-          <w:p>
-            <w:r/>
-            <w:r>
-              <w:rPr>
-                <w:sz w:val="18"/>
-              </w:rPr>
-              <w:t>KB-SCALE-005 akurasi+biaya e2e (hemat 87%, akurasi 99.3%)</w:t>
-            </w:r>
-          </w:p>
-        </w:tc>
-        <w:tc>
-          <w:tcPr>
-            <w:tcW w:type="dxa" w:w="2160"/>
-            <w:shd w:val="clear" w:color="auto" w:fill="F2F6FC"/>
-          </w:tcPr>
-          <w:p>
-            <w:r/>
-            <w:r>
-              <w:rPr>
-                <w:sz w:val="18"/>
-              </w:rPr>
-              <w:t>-</w:t>
-            </w:r>
-          </w:p>
-        </w:tc>
-        <w:tc>
-          <w:tcPr>
-            <w:tcW w:type="dxa" w:w="2160"/>
-            <w:shd w:val="clear" w:color="auto" w:fill="F2F6FC"/>
-          </w:tcPr>
-          <w:p>
-            <w:r/>
-            <w:r>
-              <w:rPr>
-                <w:sz w:val="18"/>
-              </w:rPr>
-              <w:t>99.3%</w:t>
             </w:r>
           </w:p>
         </w:tc>

</xml_diff>

<commit_message>
feat(hyb): HYB-LLM-001 hybrid + LLM tingkat — MACRO 74.2% (new overall winner)
HYB-COMBINED + LLM fallback untuk 26 cert unrouted:
- Tingkat: router 48 + LLM 26 = 83.8% (+2.7pt dari 81.1%)
- Nama kegiatan: AKT-005 (62.2%, unchanged)
- Organizer: ORG-004 (63.5%, unchanged)
- Nomor: PROD-002 (76.9%, unchanged)
- Tanggal: pipeline (81.8%, unchanged)

Hasil:
- MACRO exact: 73.7→74.2% (+0.5pp)
- MACRO fuzzy: 80.2→80.7% (+0.5pp)
- Tingkat: 81.1→83.8% (+2.7pt)
- 0 regress per-field
- LLM: 17/26 correct (65.4%), 1.5s/cert, 26 calls ~176 tok/cert

Gate: PASS (MACRO ≥ 73.7%, Tingkat ≥ 81.1%)
Pytest: 31 passed

New overall winner:
- HYB-LLM (74.2%, 26 calls) > HYB-COMBINED (73.7%, 0 calls) > v9 (60.2%, 29 calls)

files:
- tests/benchmark_hybrid_llm.py: new benchmark script
- docs/report/report_data.json: +1 experiment (50 total), hyb_llm_001 = new winner
- docs/experiments_ledger.md: +HYB-LLM-001 entry
- docs/report/*.{docx,md}: regenerate
</commit_message>
<xml_diff>
--- a/docs/report/benchmark_methods.docx
+++ b/docs/report/benchmark_methods.docx
@@ -15870,6 +15870,128 @@
           </w:p>
         </w:tc>
       </w:tr>
+      <w:tr>
+        <w:tc>
+          <w:tcPr>
+            <w:tcW w:type="dxa" w:w="1080"/>
+            <w:shd w:val="clear" w:color="auto" w:fill="F2F6FC"/>
+          </w:tcPr>
+          <w:p>
+            <w:r/>
+            <w:r>
+              <w:rPr>
+                <w:sz w:val="18"/>
+              </w:rPr>
+              <w:t>HYB-LLM hybrid + LLM tingkat (26 cert unrouted, llama3.1:8b)</w:t>
+            </w:r>
+          </w:p>
+        </w:tc>
+        <w:tc>
+          <w:tcPr>
+            <w:tcW w:type="dxa" w:w="1080"/>
+            <w:shd w:val="clear" w:color="auto" w:fill="F2F6FC"/>
+          </w:tcPr>
+          <w:p>
+            <w:r/>
+            <w:r>
+              <w:rPr>
+                <w:sz w:val="18"/>
+              </w:rPr>
+              <w:t>83.8%</w:t>
+            </w:r>
+          </w:p>
+        </w:tc>
+        <w:tc>
+          <w:tcPr>
+            <w:tcW w:type="dxa" w:w="1080"/>
+            <w:shd w:val="clear" w:color="auto" w:fill="F2F6FC"/>
+          </w:tcPr>
+          <w:p>
+            <w:r/>
+            <w:r>
+              <w:rPr>
+                <w:sz w:val="18"/>
+              </w:rPr>
+              <w:t>74.2%</w:t>
+            </w:r>
+          </w:p>
+        </w:tc>
+        <w:tc>
+          <w:tcPr>
+            <w:tcW w:type="dxa" w:w="1080"/>
+            <w:shd w:val="clear" w:color="auto" w:fill="F2F6FC"/>
+          </w:tcPr>
+          <w:p>
+            <w:r/>
+            <w:r>
+              <w:rPr>
+                <w:sz w:val="18"/>
+              </w:rPr>
+              <w:t>176</w:t>
+            </w:r>
+          </w:p>
+        </w:tc>
+        <w:tc>
+          <w:tcPr>
+            <w:tcW w:type="dxa" w:w="1080"/>
+            <w:shd w:val="clear" w:color="auto" w:fill="F2F6FC"/>
+          </w:tcPr>
+          <w:p>
+            <w:r/>
+            <w:r>
+              <w:rPr>
+                <w:sz w:val="18"/>
+              </w:rPr>
+              <w:t>26</w:t>
+            </w:r>
+          </w:p>
+        </w:tc>
+        <w:tc>
+          <w:tcPr>
+            <w:tcW w:type="dxa" w:w="1080"/>
+            <w:shd w:val="clear" w:color="auto" w:fill="F2F6FC"/>
+          </w:tcPr>
+          <w:p>
+            <w:r/>
+            <w:r>
+              <w:rPr>
+                <w:sz w:val="18"/>
+              </w:rPr>
+              <w:t>-</w:t>
+            </w:r>
+          </w:p>
+        </w:tc>
+        <w:tc>
+          <w:tcPr>
+            <w:tcW w:type="dxa" w:w="1080"/>
+            <w:shd w:val="clear" w:color="auto" w:fill="F2F6FC"/>
+          </w:tcPr>
+          <w:p>
+            <w:r/>
+            <w:r>
+              <w:rPr>
+                <w:sz w:val="18"/>
+              </w:rPr>
+              <w:t>v9</w:t>
+            </w:r>
+          </w:p>
+        </w:tc>
+        <w:tc>
+          <w:tcPr>
+            <w:tcW w:type="dxa" w:w="1080"/>
+            <w:shd w:val="clear" w:color="auto" w:fill="F2F6FC"/>
+          </w:tcPr>
+          <w:p>
+            <w:r/>
+            <w:r>
+              <w:rPr>
+                <w:sz w:val="18"/>
+              </w:rPr>
+              <w:t>Aug 21</w:t>
+            </w:r>
+          </w:p>
+        </w:tc>
+      </w:tr>
     </w:tbl>
     <w:p/>
     <w:tbl>
@@ -18846,19 +18968,61 @@
         <w:tc>
           <w:tcPr>
             <w:tcW w:type="dxa" w:w="2160"/>
-            <w:shd w:val="clear" w:color="auto" w:fill="FDF3D7"/>
-          </w:tcPr>
-          <w:p>
-            <w:r/>
-            <w:r>
-              <w:rPr>
-                <w:b/>
+          </w:tcPr>
+          <w:p>
+            <w:r/>
+            <w:r>
+              <w:rPr>
                 <w:sz w:val="18"/>
               </w:rPr>
               <w:t>v10</w:t>
             </w:r>
           </w:p>
         </w:tc>
+        <w:tc>
+          <w:tcPr>
+            <w:tcW w:type="dxa" w:w="2160"/>
+          </w:tcPr>
+          <w:p>
+            <w:r/>
+            <w:r>
+              <w:rPr>
+                <w:sz w:val="18"/>
+              </w:rPr>
+              <w:t>HYB-COMBINED gabungan terbaik (router + AKT-005 + ORG-004, 0 LLM)</w:t>
+            </w:r>
+          </w:p>
+        </w:tc>
+        <w:tc>
+          <w:tcPr>
+            <w:tcW w:type="dxa" w:w="2160"/>
+          </w:tcPr>
+          <w:p>
+            <w:r/>
+            <w:r>
+              <w:rPr>
+                <w:sz w:val="18"/>
+              </w:rPr>
+              <w:t>81.1%</w:t>
+            </w:r>
+          </w:p>
+        </w:tc>
+        <w:tc>
+          <w:tcPr>
+            <w:tcW w:type="dxa" w:w="2160"/>
+          </w:tcPr>
+          <w:p>
+            <w:r/>
+            <w:r>
+              <w:rPr>
+                <w:sz w:val="18"/>
+              </w:rPr>
+              <w:t>73.7%</w:t>
+            </w:r>
+          </w:p>
+        </w:tc>
+      </w:tr>
+      <w:tr>
         <w:tc>
           <w:tcPr>
             <w:tcW w:type="dxa" w:w="2160"/>
@@ -18871,7 +19035,7 @@
                 <w:b/>
                 <w:sz w:val="18"/>
               </w:rPr>
-              <w:t xml:space="preserve">HYB-COMBINED gabungan terbaik (router + AKT-005 + ORG-004, 0 LLM) </w:t>
+              <w:t>v10</w:t>
             </w:r>
           </w:p>
         </w:tc>
@@ -18887,7 +19051,7 @@
                 <w:b/>
                 <w:sz w:val="18"/>
               </w:rPr>
-              <w:t>81.1%</w:t>
+              <w:t xml:space="preserve">HYB-LLM hybrid + LLM tingkat (26 cert unrouted, llama3.1:8b) </w:t>
             </w:r>
           </w:p>
         </w:tc>
@@ -18903,7 +19067,23 @@
                 <w:b/>
                 <w:sz w:val="18"/>
               </w:rPr>
-              <w:t>73.7%</w:t>
+              <w:t>83.8%</w:t>
+            </w:r>
+          </w:p>
+        </w:tc>
+        <w:tc>
+          <w:tcPr>
+            <w:tcW w:type="dxa" w:w="2160"/>
+            <w:shd w:val="clear" w:color="auto" w:fill="FDF3D7"/>
+          </w:tcPr>
+          <w:p>
+            <w:r/>
+            <w:r>
+              <w:rPr>
+                <w:b/>
+                <w:sz w:val="18"/>
+              </w:rPr>
+              <w:t>74.2%</w:t>
             </w:r>
           </w:p>
         </w:tc>

</xml_diff>